<commit_message>
Add medieval collectible cards for boss, sales, and IT portraits.
Unlock-only Amber cards with unique effects. Existing card art is left unchanged.

Co-authored-by: Cursor <cursoragent@cursor.com>
</commit_message>
<xml_diff>
--- a/backend/mdFile/新卡牌专属效果（第二版）.docx
+++ b/backend/mdFile/新卡牌专属效果（第二版）.docx
@@ -562,7 +562,2827 @@
                 <w:color w:val="2D2D2D"/>
                 <w:sz w:val="21"/>
               </w:rPr>
-              <w:t>花船宴饮：伤 4 自奶 2；强于酒娘的伤 2 自奶 1，也不撞珠宝商的伤 5 自盾。卡面胸部已打码。</w:t>
+              <w:t>花船宴饮：伤 4 自奶 2；强于酒娘的伤 2 自奶 1，也不撞珠宝商的伤 5 自盾。卡面按实拍笑容重绘，动作改为持扇帅气立姿。</w:t>
+            </w:r>
+          </w:p>
+        </w:tc>
+      </w:tr>
+      <w:tr>
+        <w:tc>
+          <w:tcPr>
+            <w:tcW w:type="dxa" w:w="1247"/>
+            <w:tcBorders>
+              <w:top w:val="single" w:sz="4" w:space="0" w:color="8FAADC"/>
+              <w:left w:val="single" w:sz="4" w:space="0" w:color="8FAADC"/>
+              <w:bottom w:val="single" w:sz="4" w:space="0" w:color="8FAADC"/>
+              <w:right w:val="single" w:sz="4" w:space="0" w:color="8FAADC"/>
+            </w:tcBorders>
+            <w:tcMar>
+              <w:top w:w="40" w:type="dxa"/>
+              <w:left w:w="60" w:type="dxa"/>
+              <w:bottom w:w="40" w:type="dxa"/>
+              <w:right w:w="60" w:type="dxa"/>
+            </w:tcMar>
+            <w:vAlign w:val="center"/>
+            <w:shd w:val="clear" w:color="auto" w:fill="F7FAFC"/>
+          </w:tcPr>
+          <w:p>
+            <w:pPr>
+              <w:spacing w:before="0" w:after="0" w:line="259" w:lineRule="auto"/>
+              <w:jc w:val="center"/>
+            </w:pPr>
+            <w:r/>
+            <w:r>
+              <w:rPr>
+                <w:rFonts w:ascii="Calibri" w:hAnsi="Calibri" w:eastAsia="宋体"/>
+                <w:b w:val="0"/>
+                <w:color w:val="2D2D2D"/>
+                <w:sz w:val="21"/>
+              </w:rPr>
+              <w:t>B-09</w:t>
+            </w:r>
+          </w:p>
+        </w:tc>
+        <w:tc>
+          <w:tcPr>
+            <w:tcW w:type="dxa" w:w="1474"/>
+            <w:tcBorders>
+              <w:top w:val="single" w:sz="4" w:space="0" w:color="8FAADC"/>
+              <w:left w:val="single" w:sz="4" w:space="0" w:color="8FAADC"/>
+              <w:bottom w:val="single" w:sz="4" w:space="0" w:color="8FAADC"/>
+              <w:right w:val="single" w:sz="4" w:space="0" w:color="8FAADC"/>
+            </w:tcBorders>
+            <w:tcMar>
+              <w:top w:w="40" w:type="dxa"/>
+              <w:left w:w="60" w:type="dxa"/>
+              <w:bottom w:w="40" w:type="dxa"/>
+              <w:right w:w="60" w:type="dxa"/>
+            </w:tcMar>
+            <w:vAlign w:val="center"/>
+            <w:shd w:val="clear" w:color="auto" w:fill="F7FAFC"/>
+          </w:tcPr>
+          <w:p>
+            <w:pPr>
+              <w:spacing w:before="0" w:after="0" w:line="259" w:lineRule="auto"/>
+              <w:jc w:val="left"/>
+            </w:pPr>
+            <w:r/>
+            <w:r>
+              <w:rPr>
+                <w:rFonts w:ascii="Calibri" w:hAnsi="Calibri" w:eastAsia="宋体"/>
+                <w:b w:val="0"/>
+                <w:color w:val="2D2D2D"/>
+                <w:sz w:val="21"/>
+              </w:rPr>
+              <w:t>华辂主</w:t>
+            </w:r>
+          </w:p>
+        </w:tc>
+        <w:tc>
+          <w:tcPr>
+            <w:tcW w:type="dxa" w:w="850"/>
+            <w:tcBorders>
+              <w:top w:val="single" w:sz="4" w:space="0" w:color="8FAADC"/>
+              <w:left w:val="single" w:sz="4" w:space="0" w:color="8FAADC"/>
+              <w:bottom w:val="single" w:sz="4" w:space="0" w:color="8FAADC"/>
+              <w:right w:val="single" w:sz="4" w:space="0" w:color="8FAADC"/>
+            </w:tcBorders>
+            <w:tcMar>
+              <w:top w:w="40" w:type="dxa"/>
+              <w:left w:w="60" w:type="dxa"/>
+              <w:bottom w:w="40" w:type="dxa"/>
+              <w:right w:w="60" w:type="dxa"/>
+            </w:tcMar>
+            <w:vAlign w:val="center"/>
+            <w:shd w:val="clear" w:color="auto" w:fill="F7FAFC"/>
+          </w:tcPr>
+          <w:p>
+            <w:pPr>
+              <w:spacing w:before="0" w:after="0" w:line="259" w:lineRule="auto"/>
+              <w:jc w:val="center"/>
+            </w:pPr>
+            <w:r/>
+            <w:r>
+              <w:rPr>
+                <w:rFonts w:ascii="Calibri" w:hAnsi="Calibri" w:eastAsia="宋体"/>
+                <w:b w:val="0"/>
+                <w:color w:val="2D2D2D"/>
+                <w:sz w:val="21"/>
+              </w:rPr>
+              <w:t>2</w:t>
+            </w:r>
+          </w:p>
+        </w:tc>
+        <w:tc>
+          <w:tcPr>
+            <w:tcW w:type="dxa" w:w="1020"/>
+            <w:tcBorders>
+              <w:top w:val="single" w:sz="4" w:space="0" w:color="8FAADC"/>
+              <w:left w:val="single" w:sz="4" w:space="0" w:color="8FAADC"/>
+              <w:bottom w:val="single" w:sz="4" w:space="0" w:color="8FAADC"/>
+              <w:right w:val="single" w:sz="4" w:space="0" w:color="8FAADC"/>
+            </w:tcBorders>
+            <w:tcMar>
+              <w:top w:w="40" w:type="dxa"/>
+              <w:left w:w="60" w:type="dxa"/>
+              <w:bottom w:w="40" w:type="dxa"/>
+              <w:right w:w="60" w:type="dxa"/>
+            </w:tcMar>
+            <w:vAlign w:val="center"/>
+            <w:shd w:val="clear" w:color="auto" w:fill="F7FAFC"/>
+          </w:tcPr>
+          <w:p>
+            <w:pPr>
+              <w:spacing w:before="0" w:after="0" w:line="259" w:lineRule="auto"/>
+              <w:jc w:val="center"/>
+            </w:pPr>
+            <w:r/>
+            <w:r>
+              <w:rPr>
+                <w:rFonts w:ascii="Calibri" w:hAnsi="Calibri" w:eastAsia="宋体"/>
+                <w:b w:val="0"/>
+                <w:color w:val="2D2D2D"/>
+                <w:sz w:val="21"/>
+              </w:rPr>
+              <w:t>攻击</w:t>
+            </w:r>
+          </w:p>
+        </w:tc>
+        <w:tc>
+          <w:tcPr>
+            <w:tcW w:type="dxa" w:w="4876"/>
+            <w:tcBorders>
+              <w:top w:val="single" w:sz="4" w:space="0" w:color="8FAADC"/>
+              <w:left w:val="single" w:sz="4" w:space="0" w:color="8FAADC"/>
+              <w:bottom w:val="single" w:sz="4" w:space="0" w:color="8FAADC"/>
+              <w:right w:val="single" w:sz="4" w:space="0" w:color="8FAADC"/>
+            </w:tcBorders>
+            <w:tcMar>
+              <w:top w:w="40" w:type="dxa"/>
+              <w:left w:w="60" w:type="dxa"/>
+              <w:bottom w:w="40" w:type="dxa"/>
+              <w:right w:w="60" w:type="dxa"/>
+            </w:tcMar>
+            <w:vAlign w:val="center"/>
+            <w:shd w:val="clear" w:color="auto" w:fill="F7FAFC"/>
+          </w:tcPr>
+          <w:p>
+            <w:pPr>
+              <w:spacing w:before="0" w:after="0" w:line="259" w:lineRule="auto"/>
+              <w:jc w:val="left"/>
+            </w:pPr>
+            <w:r/>
+            <w:r>
+              <w:rPr>
+                <w:rFonts w:ascii="Calibri" w:hAnsi="Calibri" w:eastAsia="宋体"/>
+                <w:b w:val="0"/>
+                <w:color w:val="2D2D2D"/>
+                <w:sz w:val="21"/>
+              </w:rPr>
+              <w:t>立即造成 4 点伤害，双方各恢复 1 点血量</w:t>
+            </w:r>
+          </w:p>
+        </w:tc>
+        <w:tc>
+          <w:tcPr>
+            <w:tcW w:type="dxa" w:w="4139"/>
+            <w:tcBorders>
+              <w:top w:val="single" w:sz="4" w:space="0" w:color="8FAADC"/>
+              <w:left w:val="single" w:sz="4" w:space="0" w:color="8FAADC"/>
+              <w:bottom w:val="single" w:sz="4" w:space="0" w:color="8FAADC"/>
+              <w:right w:val="single" w:sz="4" w:space="0" w:color="8FAADC"/>
+            </w:tcBorders>
+            <w:tcMar>
+              <w:top w:w="40" w:type="dxa"/>
+              <w:left w:w="60" w:type="dxa"/>
+              <w:bottom w:w="40" w:type="dxa"/>
+              <w:right w:w="60" w:type="dxa"/>
+            </w:tcMar>
+            <w:vAlign w:val="center"/>
+            <w:shd w:val="clear" w:color="auto" w:fill="F7FAFC"/>
+          </w:tcPr>
+          <w:p>
+            <w:pPr>
+              <w:spacing w:before="0" w:after="0" w:line="259" w:lineRule="auto"/>
+              <w:jc w:val="left"/>
+            </w:pPr>
+            <w:r/>
+            <w:r>
+              <w:rPr>
+                <w:rFonts w:ascii="Calibri" w:hAnsi="Calibri" w:eastAsia="宋体"/>
+                <w:b w:val="0"/>
+                <w:color w:val="2D2D2D"/>
+                <w:sz w:val="21"/>
+              </w:rPr>
+              <w:t>华辂迎宾：伤 4 双方各奶 1；同费总量 6，伤面同花舫主，奶改成两边，不撞花使的伤 1 双奶 1。</w:t>
+            </w:r>
+          </w:p>
+        </w:tc>
+      </w:tr>
+      <w:tr>
+        <w:tc>
+          <w:tcPr>
+            <w:tcW w:type="dxa" w:w="1247"/>
+            <w:tcBorders>
+              <w:top w:val="single" w:sz="4" w:space="0" w:color="8FAADC"/>
+              <w:left w:val="single" w:sz="4" w:space="0" w:color="8FAADC"/>
+              <w:bottom w:val="single" w:sz="4" w:space="0" w:color="8FAADC"/>
+              <w:right w:val="single" w:sz="4" w:space="0" w:color="8FAADC"/>
+            </w:tcBorders>
+            <w:tcMar>
+              <w:top w:w="40" w:type="dxa"/>
+              <w:left w:w="60" w:type="dxa"/>
+              <w:bottom w:w="40" w:type="dxa"/>
+              <w:right w:w="60" w:type="dxa"/>
+            </w:tcMar>
+            <w:vAlign w:val="center"/>
+          </w:tcPr>
+          <w:p>
+            <w:pPr>
+              <w:spacing w:before="0" w:after="0" w:line="259" w:lineRule="auto"/>
+              <w:jc w:val="center"/>
+            </w:pPr>
+            <w:r/>
+            <w:r>
+              <w:rPr>
+                <w:rFonts w:ascii="Calibri" w:hAnsi="Calibri" w:eastAsia="宋体"/>
+                <w:b w:val="0"/>
+                <w:color w:val="2D2D2D"/>
+                <w:sz w:val="21"/>
+              </w:rPr>
+              <w:t>B-10</w:t>
+            </w:r>
+          </w:p>
+        </w:tc>
+        <w:tc>
+          <w:tcPr>
+            <w:tcW w:type="dxa" w:w="1474"/>
+            <w:tcBorders>
+              <w:top w:val="single" w:sz="4" w:space="0" w:color="8FAADC"/>
+              <w:left w:val="single" w:sz="4" w:space="0" w:color="8FAADC"/>
+              <w:bottom w:val="single" w:sz="4" w:space="0" w:color="8FAADC"/>
+              <w:right w:val="single" w:sz="4" w:space="0" w:color="8FAADC"/>
+            </w:tcBorders>
+            <w:tcMar>
+              <w:top w:w="40" w:type="dxa"/>
+              <w:left w:w="60" w:type="dxa"/>
+              <w:bottom w:w="40" w:type="dxa"/>
+              <w:right w:w="60" w:type="dxa"/>
+            </w:tcMar>
+            <w:vAlign w:val="center"/>
+          </w:tcPr>
+          <w:p>
+            <w:pPr>
+              <w:spacing w:before="0" w:after="0" w:line="259" w:lineRule="auto"/>
+              <w:jc w:val="left"/>
+            </w:pPr>
+            <w:r/>
+            <w:r>
+              <w:rPr>
+                <w:rFonts w:ascii="Calibri" w:hAnsi="Calibri" w:eastAsia="宋体"/>
+                <w:b w:val="0"/>
+                <w:color w:val="2D2D2D"/>
+                <w:sz w:val="21"/>
+              </w:rPr>
+              <w:t>会馆主</w:t>
+            </w:r>
+          </w:p>
+        </w:tc>
+        <w:tc>
+          <w:tcPr>
+            <w:tcW w:type="dxa" w:w="850"/>
+            <w:tcBorders>
+              <w:top w:val="single" w:sz="4" w:space="0" w:color="8FAADC"/>
+              <w:left w:val="single" w:sz="4" w:space="0" w:color="8FAADC"/>
+              <w:bottom w:val="single" w:sz="4" w:space="0" w:color="8FAADC"/>
+              <w:right w:val="single" w:sz="4" w:space="0" w:color="8FAADC"/>
+            </w:tcBorders>
+            <w:tcMar>
+              <w:top w:w="40" w:type="dxa"/>
+              <w:left w:w="60" w:type="dxa"/>
+              <w:bottom w:w="40" w:type="dxa"/>
+              <w:right w:w="60" w:type="dxa"/>
+            </w:tcMar>
+            <w:vAlign w:val="center"/>
+          </w:tcPr>
+          <w:p>
+            <w:pPr>
+              <w:spacing w:before="0" w:after="0" w:line="259" w:lineRule="auto"/>
+              <w:jc w:val="center"/>
+            </w:pPr>
+            <w:r/>
+            <w:r>
+              <w:rPr>
+                <w:rFonts w:ascii="Calibri" w:hAnsi="Calibri" w:eastAsia="宋体"/>
+                <w:b w:val="0"/>
+                <w:color w:val="2D2D2D"/>
+                <w:sz w:val="21"/>
+              </w:rPr>
+              <w:t>2</w:t>
+            </w:r>
+          </w:p>
+        </w:tc>
+        <w:tc>
+          <w:tcPr>
+            <w:tcW w:type="dxa" w:w="1020"/>
+            <w:tcBorders>
+              <w:top w:val="single" w:sz="4" w:space="0" w:color="8FAADC"/>
+              <w:left w:val="single" w:sz="4" w:space="0" w:color="8FAADC"/>
+              <w:bottom w:val="single" w:sz="4" w:space="0" w:color="8FAADC"/>
+              <w:right w:val="single" w:sz="4" w:space="0" w:color="8FAADC"/>
+            </w:tcBorders>
+            <w:tcMar>
+              <w:top w:w="40" w:type="dxa"/>
+              <w:left w:w="60" w:type="dxa"/>
+              <w:bottom w:w="40" w:type="dxa"/>
+              <w:right w:w="60" w:type="dxa"/>
+            </w:tcMar>
+            <w:vAlign w:val="center"/>
+          </w:tcPr>
+          <w:p>
+            <w:pPr>
+              <w:spacing w:before="0" w:after="0" w:line="259" w:lineRule="auto"/>
+              <w:jc w:val="center"/>
+            </w:pPr>
+            <w:r/>
+            <w:r>
+              <w:rPr>
+                <w:rFonts w:ascii="Calibri" w:hAnsi="Calibri" w:eastAsia="宋体"/>
+                <w:b w:val="0"/>
+                <w:color w:val="2D2D2D"/>
+                <w:sz w:val="21"/>
+              </w:rPr>
+              <w:t>治疗</w:t>
+            </w:r>
+          </w:p>
+        </w:tc>
+        <w:tc>
+          <w:tcPr>
+            <w:tcW w:type="dxa" w:w="4876"/>
+            <w:tcBorders>
+              <w:top w:val="single" w:sz="4" w:space="0" w:color="8FAADC"/>
+              <w:left w:val="single" w:sz="4" w:space="0" w:color="8FAADC"/>
+              <w:bottom w:val="single" w:sz="4" w:space="0" w:color="8FAADC"/>
+              <w:right w:val="single" w:sz="4" w:space="0" w:color="8FAADC"/>
+            </w:tcBorders>
+            <w:tcMar>
+              <w:top w:w="40" w:type="dxa"/>
+              <w:left w:w="60" w:type="dxa"/>
+              <w:bottom w:w="40" w:type="dxa"/>
+              <w:right w:w="60" w:type="dxa"/>
+            </w:tcMar>
+            <w:vAlign w:val="center"/>
+          </w:tcPr>
+          <w:p>
+            <w:pPr>
+              <w:spacing w:before="0" w:after="0" w:line="259" w:lineRule="auto"/>
+              <w:jc w:val="left"/>
+            </w:pPr>
+            <w:r/>
+            <w:r>
+              <w:rPr>
+                <w:rFonts w:ascii="Calibri" w:hAnsi="Calibri" w:eastAsia="宋体"/>
+                <w:b w:val="0"/>
+                <w:color w:val="2D2D2D"/>
+                <w:sz w:val="21"/>
+              </w:rPr>
+              <w:t>抽 1 张牌，双方各恢复 2 点血量</w:t>
+            </w:r>
+          </w:p>
+        </w:tc>
+        <w:tc>
+          <w:tcPr>
+            <w:tcW w:type="dxa" w:w="4139"/>
+            <w:tcBorders>
+              <w:top w:val="single" w:sz="4" w:space="0" w:color="8FAADC"/>
+              <w:left w:val="single" w:sz="4" w:space="0" w:color="8FAADC"/>
+              <w:bottom w:val="single" w:sz="4" w:space="0" w:color="8FAADC"/>
+              <w:right w:val="single" w:sz="4" w:space="0" w:color="8FAADC"/>
+            </w:tcBorders>
+            <w:tcMar>
+              <w:top w:w="40" w:type="dxa"/>
+              <w:left w:w="60" w:type="dxa"/>
+              <w:bottom w:w="40" w:type="dxa"/>
+              <w:right w:w="60" w:type="dxa"/>
+            </w:tcMar>
+            <w:vAlign w:val="center"/>
+          </w:tcPr>
+          <w:p>
+            <w:pPr>
+              <w:spacing w:before="0" w:after="0" w:line="259" w:lineRule="auto"/>
+              <w:jc w:val="left"/>
+            </w:pPr>
+            <w:r/>
+            <w:r>
+              <w:rPr>
+                <w:rFonts w:ascii="Calibri" w:hAnsi="Calibri" w:eastAsia="宋体"/>
+                <w:b w:val="0"/>
+                <w:color w:val="2D2D2D"/>
+                <w:sz w:val="21"/>
+              </w:rPr>
+              <w:t>开怀会客：乐师的双奶 2 再加现抽，也不撞东家那套盾+压攻。</w:t>
+            </w:r>
+          </w:p>
+        </w:tc>
+      </w:tr>
+    </w:tbl>
+    <w:p>
+      <w:pPr>
+        <w:spacing w:before="200" w:after="160"/>
+      </w:pPr>
+      <w:r>
+        <w:rPr>
+          <w:rFonts w:ascii="Calibri" w:hAnsi="Calibri" w:eastAsia="微软雅黑"/>
+          <w:b/>
+          <w:color w:val="2E75B6"/>
+          <w:sz w:val="26"/>
+        </w:rPr>
+        <w:t>销售 S-25～S-27</w:t>
+      </w:r>
+    </w:p>
+    <w:p>
+      <w:pPr>
+        <w:spacing w:before="40" w:after="80" w:line="300" w:lineRule="auto"/>
+      </w:pPr>
+      <w:r>
+        <w:rPr>
+          <w:rFonts w:ascii="Calibri" w:hAnsi="Calibri" w:eastAsia="宋体"/>
+          <w:b w:val="0"/>
+          <w:color w:val="333333"/>
+          <w:sz w:val="22"/>
+        </w:rPr>
+        <w:t>中世纪行商。不替换现有销售卡面。</w:t>
+      </w:r>
+    </w:p>
+    <w:tbl>
+      <w:tblPr>
+        <w:tblW w:type="auto" w:w="0"/>
+        <w:jc w:val="center"/>
+        <w:tblLook w:firstColumn="1" w:firstRow="1" w:lastColumn="0" w:lastRow="0" w:noHBand="0" w:noVBand="1" w:val="04A0"/>
+        <w:tblW w:w="5000" w:type="pct"/>
+      </w:tblPr>
+      <w:tblGrid>
+        <w:gridCol w:w="2375"/>
+        <w:gridCol w:w="2375"/>
+        <w:gridCol w:w="2375"/>
+        <w:gridCol w:w="2375"/>
+        <w:gridCol w:w="2375"/>
+        <w:gridCol w:w="2375"/>
+      </w:tblGrid>
+      <w:tr>
+        <w:tc>
+          <w:tcPr>
+            <w:tcW w:type="dxa" w:w="1247"/>
+            <w:shd w:val="clear" w:color="auto" w:fill="E2EFDA"/>
+            <w:tcBorders>
+              <w:top w:val="single" w:sz="4" w:space="0" w:color="8FAADC"/>
+              <w:left w:val="single" w:sz="4" w:space="0" w:color="8FAADC"/>
+              <w:bottom w:val="single" w:sz="4" w:space="0" w:color="8FAADC"/>
+              <w:right w:val="single" w:sz="4" w:space="0" w:color="8FAADC"/>
+            </w:tcBorders>
+            <w:tcMar>
+              <w:top w:w="40" w:type="dxa"/>
+              <w:left w:w="60" w:type="dxa"/>
+              <w:bottom w:w="40" w:type="dxa"/>
+              <w:right w:w="60" w:type="dxa"/>
+            </w:tcMar>
+            <w:vAlign w:val="center"/>
+          </w:tcPr>
+          <w:p>
+            <w:pPr>
+              <w:spacing w:before="0" w:after="0" w:line="259" w:lineRule="auto"/>
+              <w:jc w:val="center"/>
+            </w:pPr>
+            <w:r/>
+            <w:r>
+              <w:rPr>
+                <w:rFonts w:ascii="Calibri" w:hAnsi="Calibri" w:eastAsia="微软雅黑"/>
+                <w:b/>
+                <w:i/>
+                <w:color w:val="C00000"/>
+                <w:sz w:val="21"/>
+              </w:rPr>
+              <w:t>编号</w:t>
+            </w:r>
+          </w:p>
+        </w:tc>
+        <w:tc>
+          <w:tcPr>
+            <w:tcW w:type="dxa" w:w="1474"/>
+            <w:shd w:val="clear" w:color="auto" w:fill="E2EFDA"/>
+            <w:tcBorders>
+              <w:top w:val="single" w:sz="4" w:space="0" w:color="8FAADC"/>
+              <w:left w:val="single" w:sz="4" w:space="0" w:color="8FAADC"/>
+              <w:bottom w:val="single" w:sz="4" w:space="0" w:color="8FAADC"/>
+              <w:right w:val="single" w:sz="4" w:space="0" w:color="8FAADC"/>
+            </w:tcBorders>
+            <w:tcMar>
+              <w:top w:w="40" w:type="dxa"/>
+              <w:left w:w="60" w:type="dxa"/>
+              <w:bottom w:w="40" w:type="dxa"/>
+              <w:right w:w="60" w:type="dxa"/>
+            </w:tcMar>
+            <w:vAlign w:val="center"/>
+          </w:tcPr>
+          <w:p>
+            <w:pPr>
+              <w:spacing w:before="0" w:after="0" w:line="259" w:lineRule="auto"/>
+              <w:jc w:val="center"/>
+            </w:pPr>
+            <w:r/>
+            <w:r>
+              <w:rPr>
+                <w:rFonts w:ascii="Calibri" w:hAnsi="Calibri" w:eastAsia="微软雅黑"/>
+                <w:b/>
+                <w:i/>
+                <w:color w:val="C00000"/>
+                <w:sz w:val="21"/>
+              </w:rPr>
+              <w:t>名称</w:t>
+            </w:r>
+          </w:p>
+        </w:tc>
+        <w:tc>
+          <w:tcPr>
+            <w:tcW w:type="dxa" w:w="850"/>
+            <w:shd w:val="clear" w:color="auto" w:fill="E2EFDA"/>
+            <w:tcBorders>
+              <w:top w:val="single" w:sz="4" w:space="0" w:color="8FAADC"/>
+              <w:left w:val="single" w:sz="4" w:space="0" w:color="8FAADC"/>
+              <w:bottom w:val="single" w:sz="4" w:space="0" w:color="8FAADC"/>
+              <w:right w:val="single" w:sz="4" w:space="0" w:color="8FAADC"/>
+            </w:tcBorders>
+            <w:tcMar>
+              <w:top w:w="40" w:type="dxa"/>
+              <w:left w:w="60" w:type="dxa"/>
+              <w:bottom w:w="40" w:type="dxa"/>
+              <w:right w:w="60" w:type="dxa"/>
+            </w:tcMar>
+            <w:vAlign w:val="center"/>
+          </w:tcPr>
+          <w:p>
+            <w:pPr>
+              <w:spacing w:before="0" w:after="0" w:line="259" w:lineRule="auto"/>
+              <w:jc w:val="center"/>
+            </w:pPr>
+            <w:r/>
+            <w:r>
+              <w:rPr>
+                <w:rFonts w:ascii="Calibri" w:hAnsi="Calibri" w:eastAsia="微软雅黑"/>
+                <w:b/>
+                <w:i/>
+                <w:color w:val="C00000"/>
+                <w:sz w:val="21"/>
+              </w:rPr>
+              <w:t>费用</w:t>
+            </w:r>
+          </w:p>
+        </w:tc>
+        <w:tc>
+          <w:tcPr>
+            <w:tcW w:type="dxa" w:w="1020"/>
+            <w:shd w:val="clear" w:color="auto" w:fill="E2EFDA"/>
+            <w:tcBorders>
+              <w:top w:val="single" w:sz="4" w:space="0" w:color="8FAADC"/>
+              <w:left w:val="single" w:sz="4" w:space="0" w:color="8FAADC"/>
+              <w:bottom w:val="single" w:sz="4" w:space="0" w:color="8FAADC"/>
+              <w:right w:val="single" w:sz="4" w:space="0" w:color="8FAADC"/>
+            </w:tcBorders>
+            <w:tcMar>
+              <w:top w:w="40" w:type="dxa"/>
+              <w:left w:w="60" w:type="dxa"/>
+              <w:bottom w:w="40" w:type="dxa"/>
+              <w:right w:w="60" w:type="dxa"/>
+            </w:tcMar>
+            <w:vAlign w:val="center"/>
+          </w:tcPr>
+          <w:p>
+            <w:pPr>
+              <w:spacing w:before="0" w:after="0" w:line="259" w:lineRule="auto"/>
+              <w:jc w:val="center"/>
+            </w:pPr>
+            <w:r/>
+            <w:r>
+              <w:rPr>
+                <w:rFonts w:ascii="Calibri" w:hAnsi="Calibri" w:eastAsia="微软雅黑"/>
+                <w:b/>
+                <w:i/>
+                <w:color w:val="C00000"/>
+                <w:sz w:val="21"/>
+              </w:rPr>
+              <w:t>类型</w:t>
+            </w:r>
+          </w:p>
+        </w:tc>
+        <w:tc>
+          <w:tcPr>
+            <w:tcW w:type="dxa" w:w="4876"/>
+            <w:shd w:val="clear" w:color="auto" w:fill="E2EFDA"/>
+            <w:tcBorders>
+              <w:top w:val="single" w:sz="4" w:space="0" w:color="8FAADC"/>
+              <w:left w:val="single" w:sz="4" w:space="0" w:color="8FAADC"/>
+              <w:bottom w:val="single" w:sz="4" w:space="0" w:color="8FAADC"/>
+              <w:right w:val="single" w:sz="4" w:space="0" w:color="8FAADC"/>
+            </w:tcBorders>
+            <w:tcMar>
+              <w:top w:w="40" w:type="dxa"/>
+              <w:left w:w="60" w:type="dxa"/>
+              <w:bottom w:w="40" w:type="dxa"/>
+              <w:right w:w="60" w:type="dxa"/>
+            </w:tcMar>
+            <w:vAlign w:val="center"/>
+          </w:tcPr>
+          <w:p>
+            <w:pPr>
+              <w:spacing w:before="0" w:after="0" w:line="259" w:lineRule="auto"/>
+              <w:jc w:val="center"/>
+            </w:pPr>
+            <w:r/>
+            <w:r>
+              <w:rPr>
+                <w:rFonts w:ascii="Calibri" w:hAnsi="Calibri" w:eastAsia="微软雅黑"/>
+                <w:b/>
+                <w:i/>
+                <w:color w:val="C00000"/>
+                <w:sz w:val="21"/>
+              </w:rPr>
+              <w:t>专属效果</w:t>
+            </w:r>
+          </w:p>
+        </w:tc>
+        <w:tc>
+          <w:tcPr>
+            <w:tcW w:type="dxa" w:w="4139"/>
+            <w:shd w:val="clear" w:color="auto" w:fill="E2EFDA"/>
+            <w:tcBorders>
+              <w:top w:val="single" w:sz="4" w:space="0" w:color="8FAADC"/>
+              <w:left w:val="single" w:sz="4" w:space="0" w:color="8FAADC"/>
+              <w:bottom w:val="single" w:sz="4" w:space="0" w:color="8FAADC"/>
+              <w:right w:val="single" w:sz="4" w:space="0" w:color="8FAADC"/>
+            </w:tcBorders>
+            <w:tcMar>
+              <w:top w:w="40" w:type="dxa"/>
+              <w:left w:w="60" w:type="dxa"/>
+              <w:bottom w:w="40" w:type="dxa"/>
+              <w:right w:w="60" w:type="dxa"/>
+            </w:tcMar>
+            <w:vAlign w:val="center"/>
+          </w:tcPr>
+          <w:p>
+            <w:pPr>
+              <w:spacing w:before="0" w:after="0" w:line="259" w:lineRule="auto"/>
+              <w:jc w:val="center"/>
+            </w:pPr>
+            <w:r/>
+            <w:r>
+              <w:rPr>
+                <w:rFonts w:ascii="Calibri" w:hAnsi="Calibri" w:eastAsia="微软雅黑"/>
+                <w:b/>
+                <w:i/>
+                <w:color w:val="C00000"/>
+                <w:sz w:val="21"/>
+              </w:rPr>
+              <w:t>设计说明</w:t>
+            </w:r>
+          </w:p>
+        </w:tc>
+      </w:tr>
+      <w:tr>
+        <w:tc>
+          <w:tcPr>
+            <w:tcW w:type="dxa" w:w="1247"/>
+            <w:tcBorders>
+              <w:top w:val="single" w:sz="4" w:space="0" w:color="8FAADC"/>
+              <w:left w:val="single" w:sz="4" w:space="0" w:color="8FAADC"/>
+              <w:bottom w:val="single" w:sz="4" w:space="0" w:color="8FAADC"/>
+              <w:right w:val="single" w:sz="4" w:space="0" w:color="8FAADC"/>
+            </w:tcBorders>
+            <w:tcMar>
+              <w:top w:w="40" w:type="dxa"/>
+              <w:left w:w="60" w:type="dxa"/>
+              <w:bottom w:w="40" w:type="dxa"/>
+              <w:right w:w="60" w:type="dxa"/>
+            </w:tcMar>
+            <w:vAlign w:val="center"/>
+          </w:tcPr>
+          <w:p>
+            <w:pPr>
+              <w:spacing w:before="0" w:after="0" w:line="259" w:lineRule="auto"/>
+              <w:jc w:val="center"/>
+            </w:pPr>
+            <w:r/>
+            <w:r>
+              <w:rPr>
+                <w:rFonts w:ascii="Calibri" w:hAnsi="Calibri" w:eastAsia="宋体"/>
+                <w:b w:val="0"/>
+                <w:color w:val="2D2D2D"/>
+                <w:sz w:val="21"/>
+              </w:rPr>
+              <w:t>S-25</w:t>
+            </w:r>
+          </w:p>
+        </w:tc>
+        <w:tc>
+          <w:tcPr>
+            <w:tcW w:type="dxa" w:w="1474"/>
+            <w:tcBorders>
+              <w:top w:val="single" w:sz="4" w:space="0" w:color="8FAADC"/>
+              <w:left w:val="single" w:sz="4" w:space="0" w:color="8FAADC"/>
+              <w:bottom w:val="single" w:sz="4" w:space="0" w:color="8FAADC"/>
+              <w:right w:val="single" w:sz="4" w:space="0" w:color="8FAADC"/>
+            </w:tcBorders>
+            <w:tcMar>
+              <w:top w:w="40" w:type="dxa"/>
+              <w:left w:w="60" w:type="dxa"/>
+              <w:bottom w:w="40" w:type="dxa"/>
+              <w:right w:w="60" w:type="dxa"/>
+            </w:tcMar>
+            <w:vAlign w:val="center"/>
+          </w:tcPr>
+          <w:p>
+            <w:pPr>
+              <w:spacing w:before="0" w:after="0" w:line="259" w:lineRule="auto"/>
+              <w:jc w:val="left"/>
+            </w:pPr>
+            <w:r/>
+            <w:r>
+              <w:rPr>
+                <w:rFonts w:ascii="Calibri" w:hAnsi="Calibri" w:eastAsia="宋体"/>
+                <w:b w:val="0"/>
+                <w:color w:val="2D2D2D"/>
+                <w:sz w:val="21"/>
+              </w:rPr>
+              <w:t>马帮客</w:t>
+            </w:r>
+          </w:p>
+        </w:tc>
+        <w:tc>
+          <w:tcPr>
+            <w:tcW w:type="dxa" w:w="850"/>
+            <w:tcBorders>
+              <w:top w:val="single" w:sz="4" w:space="0" w:color="8FAADC"/>
+              <w:left w:val="single" w:sz="4" w:space="0" w:color="8FAADC"/>
+              <w:bottom w:val="single" w:sz="4" w:space="0" w:color="8FAADC"/>
+              <w:right w:val="single" w:sz="4" w:space="0" w:color="8FAADC"/>
+            </w:tcBorders>
+            <w:tcMar>
+              <w:top w:w="40" w:type="dxa"/>
+              <w:left w:w="60" w:type="dxa"/>
+              <w:bottom w:w="40" w:type="dxa"/>
+              <w:right w:w="60" w:type="dxa"/>
+            </w:tcMar>
+            <w:vAlign w:val="center"/>
+          </w:tcPr>
+          <w:p>
+            <w:pPr>
+              <w:spacing w:before="0" w:after="0" w:line="259" w:lineRule="auto"/>
+              <w:jc w:val="center"/>
+            </w:pPr>
+            <w:r/>
+            <w:r>
+              <w:rPr>
+                <w:rFonts w:ascii="Calibri" w:hAnsi="Calibri" w:eastAsia="宋体"/>
+                <w:b w:val="0"/>
+                <w:color w:val="2D2D2D"/>
+                <w:sz w:val="21"/>
+              </w:rPr>
+              <w:t>2</w:t>
+            </w:r>
+          </w:p>
+        </w:tc>
+        <w:tc>
+          <w:tcPr>
+            <w:tcW w:type="dxa" w:w="1020"/>
+            <w:tcBorders>
+              <w:top w:val="single" w:sz="4" w:space="0" w:color="8FAADC"/>
+              <w:left w:val="single" w:sz="4" w:space="0" w:color="8FAADC"/>
+              <w:bottom w:val="single" w:sz="4" w:space="0" w:color="8FAADC"/>
+              <w:right w:val="single" w:sz="4" w:space="0" w:color="8FAADC"/>
+            </w:tcBorders>
+            <w:tcMar>
+              <w:top w:w="40" w:type="dxa"/>
+              <w:left w:w="60" w:type="dxa"/>
+              <w:bottom w:w="40" w:type="dxa"/>
+              <w:right w:w="60" w:type="dxa"/>
+            </w:tcMar>
+            <w:vAlign w:val="center"/>
+          </w:tcPr>
+          <w:p>
+            <w:pPr>
+              <w:spacing w:before="0" w:after="0" w:line="259" w:lineRule="auto"/>
+              <w:jc w:val="center"/>
+            </w:pPr>
+            <w:r/>
+            <w:r>
+              <w:rPr>
+                <w:rFonts w:ascii="Calibri" w:hAnsi="Calibri" w:eastAsia="宋体"/>
+                <w:b w:val="0"/>
+                <w:color w:val="2D2D2D"/>
+                <w:sz w:val="21"/>
+              </w:rPr>
+              <w:t>攻击</w:t>
+            </w:r>
+          </w:p>
+        </w:tc>
+        <w:tc>
+          <w:tcPr>
+            <w:tcW w:type="dxa" w:w="4876"/>
+            <w:tcBorders>
+              <w:top w:val="single" w:sz="4" w:space="0" w:color="8FAADC"/>
+              <w:left w:val="single" w:sz="4" w:space="0" w:color="8FAADC"/>
+              <w:bottom w:val="single" w:sz="4" w:space="0" w:color="8FAADC"/>
+              <w:right w:val="single" w:sz="4" w:space="0" w:color="8FAADC"/>
+            </w:tcBorders>
+            <w:tcMar>
+              <w:top w:w="40" w:type="dxa"/>
+              <w:left w:w="60" w:type="dxa"/>
+              <w:bottom w:w="40" w:type="dxa"/>
+              <w:right w:w="60" w:type="dxa"/>
+            </w:tcMar>
+            <w:vAlign w:val="center"/>
+          </w:tcPr>
+          <w:p>
+            <w:pPr>
+              <w:spacing w:before="0" w:after="0" w:line="259" w:lineRule="auto"/>
+              <w:jc w:val="left"/>
+            </w:pPr>
+            <w:r/>
+            <w:r>
+              <w:rPr>
+                <w:rFonts w:ascii="Calibri" w:hAnsi="Calibri" w:eastAsia="宋体"/>
+                <w:b w:val="0"/>
+                <w:color w:val="2D2D2D"/>
+                <w:sz w:val="21"/>
+              </w:rPr>
+              <w:t>立即造成 3 点伤害，下回合抽 1 张牌</w:t>
+            </w:r>
+          </w:p>
+        </w:tc>
+        <w:tc>
+          <w:tcPr>
+            <w:tcW w:type="dxa" w:w="4139"/>
+            <w:tcBorders>
+              <w:top w:val="single" w:sz="4" w:space="0" w:color="8FAADC"/>
+              <w:left w:val="single" w:sz="4" w:space="0" w:color="8FAADC"/>
+              <w:bottom w:val="single" w:sz="4" w:space="0" w:color="8FAADC"/>
+              <w:right w:val="single" w:sz="4" w:space="0" w:color="8FAADC"/>
+            </w:tcBorders>
+            <w:tcMar>
+              <w:top w:w="40" w:type="dxa"/>
+              <w:left w:w="60" w:type="dxa"/>
+              <w:bottom w:w="40" w:type="dxa"/>
+              <w:right w:w="60" w:type="dxa"/>
+            </w:tcMar>
+            <w:vAlign w:val="center"/>
+          </w:tcPr>
+          <w:p>
+            <w:pPr>
+              <w:spacing w:before="0" w:after="0" w:line="259" w:lineRule="auto"/>
+              <w:jc w:val="left"/>
+            </w:pPr>
+            <w:r/>
+            <w:r>
+              <w:rPr>
+                <w:rFonts w:ascii="Calibri" w:hAnsi="Calibri" w:eastAsia="宋体"/>
+                <w:b w:val="0"/>
+                <w:color w:val="2D2D2D"/>
+                <w:sz w:val="21"/>
+              </w:rPr>
+              <w:t>落鞍换货：伤 3 下回合抽；区别于酒商的伤 3 现抽，也区别于系统术士的伤 2 下回合抽。</w:t>
+            </w:r>
+          </w:p>
+        </w:tc>
+      </w:tr>
+      <w:tr>
+        <w:tc>
+          <w:tcPr>
+            <w:tcW w:type="dxa" w:w="1247"/>
+            <w:tcBorders>
+              <w:top w:val="single" w:sz="4" w:space="0" w:color="8FAADC"/>
+              <w:left w:val="single" w:sz="4" w:space="0" w:color="8FAADC"/>
+              <w:bottom w:val="single" w:sz="4" w:space="0" w:color="8FAADC"/>
+              <w:right w:val="single" w:sz="4" w:space="0" w:color="8FAADC"/>
+            </w:tcBorders>
+            <w:tcMar>
+              <w:top w:w="40" w:type="dxa"/>
+              <w:left w:w="60" w:type="dxa"/>
+              <w:bottom w:w="40" w:type="dxa"/>
+              <w:right w:w="60" w:type="dxa"/>
+            </w:tcMar>
+            <w:vAlign w:val="center"/>
+            <w:shd w:val="clear" w:color="auto" w:fill="F7FAFC"/>
+          </w:tcPr>
+          <w:p>
+            <w:pPr>
+              <w:spacing w:before="0" w:after="0" w:line="259" w:lineRule="auto"/>
+              <w:jc w:val="center"/>
+            </w:pPr>
+            <w:r/>
+            <w:r>
+              <w:rPr>
+                <w:rFonts w:ascii="Calibri" w:hAnsi="Calibri" w:eastAsia="宋体"/>
+                <w:b w:val="0"/>
+                <w:color w:val="2D2D2D"/>
+                <w:sz w:val="21"/>
+              </w:rPr>
+              <w:t>S-26</w:t>
+            </w:r>
+          </w:p>
+        </w:tc>
+        <w:tc>
+          <w:tcPr>
+            <w:tcW w:type="dxa" w:w="1474"/>
+            <w:tcBorders>
+              <w:top w:val="single" w:sz="4" w:space="0" w:color="8FAADC"/>
+              <w:left w:val="single" w:sz="4" w:space="0" w:color="8FAADC"/>
+              <w:bottom w:val="single" w:sz="4" w:space="0" w:color="8FAADC"/>
+              <w:right w:val="single" w:sz="4" w:space="0" w:color="8FAADC"/>
+            </w:tcBorders>
+            <w:tcMar>
+              <w:top w:w="40" w:type="dxa"/>
+              <w:left w:w="60" w:type="dxa"/>
+              <w:bottom w:w="40" w:type="dxa"/>
+              <w:right w:w="60" w:type="dxa"/>
+            </w:tcMar>
+            <w:vAlign w:val="center"/>
+            <w:shd w:val="clear" w:color="auto" w:fill="F7FAFC"/>
+          </w:tcPr>
+          <w:p>
+            <w:pPr>
+              <w:spacing w:before="0" w:after="0" w:line="259" w:lineRule="auto"/>
+              <w:jc w:val="left"/>
+            </w:pPr>
+            <w:r/>
+            <w:r>
+              <w:rPr>
+                <w:rFonts w:ascii="Calibri" w:hAnsi="Calibri" w:eastAsia="宋体"/>
+                <w:b w:val="0"/>
+                <w:color w:val="2D2D2D"/>
+                <w:sz w:val="21"/>
+              </w:rPr>
+              <w:t>山客</w:t>
+            </w:r>
+          </w:p>
+        </w:tc>
+        <w:tc>
+          <w:tcPr>
+            <w:tcW w:type="dxa" w:w="850"/>
+            <w:tcBorders>
+              <w:top w:val="single" w:sz="4" w:space="0" w:color="8FAADC"/>
+              <w:left w:val="single" w:sz="4" w:space="0" w:color="8FAADC"/>
+              <w:bottom w:val="single" w:sz="4" w:space="0" w:color="8FAADC"/>
+              <w:right w:val="single" w:sz="4" w:space="0" w:color="8FAADC"/>
+            </w:tcBorders>
+            <w:tcMar>
+              <w:top w:w="40" w:type="dxa"/>
+              <w:left w:w="60" w:type="dxa"/>
+              <w:bottom w:w="40" w:type="dxa"/>
+              <w:right w:w="60" w:type="dxa"/>
+            </w:tcMar>
+            <w:vAlign w:val="center"/>
+            <w:shd w:val="clear" w:color="auto" w:fill="F7FAFC"/>
+          </w:tcPr>
+          <w:p>
+            <w:pPr>
+              <w:spacing w:before="0" w:after="0" w:line="259" w:lineRule="auto"/>
+              <w:jc w:val="center"/>
+            </w:pPr>
+            <w:r/>
+            <w:r>
+              <w:rPr>
+                <w:rFonts w:ascii="Calibri" w:hAnsi="Calibri" w:eastAsia="宋体"/>
+                <w:b w:val="0"/>
+                <w:color w:val="2D2D2D"/>
+                <w:sz w:val="21"/>
+              </w:rPr>
+              <w:t>1</w:t>
+            </w:r>
+          </w:p>
+        </w:tc>
+        <w:tc>
+          <w:tcPr>
+            <w:tcW w:type="dxa" w:w="1020"/>
+            <w:tcBorders>
+              <w:top w:val="single" w:sz="4" w:space="0" w:color="8FAADC"/>
+              <w:left w:val="single" w:sz="4" w:space="0" w:color="8FAADC"/>
+              <w:bottom w:val="single" w:sz="4" w:space="0" w:color="8FAADC"/>
+              <w:right w:val="single" w:sz="4" w:space="0" w:color="8FAADC"/>
+            </w:tcBorders>
+            <w:tcMar>
+              <w:top w:w="40" w:type="dxa"/>
+              <w:left w:w="60" w:type="dxa"/>
+              <w:bottom w:w="40" w:type="dxa"/>
+              <w:right w:w="60" w:type="dxa"/>
+            </w:tcMar>
+            <w:vAlign w:val="center"/>
+            <w:shd w:val="clear" w:color="auto" w:fill="F7FAFC"/>
+          </w:tcPr>
+          <w:p>
+            <w:pPr>
+              <w:spacing w:before="0" w:after="0" w:line="259" w:lineRule="auto"/>
+              <w:jc w:val="center"/>
+            </w:pPr>
+            <w:r/>
+            <w:r>
+              <w:rPr>
+                <w:rFonts w:ascii="Calibri" w:hAnsi="Calibri" w:eastAsia="宋体"/>
+                <w:b w:val="0"/>
+                <w:color w:val="2D2D2D"/>
+                <w:sz w:val="21"/>
+              </w:rPr>
+              <w:t>支援</w:t>
+            </w:r>
+          </w:p>
+        </w:tc>
+        <w:tc>
+          <w:tcPr>
+            <w:tcW w:type="dxa" w:w="4876"/>
+            <w:tcBorders>
+              <w:top w:val="single" w:sz="4" w:space="0" w:color="8FAADC"/>
+              <w:left w:val="single" w:sz="4" w:space="0" w:color="8FAADC"/>
+              <w:bottom w:val="single" w:sz="4" w:space="0" w:color="8FAADC"/>
+              <w:right w:val="single" w:sz="4" w:space="0" w:color="8FAADC"/>
+            </w:tcBorders>
+            <w:tcMar>
+              <w:top w:w="40" w:type="dxa"/>
+              <w:left w:w="60" w:type="dxa"/>
+              <w:bottom w:w="40" w:type="dxa"/>
+              <w:right w:w="60" w:type="dxa"/>
+            </w:tcMar>
+            <w:vAlign w:val="center"/>
+            <w:shd w:val="clear" w:color="auto" w:fill="F7FAFC"/>
+          </w:tcPr>
+          <w:p>
+            <w:pPr>
+              <w:spacing w:before="0" w:after="0" w:line="259" w:lineRule="auto"/>
+              <w:jc w:val="left"/>
+            </w:pPr>
+            <w:r/>
+            <w:r>
+              <w:rPr>
+                <w:rFonts w:ascii="Calibri" w:hAnsi="Calibri" w:eastAsia="宋体"/>
+                <w:b w:val="0"/>
+                <w:color w:val="2D2D2D"/>
+                <w:sz w:val="21"/>
+              </w:rPr>
+              <w:t>本回合霸凌者攻击 -1，本回合员工调用机会 +1</w:t>
+            </w:r>
+          </w:p>
+        </w:tc>
+        <w:tc>
+          <w:tcPr>
+            <w:tcW w:type="dxa" w:w="4139"/>
+            <w:tcBorders>
+              <w:top w:val="single" w:sz="4" w:space="0" w:color="8FAADC"/>
+              <w:left w:val="single" w:sz="4" w:space="0" w:color="8FAADC"/>
+              <w:bottom w:val="single" w:sz="4" w:space="0" w:color="8FAADC"/>
+              <w:right w:val="single" w:sz="4" w:space="0" w:color="8FAADC"/>
+            </w:tcBorders>
+            <w:tcMar>
+              <w:top w:w="40" w:type="dxa"/>
+              <w:left w:w="60" w:type="dxa"/>
+              <w:bottom w:w="40" w:type="dxa"/>
+              <w:right w:w="60" w:type="dxa"/>
+            </w:tcMar>
+            <w:vAlign w:val="center"/>
+            <w:shd w:val="clear" w:color="auto" w:fill="F7FAFC"/>
+          </w:tcPr>
+          <w:p>
+            <w:pPr>
+              <w:spacing w:before="0" w:after="0" w:line="259" w:lineRule="auto"/>
+              <w:jc w:val="left"/>
+            </w:pPr>
+            <w:r/>
+            <w:r>
+              <w:rPr>
+                <w:rFonts w:ascii="Calibri" w:hAnsi="Calibri" w:eastAsia="宋体"/>
+                <w:b w:val="0"/>
+                <w:color w:val="2D2D2D"/>
+                <w:sz w:val="21"/>
+              </w:rPr>
+              <w:t>指山指路：压攻换一次出手；不撞绒帽商的伤 1+减攻 1，也不撞盐引官的调用+任意盾。</w:t>
+            </w:r>
+          </w:p>
+        </w:tc>
+      </w:tr>
+      <w:tr>
+        <w:tc>
+          <w:tcPr>
+            <w:tcW w:type="dxa" w:w="1247"/>
+            <w:tcBorders>
+              <w:top w:val="single" w:sz="4" w:space="0" w:color="8FAADC"/>
+              <w:left w:val="single" w:sz="4" w:space="0" w:color="8FAADC"/>
+              <w:bottom w:val="single" w:sz="4" w:space="0" w:color="8FAADC"/>
+              <w:right w:val="single" w:sz="4" w:space="0" w:color="8FAADC"/>
+            </w:tcBorders>
+            <w:tcMar>
+              <w:top w:w="40" w:type="dxa"/>
+              <w:left w:w="60" w:type="dxa"/>
+              <w:bottom w:w="40" w:type="dxa"/>
+              <w:right w:w="60" w:type="dxa"/>
+            </w:tcMar>
+            <w:vAlign w:val="center"/>
+          </w:tcPr>
+          <w:p>
+            <w:pPr>
+              <w:spacing w:before="0" w:after="0" w:line="259" w:lineRule="auto"/>
+              <w:jc w:val="center"/>
+            </w:pPr>
+            <w:r/>
+            <w:r>
+              <w:rPr>
+                <w:rFonts w:ascii="Calibri" w:hAnsi="Calibri" w:eastAsia="宋体"/>
+                <w:b w:val="0"/>
+                <w:color w:val="2D2D2D"/>
+                <w:sz w:val="21"/>
+              </w:rPr>
+              <w:t>S-27</w:t>
+            </w:r>
+          </w:p>
+        </w:tc>
+        <w:tc>
+          <w:tcPr>
+            <w:tcW w:type="dxa" w:w="1474"/>
+            <w:tcBorders>
+              <w:top w:val="single" w:sz="4" w:space="0" w:color="8FAADC"/>
+              <w:left w:val="single" w:sz="4" w:space="0" w:color="8FAADC"/>
+              <w:bottom w:val="single" w:sz="4" w:space="0" w:color="8FAADC"/>
+              <w:right w:val="single" w:sz="4" w:space="0" w:color="8FAADC"/>
+            </w:tcBorders>
+            <w:tcMar>
+              <w:top w:w="40" w:type="dxa"/>
+              <w:left w:w="60" w:type="dxa"/>
+              <w:bottom w:w="40" w:type="dxa"/>
+              <w:right w:w="60" w:type="dxa"/>
+            </w:tcMar>
+            <w:vAlign w:val="center"/>
+          </w:tcPr>
+          <w:p>
+            <w:pPr>
+              <w:spacing w:before="0" w:after="0" w:line="259" w:lineRule="auto"/>
+              <w:jc w:val="left"/>
+            </w:pPr>
+            <w:r/>
+            <w:r>
+              <w:rPr>
+                <w:rFonts w:ascii="Calibri" w:hAnsi="Calibri" w:eastAsia="宋体"/>
+                <w:b w:val="0"/>
+                <w:color w:val="2D2D2D"/>
+                <w:sz w:val="21"/>
+              </w:rPr>
+              <w:t>揽客商</w:t>
+            </w:r>
+          </w:p>
+        </w:tc>
+        <w:tc>
+          <w:tcPr>
+            <w:tcW w:type="dxa" w:w="850"/>
+            <w:tcBorders>
+              <w:top w:val="single" w:sz="4" w:space="0" w:color="8FAADC"/>
+              <w:left w:val="single" w:sz="4" w:space="0" w:color="8FAADC"/>
+              <w:bottom w:val="single" w:sz="4" w:space="0" w:color="8FAADC"/>
+              <w:right w:val="single" w:sz="4" w:space="0" w:color="8FAADC"/>
+            </w:tcBorders>
+            <w:tcMar>
+              <w:top w:w="40" w:type="dxa"/>
+              <w:left w:w="60" w:type="dxa"/>
+              <w:bottom w:w="40" w:type="dxa"/>
+              <w:right w:w="60" w:type="dxa"/>
+            </w:tcMar>
+            <w:vAlign w:val="center"/>
+          </w:tcPr>
+          <w:p>
+            <w:pPr>
+              <w:spacing w:before="0" w:after="0" w:line="259" w:lineRule="auto"/>
+              <w:jc w:val="center"/>
+            </w:pPr>
+            <w:r/>
+            <w:r>
+              <w:rPr>
+                <w:rFonts w:ascii="Calibri" w:hAnsi="Calibri" w:eastAsia="宋体"/>
+                <w:b w:val="0"/>
+                <w:color w:val="2D2D2D"/>
+                <w:sz w:val="21"/>
+              </w:rPr>
+              <w:t>2</w:t>
+            </w:r>
+          </w:p>
+        </w:tc>
+        <w:tc>
+          <w:tcPr>
+            <w:tcW w:type="dxa" w:w="1020"/>
+            <w:tcBorders>
+              <w:top w:val="single" w:sz="4" w:space="0" w:color="8FAADC"/>
+              <w:left w:val="single" w:sz="4" w:space="0" w:color="8FAADC"/>
+              <w:bottom w:val="single" w:sz="4" w:space="0" w:color="8FAADC"/>
+              <w:right w:val="single" w:sz="4" w:space="0" w:color="8FAADC"/>
+            </w:tcBorders>
+            <w:tcMar>
+              <w:top w:w="40" w:type="dxa"/>
+              <w:left w:w="60" w:type="dxa"/>
+              <w:bottom w:w="40" w:type="dxa"/>
+              <w:right w:w="60" w:type="dxa"/>
+            </w:tcMar>
+            <w:vAlign w:val="center"/>
+          </w:tcPr>
+          <w:p>
+            <w:pPr>
+              <w:spacing w:before="0" w:after="0" w:line="259" w:lineRule="auto"/>
+              <w:jc w:val="center"/>
+            </w:pPr>
+            <w:r/>
+            <w:r>
+              <w:rPr>
+                <w:rFonts w:ascii="Calibri" w:hAnsi="Calibri" w:eastAsia="宋体"/>
+                <w:b w:val="0"/>
+                <w:color w:val="2D2D2D"/>
+                <w:sz w:val="21"/>
+              </w:rPr>
+              <w:t>攻击</w:t>
+            </w:r>
+          </w:p>
+        </w:tc>
+        <w:tc>
+          <w:tcPr>
+            <w:tcW w:type="dxa" w:w="4876"/>
+            <w:tcBorders>
+              <w:top w:val="single" w:sz="4" w:space="0" w:color="8FAADC"/>
+              <w:left w:val="single" w:sz="4" w:space="0" w:color="8FAADC"/>
+              <w:bottom w:val="single" w:sz="4" w:space="0" w:color="8FAADC"/>
+              <w:right w:val="single" w:sz="4" w:space="0" w:color="8FAADC"/>
+            </w:tcBorders>
+            <w:tcMar>
+              <w:top w:w="40" w:type="dxa"/>
+              <w:left w:w="60" w:type="dxa"/>
+              <w:bottom w:w="40" w:type="dxa"/>
+              <w:right w:w="60" w:type="dxa"/>
+            </w:tcMar>
+            <w:vAlign w:val="center"/>
+          </w:tcPr>
+          <w:p>
+            <w:pPr>
+              <w:spacing w:before="0" w:after="0" w:line="259" w:lineRule="auto"/>
+              <w:jc w:val="left"/>
+            </w:pPr>
+            <w:r/>
+            <w:r>
+              <w:rPr>
+                <w:rFonts w:ascii="Calibri" w:hAnsi="Calibri" w:eastAsia="宋体"/>
+                <w:b w:val="0"/>
+                <w:color w:val="2D2D2D"/>
+                <w:sz w:val="21"/>
+              </w:rPr>
+              <w:t>立即造成 3 点伤害，并恢复自己 1 点血量</w:t>
+            </w:r>
+          </w:p>
+        </w:tc>
+        <w:tc>
+          <w:tcPr>
+            <w:tcW w:type="dxa" w:w="4139"/>
+            <w:tcBorders>
+              <w:top w:val="single" w:sz="4" w:space="0" w:color="8FAADC"/>
+              <w:left w:val="single" w:sz="4" w:space="0" w:color="8FAADC"/>
+              <w:bottom w:val="single" w:sz="4" w:space="0" w:color="8FAADC"/>
+              <w:right w:val="single" w:sz="4" w:space="0" w:color="8FAADC"/>
+            </w:tcBorders>
+            <w:tcMar>
+              <w:top w:w="40" w:type="dxa"/>
+              <w:left w:w="60" w:type="dxa"/>
+              <w:bottom w:w="40" w:type="dxa"/>
+              <w:right w:w="60" w:type="dxa"/>
+            </w:tcMar>
+            <w:vAlign w:val="center"/>
+          </w:tcPr>
+          <w:p>
+            <w:pPr>
+              <w:spacing w:before="0" w:after="0" w:line="259" w:lineRule="auto"/>
+              <w:jc w:val="left"/>
+            </w:pPr>
+            <w:r/>
+            <w:r>
+              <w:rPr>
+                <w:rFonts w:ascii="Calibri" w:hAnsi="Calibri" w:eastAsia="宋体"/>
+                <w:b w:val="0"/>
+                <w:color w:val="2D2D2D"/>
+                <w:sz w:val="21"/>
+              </w:rPr>
+              <w:t>伸手揽客：伤 3 自奶 1；强于酒娘的伤 2 自奶 1，也不撞香囊商的伤 2 任意奶。</w:t>
+            </w:r>
+          </w:p>
+        </w:tc>
+      </w:tr>
+    </w:tbl>
+    <w:p>
+      <w:pPr>
+        <w:spacing w:before="200" w:after="160"/>
+      </w:pPr>
+      <w:r>
+        <w:rPr>
+          <w:rFonts w:ascii="Calibri" w:hAnsi="Calibri" w:eastAsia="微软雅黑"/>
+          <w:b/>
+          <w:color w:val="2E75B6"/>
+          <w:sz w:val="26"/>
+        </w:rPr>
+        <w:t>技术 T-02～T-07</w:t>
+      </w:r>
+    </w:p>
+    <w:p>
+      <w:pPr>
+        <w:spacing w:before="40" w:after="80" w:line="300" w:lineRule="auto"/>
+      </w:pPr>
+      <w:r>
+        <w:rPr>
+          <w:rFonts w:ascii="Calibri" w:hAnsi="Calibri" w:eastAsia="宋体"/>
+          <w:b w:val="0"/>
+          <w:color w:val="333333"/>
+          <w:sz w:val="22"/>
+        </w:rPr>
+        <w:t>中世纪机括、历法和察微。不替换现有技术卡面；玩法走公共补牌，图鉴显示「技术」。</w:t>
+      </w:r>
+    </w:p>
+    <w:tbl>
+      <w:tblPr>
+        <w:tblW w:type="auto" w:w="0"/>
+        <w:jc w:val="center"/>
+        <w:tblLook w:firstColumn="1" w:firstRow="1" w:lastColumn="0" w:lastRow="0" w:noHBand="0" w:noVBand="1" w:val="04A0"/>
+        <w:tblW w:w="5000" w:type="pct"/>
+      </w:tblPr>
+      <w:tblGrid>
+        <w:gridCol w:w="2375"/>
+        <w:gridCol w:w="2375"/>
+        <w:gridCol w:w="2375"/>
+        <w:gridCol w:w="2375"/>
+        <w:gridCol w:w="2375"/>
+        <w:gridCol w:w="2375"/>
+      </w:tblGrid>
+      <w:tr>
+        <w:tc>
+          <w:tcPr>
+            <w:tcW w:type="dxa" w:w="1247"/>
+            <w:shd w:val="clear" w:color="auto" w:fill="E2EFDA"/>
+            <w:tcBorders>
+              <w:top w:val="single" w:sz="4" w:space="0" w:color="8FAADC"/>
+              <w:left w:val="single" w:sz="4" w:space="0" w:color="8FAADC"/>
+              <w:bottom w:val="single" w:sz="4" w:space="0" w:color="8FAADC"/>
+              <w:right w:val="single" w:sz="4" w:space="0" w:color="8FAADC"/>
+            </w:tcBorders>
+            <w:tcMar>
+              <w:top w:w="40" w:type="dxa"/>
+              <w:left w:w="60" w:type="dxa"/>
+              <w:bottom w:w="40" w:type="dxa"/>
+              <w:right w:w="60" w:type="dxa"/>
+            </w:tcMar>
+            <w:vAlign w:val="center"/>
+          </w:tcPr>
+          <w:p>
+            <w:pPr>
+              <w:spacing w:before="0" w:after="0" w:line="259" w:lineRule="auto"/>
+              <w:jc w:val="center"/>
+            </w:pPr>
+            <w:r/>
+            <w:r>
+              <w:rPr>
+                <w:rFonts w:ascii="Calibri" w:hAnsi="Calibri" w:eastAsia="微软雅黑"/>
+                <w:b/>
+                <w:i/>
+                <w:color w:val="C00000"/>
+                <w:sz w:val="21"/>
+              </w:rPr>
+              <w:t>编号</w:t>
+            </w:r>
+          </w:p>
+        </w:tc>
+        <w:tc>
+          <w:tcPr>
+            <w:tcW w:type="dxa" w:w="1474"/>
+            <w:shd w:val="clear" w:color="auto" w:fill="E2EFDA"/>
+            <w:tcBorders>
+              <w:top w:val="single" w:sz="4" w:space="0" w:color="8FAADC"/>
+              <w:left w:val="single" w:sz="4" w:space="0" w:color="8FAADC"/>
+              <w:bottom w:val="single" w:sz="4" w:space="0" w:color="8FAADC"/>
+              <w:right w:val="single" w:sz="4" w:space="0" w:color="8FAADC"/>
+            </w:tcBorders>
+            <w:tcMar>
+              <w:top w:w="40" w:type="dxa"/>
+              <w:left w:w="60" w:type="dxa"/>
+              <w:bottom w:w="40" w:type="dxa"/>
+              <w:right w:w="60" w:type="dxa"/>
+            </w:tcMar>
+            <w:vAlign w:val="center"/>
+          </w:tcPr>
+          <w:p>
+            <w:pPr>
+              <w:spacing w:before="0" w:after="0" w:line="259" w:lineRule="auto"/>
+              <w:jc w:val="center"/>
+            </w:pPr>
+            <w:r/>
+            <w:r>
+              <w:rPr>
+                <w:rFonts w:ascii="Calibri" w:hAnsi="Calibri" w:eastAsia="微软雅黑"/>
+                <w:b/>
+                <w:i/>
+                <w:color w:val="C00000"/>
+                <w:sz w:val="21"/>
+              </w:rPr>
+              <w:t>名称</w:t>
+            </w:r>
+          </w:p>
+        </w:tc>
+        <w:tc>
+          <w:tcPr>
+            <w:tcW w:type="dxa" w:w="850"/>
+            <w:shd w:val="clear" w:color="auto" w:fill="E2EFDA"/>
+            <w:tcBorders>
+              <w:top w:val="single" w:sz="4" w:space="0" w:color="8FAADC"/>
+              <w:left w:val="single" w:sz="4" w:space="0" w:color="8FAADC"/>
+              <w:bottom w:val="single" w:sz="4" w:space="0" w:color="8FAADC"/>
+              <w:right w:val="single" w:sz="4" w:space="0" w:color="8FAADC"/>
+            </w:tcBorders>
+            <w:tcMar>
+              <w:top w:w="40" w:type="dxa"/>
+              <w:left w:w="60" w:type="dxa"/>
+              <w:bottom w:w="40" w:type="dxa"/>
+              <w:right w:w="60" w:type="dxa"/>
+            </w:tcMar>
+            <w:vAlign w:val="center"/>
+          </w:tcPr>
+          <w:p>
+            <w:pPr>
+              <w:spacing w:before="0" w:after="0" w:line="259" w:lineRule="auto"/>
+              <w:jc w:val="center"/>
+            </w:pPr>
+            <w:r/>
+            <w:r>
+              <w:rPr>
+                <w:rFonts w:ascii="Calibri" w:hAnsi="Calibri" w:eastAsia="微软雅黑"/>
+                <w:b/>
+                <w:i/>
+                <w:color w:val="C00000"/>
+                <w:sz w:val="21"/>
+              </w:rPr>
+              <w:t>费用</w:t>
+            </w:r>
+          </w:p>
+        </w:tc>
+        <w:tc>
+          <w:tcPr>
+            <w:tcW w:type="dxa" w:w="1020"/>
+            <w:shd w:val="clear" w:color="auto" w:fill="E2EFDA"/>
+            <w:tcBorders>
+              <w:top w:val="single" w:sz="4" w:space="0" w:color="8FAADC"/>
+              <w:left w:val="single" w:sz="4" w:space="0" w:color="8FAADC"/>
+              <w:bottom w:val="single" w:sz="4" w:space="0" w:color="8FAADC"/>
+              <w:right w:val="single" w:sz="4" w:space="0" w:color="8FAADC"/>
+            </w:tcBorders>
+            <w:tcMar>
+              <w:top w:w="40" w:type="dxa"/>
+              <w:left w:w="60" w:type="dxa"/>
+              <w:bottom w:w="40" w:type="dxa"/>
+              <w:right w:w="60" w:type="dxa"/>
+            </w:tcMar>
+            <w:vAlign w:val="center"/>
+          </w:tcPr>
+          <w:p>
+            <w:pPr>
+              <w:spacing w:before="0" w:after="0" w:line="259" w:lineRule="auto"/>
+              <w:jc w:val="center"/>
+            </w:pPr>
+            <w:r/>
+            <w:r>
+              <w:rPr>
+                <w:rFonts w:ascii="Calibri" w:hAnsi="Calibri" w:eastAsia="微软雅黑"/>
+                <w:b/>
+                <w:i/>
+                <w:color w:val="C00000"/>
+                <w:sz w:val="21"/>
+              </w:rPr>
+              <w:t>类型</w:t>
+            </w:r>
+          </w:p>
+        </w:tc>
+        <w:tc>
+          <w:tcPr>
+            <w:tcW w:type="dxa" w:w="4876"/>
+            <w:shd w:val="clear" w:color="auto" w:fill="E2EFDA"/>
+            <w:tcBorders>
+              <w:top w:val="single" w:sz="4" w:space="0" w:color="8FAADC"/>
+              <w:left w:val="single" w:sz="4" w:space="0" w:color="8FAADC"/>
+              <w:bottom w:val="single" w:sz="4" w:space="0" w:color="8FAADC"/>
+              <w:right w:val="single" w:sz="4" w:space="0" w:color="8FAADC"/>
+            </w:tcBorders>
+            <w:tcMar>
+              <w:top w:w="40" w:type="dxa"/>
+              <w:left w:w="60" w:type="dxa"/>
+              <w:bottom w:w="40" w:type="dxa"/>
+              <w:right w:w="60" w:type="dxa"/>
+            </w:tcMar>
+            <w:vAlign w:val="center"/>
+          </w:tcPr>
+          <w:p>
+            <w:pPr>
+              <w:spacing w:before="0" w:after="0" w:line="259" w:lineRule="auto"/>
+              <w:jc w:val="center"/>
+            </w:pPr>
+            <w:r/>
+            <w:r>
+              <w:rPr>
+                <w:rFonts w:ascii="Calibri" w:hAnsi="Calibri" w:eastAsia="微软雅黑"/>
+                <w:b/>
+                <w:i/>
+                <w:color w:val="C00000"/>
+                <w:sz w:val="21"/>
+              </w:rPr>
+              <w:t>专属效果</w:t>
+            </w:r>
+          </w:p>
+        </w:tc>
+        <w:tc>
+          <w:tcPr>
+            <w:tcW w:type="dxa" w:w="4139"/>
+            <w:shd w:val="clear" w:color="auto" w:fill="E2EFDA"/>
+            <w:tcBorders>
+              <w:top w:val="single" w:sz="4" w:space="0" w:color="8FAADC"/>
+              <w:left w:val="single" w:sz="4" w:space="0" w:color="8FAADC"/>
+              <w:bottom w:val="single" w:sz="4" w:space="0" w:color="8FAADC"/>
+              <w:right w:val="single" w:sz="4" w:space="0" w:color="8FAADC"/>
+            </w:tcBorders>
+            <w:tcMar>
+              <w:top w:w="40" w:type="dxa"/>
+              <w:left w:w="60" w:type="dxa"/>
+              <w:bottom w:w="40" w:type="dxa"/>
+              <w:right w:w="60" w:type="dxa"/>
+            </w:tcMar>
+            <w:vAlign w:val="center"/>
+          </w:tcPr>
+          <w:p>
+            <w:pPr>
+              <w:spacing w:before="0" w:after="0" w:line="259" w:lineRule="auto"/>
+              <w:jc w:val="center"/>
+            </w:pPr>
+            <w:r/>
+            <w:r>
+              <w:rPr>
+                <w:rFonts w:ascii="Calibri" w:hAnsi="Calibri" w:eastAsia="微软雅黑"/>
+                <w:b/>
+                <w:i/>
+                <w:color w:val="C00000"/>
+                <w:sz w:val="21"/>
+              </w:rPr>
+              <w:t>设计说明</w:t>
+            </w:r>
+          </w:p>
+        </w:tc>
+      </w:tr>
+      <w:tr>
+        <w:tc>
+          <w:tcPr>
+            <w:tcW w:type="dxa" w:w="1247"/>
+            <w:tcBorders>
+              <w:top w:val="single" w:sz="4" w:space="0" w:color="8FAADC"/>
+              <w:left w:val="single" w:sz="4" w:space="0" w:color="8FAADC"/>
+              <w:bottom w:val="single" w:sz="4" w:space="0" w:color="8FAADC"/>
+              <w:right w:val="single" w:sz="4" w:space="0" w:color="8FAADC"/>
+            </w:tcBorders>
+            <w:tcMar>
+              <w:top w:w="40" w:type="dxa"/>
+              <w:left w:w="60" w:type="dxa"/>
+              <w:bottom w:w="40" w:type="dxa"/>
+              <w:right w:w="60" w:type="dxa"/>
+            </w:tcMar>
+            <w:vAlign w:val="center"/>
+          </w:tcPr>
+          <w:p>
+            <w:pPr>
+              <w:spacing w:before="0" w:after="0" w:line="259" w:lineRule="auto"/>
+              <w:jc w:val="center"/>
+            </w:pPr>
+            <w:r/>
+            <w:r>
+              <w:rPr>
+                <w:rFonts w:ascii="Calibri" w:hAnsi="Calibri" w:eastAsia="宋体"/>
+                <w:b w:val="0"/>
+                <w:color w:val="2D2D2D"/>
+                <w:sz w:val="21"/>
+              </w:rPr>
+              <w:t>T-02</w:t>
+            </w:r>
+          </w:p>
+        </w:tc>
+        <w:tc>
+          <w:tcPr>
+            <w:tcW w:type="dxa" w:w="1474"/>
+            <w:tcBorders>
+              <w:top w:val="single" w:sz="4" w:space="0" w:color="8FAADC"/>
+              <w:left w:val="single" w:sz="4" w:space="0" w:color="8FAADC"/>
+              <w:bottom w:val="single" w:sz="4" w:space="0" w:color="8FAADC"/>
+              <w:right w:val="single" w:sz="4" w:space="0" w:color="8FAADC"/>
+            </w:tcBorders>
+            <w:tcMar>
+              <w:top w:w="40" w:type="dxa"/>
+              <w:left w:w="60" w:type="dxa"/>
+              <w:bottom w:w="40" w:type="dxa"/>
+              <w:right w:w="60" w:type="dxa"/>
+            </w:tcMar>
+            <w:vAlign w:val="center"/>
+          </w:tcPr>
+          <w:p>
+            <w:pPr>
+              <w:spacing w:before="0" w:after="0" w:line="259" w:lineRule="auto"/>
+              <w:jc w:val="left"/>
+            </w:pPr>
+            <w:r/>
+            <w:r>
+              <w:rPr>
+                <w:rFonts w:ascii="Calibri" w:hAnsi="Calibri" w:eastAsia="宋体"/>
+                <w:b w:val="0"/>
+                <w:color w:val="2D2D2D"/>
+                <w:sz w:val="21"/>
+              </w:rPr>
+              <w:t>察微郎</w:t>
+            </w:r>
+          </w:p>
+        </w:tc>
+        <w:tc>
+          <w:tcPr>
+            <w:tcW w:type="dxa" w:w="850"/>
+            <w:tcBorders>
+              <w:top w:val="single" w:sz="4" w:space="0" w:color="8FAADC"/>
+              <w:left w:val="single" w:sz="4" w:space="0" w:color="8FAADC"/>
+              <w:bottom w:val="single" w:sz="4" w:space="0" w:color="8FAADC"/>
+              <w:right w:val="single" w:sz="4" w:space="0" w:color="8FAADC"/>
+            </w:tcBorders>
+            <w:tcMar>
+              <w:top w:w="40" w:type="dxa"/>
+              <w:left w:w="60" w:type="dxa"/>
+              <w:bottom w:w="40" w:type="dxa"/>
+              <w:right w:w="60" w:type="dxa"/>
+            </w:tcMar>
+            <w:vAlign w:val="center"/>
+          </w:tcPr>
+          <w:p>
+            <w:pPr>
+              <w:spacing w:before="0" w:after="0" w:line="259" w:lineRule="auto"/>
+              <w:jc w:val="center"/>
+            </w:pPr>
+            <w:r/>
+            <w:r>
+              <w:rPr>
+                <w:rFonts w:ascii="Calibri" w:hAnsi="Calibri" w:eastAsia="宋体"/>
+                <w:b w:val="0"/>
+                <w:color w:val="2D2D2D"/>
+                <w:sz w:val="21"/>
+              </w:rPr>
+              <w:t>1</w:t>
+            </w:r>
+          </w:p>
+        </w:tc>
+        <w:tc>
+          <w:tcPr>
+            <w:tcW w:type="dxa" w:w="1020"/>
+            <w:tcBorders>
+              <w:top w:val="single" w:sz="4" w:space="0" w:color="8FAADC"/>
+              <w:left w:val="single" w:sz="4" w:space="0" w:color="8FAADC"/>
+              <w:bottom w:val="single" w:sz="4" w:space="0" w:color="8FAADC"/>
+              <w:right w:val="single" w:sz="4" w:space="0" w:color="8FAADC"/>
+            </w:tcBorders>
+            <w:tcMar>
+              <w:top w:w="40" w:type="dxa"/>
+              <w:left w:w="60" w:type="dxa"/>
+              <w:bottom w:w="40" w:type="dxa"/>
+              <w:right w:w="60" w:type="dxa"/>
+            </w:tcMar>
+            <w:vAlign w:val="center"/>
+          </w:tcPr>
+          <w:p>
+            <w:pPr>
+              <w:spacing w:before="0" w:after="0" w:line="259" w:lineRule="auto"/>
+              <w:jc w:val="center"/>
+            </w:pPr>
+            <w:r/>
+            <w:r>
+              <w:rPr>
+                <w:rFonts w:ascii="Calibri" w:hAnsi="Calibri" w:eastAsia="宋体"/>
+                <w:b w:val="0"/>
+                <w:color w:val="2D2D2D"/>
+                <w:sz w:val="21"/>
+              </w:rPr>
+              <w:t>攻击</w:t>
+            </w:r>
+          </w:p>
+        </w:tc>
+        <w:tc>
+          <w:tcPr>
+            <w:tcW w:type="dxa" w:w="4876"/>
+            <w:tcBorders>
+              <w:top w:val="single" w:sz="4" w:space="0" w:color="8FAADC"/>
+              <w:left w:val="single" w:sz="4" w:space="0" w:color="8FAADC"/>
+              <w:bottom w:val="single" w:sz="4" w:space="0" w:color="8FAADC"/>
+              <w:right w:val="single" w:sz="4" w:space="0" w:color="8FAADC"/>
+            </w:tcBorders>
+            <w:tcMar>
+              <w:top w:w="40" w:type="dxa"/>
+              <w:left w:w="60" w:type="dxa"/>
+              <w:bottom w:w="40" w:type="dxa"/>
+              <w:right w:w="60" w:type="dxa"/>
+            </w:tcMar>
+            <w:vAlign w:val="center"/>
+          </w:tcPr>
+          <w:p>
+            <w:pPr>
+              <w:spacing w:before="0" w:after="0" w:line="259" w:lineRule="auto"/>
+              <w:jc w:val="left"/>
+            </w:pPr>
+            <w:r/>
+            <w:r>
+              <w:rPr>
+                <w:rFonts w:ascii="Calibri" w:hAnsi="Calibri" w:eastAsia="宋体"/>
+                <w:b w:val="0"/>
+                <w:color w:val="2D2D2D"/>
+                <w:sz w:val="21"/>
+              </w:rPr>
+              <w:t>立即造成 1 点伤害，并为自己增加 2 点防御</w:t>
+            </w:r>
+          </w:p>
+        </w:tc>
+        <w:tc>
+          <w:tcPr>
+            <w:tcW w:type="dxa" w:w="4139"/>
+            <w:tcBorders>
+              <w:top w:val="single" w:sz="4" w:space="0" w:color="8FAADC"/>
+              <w:left w:val="single" w:sz="4" w:space="0" w:color="8FAADC"/>
+              <w:bottom w:val="single" w:sz="4" w:space="0" w:color="8FAADC"/>
+              <w:right w:val="single" w:sz="4" w:space="0" w:color="8FAADC"/>
+            </w:tcBorders>
+            <w:tcMar>
+              <w:top w:w="40" w:type="dxa"/>
+              <w:left w:w="60" w:type="dxa"/>
+              <w:bottom w:w="40" w:type="dxa"/>
+              <w:right w:w="60" w:type="dxa"/>
+            </w:tcMar>
+            <w:vAlign w:val="center"/>
+          </w:tcPr>
+          <w:p>
+            <w:pPr>
+              <w:spacing w:before="0" w:after="0" w:line="259" w:lineRule="auto"/>
+              <w:jc w:val="left"/>
+            </w:pPr>
+            <w:r/>
+            <w:r>
+              <w:rPr>
+                <w:rFonts w:ascii="Calibri" w:hAnsi="Calibri" w:eastAsia="宋体"/>
+                <w:b w:val="0"/>
+                <w:color w:val="2D2D2D"/>
+                <w:sz w:val="21"/>
+              </w:rPr>
+              <w:t>火镜细察：伤 1 自盾 2；区别于纹章师的任意盾 2 + 伤 1，也区别于捕鼠师的伤 2 自盾 1。</w:t>
+            </w:r>
+          </w:p>
+        </w:tc>
+      </w:tr>
+      <w:tr>
+        <w:tc>
+          <w:tcPr>
+            <w:tcW w:type="dxa" w:w="1247"/>
+            <w:tcBorders>
+              <w:top w:val="single" w:sz="4" w:space="0" w:color="8FAADC"/>
+              <w:left w:val="single" w:sz="4" w:space="0" w:color="8FAADC"/>
+              <w:bottom w:val="single" w:sz="4" w:space="0" w:color="8FAADC"/>
+              <w:right w:val="single" w:sz="4" w:space="0" w:color="8FAADC"/>
+            </w:tcBorders>
+            <w:tcMar>
+              <w:top w:w="40" w:type="dxa"/>
+              <w:left w:w="60" w:type="dxa"/>
+              <w:bottom w:w="40" w:type="dxa"/>
+              <w:right w:w="60" w:type="dxa"/>
+            </w:tcMar>
+            <w:vAlign w:val="center"/>
+            <w:shd w:val="clear" w:color="auto" w:fill="F7FAFC"/>
+          </w:tcPr>
+          <w:p>
+            <w:pPr>
+              <w:spacing w:before="0" w:after="0" w:line="259" w:lineRule="auto"/>
+              <w:jc w:val="center"/>
+            </w:pPr>
+            <w:r/>
+            <w:r>
+              <w:rPr>
+                <w:rFonts w:ascii="Calibri" w:hAnsi="Calibri" w:eastAsia="宋体"/>
+                <w:b w:val="0"/>
+                <w:color w:val="2D2D2D"/>
+                <w:sz w:val="21"/>
+              </w:rPr>
+              <w:t>T-03</w:t>
+            </w:r>
+          </w:p>
+        </w:tc>
+        <w:tc>
+          <w:tcPr>
+            <w:tcW w:type="dxa" w:w="1474"/>
+            <w:tcBorders>
+              <w:top w:val="single" w:sz="4" w:space="0" w:color="8FAADC"/>
+              <w:left w:val="single" w:sz="4" w:space="0" w:color="8FAADC"/>
+              <w:bottom w:val="single" w:sz="4" w:space="0" w:color="8FAADC"/>
+              <w:right w:val="single" w:sz="4" w:space="0" w:color="8FAADC"/>
+            </w:tcBorders>
+            <w:tcMar>
+              <w:top w:w="40" w:type="dxa"/>
+              <w:left w:w="60" w:type="dxa"/>
+              <w:bottom w:w="40" w:type="dxa"/>
+              <w:right w:w="60" w:type="dxa"/>
+            </w:tcMar>
+            <w:vAlign w:val="center"/>
+            <w:shd w:val="clear" w:color="auto" w:fill="F7FAFC"/>
+          </w:tcPr>
+          <w:p>
+            <w:pPr>
+              <w:spacing w:before="0" w:after="0" w:line="259" w:lineRule="auto"/>
+              <w:jc w:val="left"/>
+            </w:pPr>
+            <w:r/>
+            <w:r>
+              <w:rPr>
+                <w:rFonts w:ascii="Calibri" w:hAnsi="Calibri" w:eastAsia="宋体"/>
+                <w:b w:val="0"/>
+                <w:color w:val="2D2D2D"/>
+                <w:sz w:val="21"/>
+              </w:rPr>
+              <w:t>覆面吏</w:t>
+            </w:r>
+          </w:p>
+        </w:tc>
+        <w:tc>
+          <w:tcPr>
+            <w:tcW w:type="dxa" w:w="850"/>
+            <w:tcBorders>
+              <w:top w:val="single" w:sz="4" w:space="0" w:color="8FAADC"/>
+              <w:left w:val="single" w:sz="4" w:space="0" w:color="8FAADC"/>
+              <w:bottom w:val="single" w:sz="4" w:space="0" w:color="8FAADC"/>
+              <w:right w:val="single" w:sz="4" w:space="0" w:color="8FAADC"/>
+            </w:tcBorders>
+            <w:tcMar>
+              <w:top w:w="40" w:type="dxa"/>
+              <w:left w:w="60" w:type="dxa"/>
+              <w:bottom w:w="40" w:type="dxa"/>
+              <w:right w:w="60" w:type="dxa"/>
+            </w:tcMar>
+            <w:vAlign w:val="center"/>
+            <w:shd w:val="clear" w:color="auto" w:fill="F7FAFC"/>
+          </w:tcPr>
+          <w:p>
+            <w:pPr>
+              <w:spacing w:before="0" w:after="0" w:line="259" w:lineRule="auto"/>
+              <w:jc w:val="center"/>
+            </w:pPr>
+            <w:r/>
+            <w:r>
+              <w:rPr>
+                <w:rFonts w:ascii="Calibri" w:hAnsi="Calibri" w:eastAsia="宋体"/>
+                <w:b w:val="0"/>
+                <w:color w:val="2D2D2D"/>
+                <w:sz w:val="21"/>
+              </w:rPr>
+              <w:t>2</w:t>
+            </w:r>
+          </w:p>
+        </w:tc>
+        <w:tc>
+          <w:tcPr>
+            <w:tcW w:type="dxa" w:w="1020"/>
+            <w:tcBorders>
+              <w:top w:val="single" w:sz="4" w:space="0" w:color="8FAADC"/>
+              <w:left w:val="single" w:sz="4" w:space="0" w:color="8FAADC"/>
+              <w:bottom w:val="single" w:sz="4" w:space="0" w:color="8FAADC"/>
+              <w:right w:val="single" w:sz="4" w:space="0" w:color="8FAADC"/>
+            </w:tcBorders>
+            <w:tcMar>
+              <w:top w:w="40" w:type="dxa"/>
+              <w:left w:w="60" w:type="dxa"/>
+              <w:bottom w:w="40" w:type="dxa"/>
+              <w:right w:w="60" w:type="dxa"/>
+            </w:tcMar>
+            <w:vAlign w:val="center"/>
+            <w:shd w:val="clear" w:color="auto" w:fill="F7FAFC"/>
+          </w:tcPr>
+          <w:p>
+            <w:pPr>
+              <w:spacing w:before="0" w:after="0" w:line="259" w:lineRule="auto"/>
+              <w:jc w:val="center"/>
+            </w:pPr>
+            <w:r/>
+            <w:r>
+              <w:rPr>
+                <w:rFonts w:ascii="Calibri" w:hAnsi="Calibri" w:eastAsia="宋体"/>
+                <w:b w:val="0"/>
+                <w:color w:val="2D2D2D"/>
+                <w:sz w:val="21"/>
+              </w:rPr>
+              <w:t>防御</w:t>
+            </w:r>
+          </w:p>
+        </w:tc>
+        <w:tc>
+          <w:tcPr>
+            <w:tcW w:type="dxa" w:w="4876"/>
+            <w:tcBorders>
+              <w:top w:val="single" w:sz="4" w:space="0" w:color="8FAADC"/>
+              <w:left w:val="single" w:sz="4" w:space="0" w:color="8FAADC"/>
+              <w:bottom w:val="single" w:sz="4" w:space="0" w:color="8FAADC"/>
+              <w:right w:val="single" w:sz="4" w:space="0" w:color="8FAADC"/>
+            </w:tcBorders>
+            <w:tcMar>
+              <w:top w:w="40" w:type="dxa"/>
+              <w:left w:w="60" w:type="dxa"/>
+              <w:bottom w:w="40" w:type="dxa"/>
+              <w:right w:w="60" w:type="dxa"/>
+            </w:tcMar>
+            <w:vAlign w:val="center"/>
+            <w:shd w:val="clear" w:color="auto" w:fill="F7FAFC"/>
+          </w:tcPr>
+          <w:p>
+            <w:pPr>
+              <w:spacing w:before="0" w:after="0" w:line="259" w:lineRule="auto"/>
+              <w:jc w:val="left"/>
+            </w:pPr>
+            <w:r/>
+            <w:r>
+              <w:rPr>
+                <w:rFonts w:ascii="Calibri" w:hAnsi="Calibri" w:eastAsia="宋体"/>
+                <w:b w:val="0"/>
+                <w:color w:val="2D2D2D"/>
+                <w:sz w:val="21"/>
+              </w:rPr>
+              <w:t>为自己增加 3 点防御，本回合霸凌者攻击 -1</w:t>
+            </w:r>
+          </w:p>
+        </w:tc>
+        <w:tc>
+          <w:tcPr>
+            <w:tcW w:type="dxa" w:w="4139"/>
+            <w:tcBorders>
+              <w:top w:val="single" w:sz="4" w:space="0" w:color="8FAADC"/>
+              <w:left w:val="single" w:sz="4" w:space="0" w:color="8FAADC"/>
+              <w:bottom w:val="single" w:sz="4" w:space="0" w:color="8FAADC"/>
+              <w:right w:val="single" w:sz="4" w:space="0" w:color="8FAADC"/>
+            </w:tcBorders>
+            <w:tcMar>
+              <w:top w:w="40" w:type="dxa"/>
+              <w:left w:w="60" w:type="dxa"/>
+              <w:bottom w:w="40" w:type="dxa"/>
+              <w:right w:w="60" w:type="dxa"/>
+            </w:tcMar>
+            <w:vAlign w:val="center"/>
+            <w:shd w:val="clear" w:color="auto" w:fill="F7FAFC"/>
+          </w:tcPr>
+          <w:p>
+            <w:pPr>
+              <w:spacing w:before="0" w:after="0" w:line="259" w:lineRule="auto"/>
+              <w:jc w:val="left"/>
+            </w:pPr>
+            <w:r/>
+            <w:r>
+              <w:rPr>
+                <w:rFonts w:ascii="Calibri" w:hAnsi="Calibri" w:eastAsia="宋体"/>
+                <w:b w:val="0"/>
+                <w:color w:val="2D2D2D"/>
+                <w:sz w:val="21"/>
+              </w:rPr>
+              <w:t>覆盆挡势：自盾 3 + 减攻 1；不撞账册核验的任意盾 2 + 减攻，也不撞骑士的伤 3 自盾 3。</w:t>
+            </w:r>
+          </w:p>
+        </w:tc>
+      </w:tr>
+      <w:tr>
+        <w:tc>
+          <w:tcPr>
+            <w:tcW w:type="dxa" w:w="1247"/>
+            <w:tcBorders>
+              <w:top w:val="single" w:sz="4" w:space="0" w:color="8FAADC"/>
+              <w:left w:val="single" w:sz="4" w:space="0" w:color="8FAADC"/>
+              <w:bottom w:val="single" w:sz="4" w:space="0" w:color="8FAADC"/>
+              <w:right w:val="single" w:sz="4" w:space="0" w:color="8FAADC"/>
+            </w:tcBorders>
+            <w:tcMar>
+              <w:top w:w="40" w:type="dxa"/>
+              <w:left w:w="60" w:type="dxa"/>
+              <w:bottom w:w="40" w:type="dxa"/>
+              <w:right w:w="60" w:type="dxa"/>
+            </w:tcMar>
+            <w:vAlign w:val="center"/>
+          </w:tcPr>
+          <w:p>
+            <w:pPr>
+              <w:spacing w:before="0" w:after="0" w:line="259" w:lineRule="auto"/>
+              <w:jc w:val="center"/>
+            </w:pPr>
+            <w:r/>
+            <w:r>
+              <w:rPr>
+                <w:rFonts w:ascii="Calibri" w:hAnsi="Calibri" w:eastAsia="宋体"/>
+                <w:b w:val="0"/>
+                <w:color w:val="2D2D2D"/>
+                <w:sz w:val="21"/>
+              </w:rPr>
+              <w:t>T-04</w:t>
+            </w:r>
+          </w:p>
+        </w:tc>
+        <w:tc>
+          <w:tcPr>
+            <w:tcW w:type="dxa" w:w="1474"/>
+            <w:tcBorders>
+              <w:top w:val="single" w:sz="4" w:space="0" w:color="8FAADC"/>
+              <w:left w:val="single" w:sz="4" w:space="0" w:color="8FAADC"/>
+              <w:bottom w:val="single" w:sz="4" w:space="0" w:color="8FAADC"/>
+              <w:right w:val="single" w:sz="4" w:space="0" w:color="8FAADC"/>
+            </w:tcBorders>
+            <w:tcMar>
+              <w:top w:w="40" w:type="dxa"/>
+              <w:left w:w="60" w:type="dxa"/>
+              <w:bottom w:w="40" w:type="dxa"/>
+              <w:right w:w="60" w:type="dxa"/>
+            </w:tcMar>
+            <w:vAlign w:val="center"/>
+          </w:tcPr>
+          <w:p>
+            <w:pPr>
+              <w:spacing w:before="0" w:after="0" w:line="259" w:lineRule="auto"/>
+              <w:jc w:val="left"/>
+            </w:pPr>
+            <w:r/>
+            <w:r>
+              <w:rPr>
+                <w:rFonts w:ascii="Calibri" w:hAnsi="Calibri" w:eastAsia="宋体"/>
+                <w:b w:val="0"/>
+                <w:color w:val="2D2D2D"/>
+                <w:sz w:val="21"/>
+              </w:rPr>
+              <w:t>浑仪生</w:t>
+            </w:r>
+          </w:p>
+        </w:tc>
+        <w:tc>
+          <w:tcPr>
+            <w:tcW w:type="dxa" w:w="850"/>
+            <w:tcBorders>
+              <w:top w:val="single" w:sz="4" w:space="0" w:color="8FAADC"/>
+              <w:left w:val="single" w:sz="4" w:space="0" w:color="8FAADC"/>
+              <w:bottom w:val="single" w:sz="4" w:space="0" w:color="8FAADC"/>
+              <w:right w:val="single" w:sz="4" w:space="0" w:color="8FAADC"/>
+            </w:tcBorders>
+            <w:tcMar>
+              <w:top w:w="40" w:type="dxa"/>
+              <w:left w:w="60" w:type="dxa"/>
+              <w:bottom w:w="40" w:type="dxa"/>
+              <w:right w:w="60" w:type="dxa"/>
+            </w:tcMar>
+            <w:vAlign w:val="center"/>
+          </w:tcPr>
+          <w:p>
+            <w:pPr>
+              <w:spacing w:before="0" w:after="0" w:line="259" w:lineRule="auto"/>
+              <w:jc w:val="center"/>
+            </w:pPr>
+            <w:r/>
+            <w:r>
+              <w:rPr>
+                <w:rFonts w:ascii="Calibri" w:hAnsi="Calibri" w:eastAsia="宋体"/>
+                <w:b w:val="0"/>
+                <w:color w:val="2D2D2D"/>
+                <w:sz w:val="21"/>
+              </w:rPr>
+              <w:t>2</w:t>
+            </w:r>
+          </w:p>
+        </w:tc>
+        <w:tc>
+          <w:tcPr>
+            <w:tcW w:type="dxa" w:w="1020"/>
+            <w:tcBorders>
+              <w:top w:val="single" w:sz="4" w:space="0" w:color="8FAADC"/>
+              <w:left w:val="single" w:sz="4" w:space="0" w:color="8FAADC"/>
+              <w:bottom w:val="single" w:sz="4" w:space="0" w:color="8FAADC"/>
+              <w:right w:val="single" w:sz="4" w:space="0" w:color="8FAADC"/>
+            </w:tcBorders>
+            <w:tcMar>
+              <w:top w:w="40" w:type="dxa"/>
+              <w:left w:w="60" w:type="dxa"/>
+              <w:bottom w:w="40" w:type="dxa"/>
+              <w:right w:w="60" w:type="dxa"/>
+            </w:tcMar>
+            <w:vAlign w:val="center"/>
+          </w:tcPr>
+          <w:p>
+            <w:pPr>
+              <w:spacing w:before="0" w:after="0" w:line="259" w:lineRule="auto"/>
+              <w:jc w:val="center"/>
+            </w:pPr>
+            <w:r/>
+            <w:r>
+              <w:rPr>
+                <w:rFonts w:ascii="Calibri" w:hAnsi="Calibri" w:eastAsia="宋体"/>
+                <w:b w:val="0"/>
+                <w:color w:val="2D2D2D"/>
+                <w:sz w:val="21"/>
+              </w:rPr>
+              <w:t>抽牌</w:t>
+            </w:r>
+          </w:p>
+        </w:tc>
+        <w:tc>
+          <w:tcPr>
+            <w:tcW w:type="dxa" w:w="4876"/>
+            <w:tcBorders>
+              <w:top w:val="single" w:sz="4" w:space="0" w:color="8FAADC"/>
+              <w:left w:val="single" w:sz="4" w:space="0" w:color="8FAADC"/>
+              <w:bottom w:val="single" w:sz="4" w:space="0" w:color="8FAADC"/>
+              <w:right w:val="single" w:sz="4" w:space="0" w:color="8FAADC"/>
+            </w:tcBorders>
+            <w:tcMar>
+              <w:top w:w="40" w:type="dxa"/>
+              <w:left w:w="60" w:type="dxa"/>
+              <w:bottom w:w="40" w:type="dxa"/>
+              <w:right w:w="60" w:type="dxa"/>
+            </w:tcMar>
+            <w:vAlign w:val="center"/>
+          </w:tcPr>
+          <w:p>
+            <w:pPr>
+              <w:spacing w:before="0" w:after="0" w:line="259" w:lineRule="auto"/>
+              <w:jc w:val="left"/>
+            </w:pPr>
+            <w:r/>
+            <w:r>
+              <w:rPr>
+                <w:rFonts w:ascii="Calibri" w:hAnsi="Calibri" w:eastAsia="宋体"/>
+                <w:b w:val="0"/>
+                <w:color w:val="2D2D2D"/>
+                <w:sz w:val="21"/>
+              </w:rPr>
+              <w:t>立即造成 2 点伤害，下回合抽 2 张牌</w:t>
+            </w:r>
+          </w:p>
+        </w:tc>
+        <w:tc>
+          <w:tcPr>
+            <w:tcW w:type="dxa" w:w="4139"/>
+            <w:tcBorders>
+              <w:top w:val="single" w:sz="4" w:space="0" w:color="8FAADC"/>
+              <w:left w:val="single" w:sz="4" w:space="0" w:color="8FAADC"/>
+              <w:bottom w:val="single" w:sz="4" w:space="0" w:color="8FAADC"/>
+              <w:right w:val="single" w:sz="4" w:space="0" w:color="8FAADC"/>
+            </w:tcBorders>
+            <w:tcMar>
+              <w:top w:w="40" w:type="dxa"/>
+              <w:left w:w="60" w:type="dxa"/>
+              <w:bottom w:w="40" w:type="dxa"/>
+              <w:right w:w="60" w:type="dxa"/>
+            </w:tcMar>
+            <w:vAlign w:val="center"/>
+          </w:tcPr>
+          <w:p>
+            <w:pPr>
+              <w:spacing w:before="0" w:after="0" w:line="259" w:lineRule="auto"/>
+              <w:jc w:val="left"/>
+            </w:pPr>
+            <w:r/>
+            <w:r>
+              <w:rPr>
+                <w:rFonts w:ascii="Calibri" w:hAnsi="Calibri" w:eastAsia="宋体"/>
+                <w:b w:val="0"/>
+                <w:color w:val="2D2D2D"/>
+                <w:sz w:val="21"/>
+              </w:rPr>
+              <w:t>测天换页：伤 2 下回合连抽；系统术士是伤 2 下回合抽 1。</w:t>
+            </w:r>
+          </w:p>
+        </w:tc>
+      </w:tr>
+      <w:tr>
+        <w:tc>
+          <w:tcPr>
+            <w:tcW w:type="dxa" w:w="1247"/>
+            <w:tcBorders>
+              <w:top w:val="single" w:sz="4" w:space="0" w:color="8FAADC"/>
+              <w:left w:val="single" w:sz="4" w:space="0" w:color="8FAADC"/>
+              <w:bottom w:val="single" w:sz="4" w:space="0" w:color="8FAADC"/>
+              <w:right w:val="single" w:sz="4" w:space="0" w:color="8FAADC"/>
+            </w:tcBorders>
+            <w:tcMar>
+              <w:top w:w="40" w:type="dxa"/>
+              <w:left w:w="60" w:type="dxa"/>
+              <w:bottom w:w="40" w:type="dxa"/>
+              <w:right w:w="60" w:type="dxa"/>
+            </w:tcMar>
+            <w:vAlign w:val="center"/>
+            <w:shd w:val="clear" w:color="auto" w:fill="F7FAFC"/>
+          </w:tcPr>
+          <w:p>
+            <w:pPr>
+              <w:spacing w:before="0" w:after="0" w:line="259" w:lineRule="auto"/>
+              <w:jc w:val="center"/>
+            </w:pPr>
+            <w:r/>
+            <w:r>
+              <w:rPr>
+                <w:rFonts w:ascii="Calibri" w:hAnsi="Calibri" w:eastAsia="宋体"/>
+                <w:b w:val="0"/>
+                <w:color w:val="2D2D2D"/>
+                <w:sz w:val="21"/>
+              </w:rPr>
+              <w:t>T-05</w:t>
+            </w:r>
+          </w:p>
+        </w:tc>
+        <w:tc>
+          <w:tcPr>
+            <w:tcW w:type="dxa" w:w="1474"/>
+            <w:tcBorders>
+              <w:top w:val="single" w:sz="4" w:space="0" w:color="8FAADC"/>
+              <w:left w:val="single" w:sz="4" w:space="0" w:color="8FAADC"/>
+              <w:bottom w:val="single" w:sz="4" w:space="0" w:color="8FAADC"/>
+              <w:right w:val="single" w:sz="4" w:space="0" w:color="8FAADC"/>
+            </w:tcBorders>
+            <w:tcMar>
+              <w:top w:w="40" w:type="dxa"/>
+              <w:left w:w="60" w:type="dxa"/>
+              <w:bottom w:w="40" w:type="dxa"/>
+              <w:right w:w="60" w:type="dxa"/>
+            </w:tcMar>
+            <w:vAlign w:val="center"/>
+            <w:shd w:val="clear" w:color="auto" w:fill="F7FAFC"/>
+          </w:tcPr>
+          <w:p>
+            <w:pPr>
+              <w:spacing w:before="0" w:after="0" w:line="259" w:lineRule="auto"/>
+              <w:jc w:val="left"/>
+            </w:pPr>
+            <w:r/>
+            <w:r>
+              <w:rPr>
+                <w:rFonts w:ascii="Calibri" w:hAnsi="Calibri" w:eastAsia="宋体"/>
+                <w:b w:val="0"/>
+                <w:color w:val="2D2D2D"/>
+                <w:sz w:val="21"/>
+              </w:rPr>
+              <w:t>司历官</w:t>
+            </w:r>
+          </w:p>
+        </w:tc>
+        <w:tc>
+          <w:tcPr>
+            <w:tcW w:type="dxa" w:w="850"/>
+            <w:tcBorders>
+              <w:top w:val="single" w:sz="4" w:space="0" w:color="8FAADC"/>
+              <w:left w:val="single" w:sz="4" w:space="0" w:color="8FAADC"/>
+              <w:bottom w:val="single" w:sz="4" w:space="0" w:color="8FAADC"/>
+              <w:right w:val="single" w:sz="4" w:space="0" w:color="8FAADC"/>
+            </w:tcBorders>
+            <w:tcMar>
+              <w:top w:w="40" w:type="dxa"/>
+              <w:left w:w="60" w:type="dxa"/>
+              <w:bottom w:w="40" w:type="dxa"/>
+              <w:right w:w="60" w:type="dxa"/>
+            </w:tcMar>
+            <w:vAlign w:val="center"/>
+            <w:shd w:val="clear" w:color="auto" w:fill="F7FAFC"/>
+          </w:tcPr>
+          <w:p>
+            <w:pPr>
+              <w:spacing w:before="0" w:after="0" w:line="259" w:lineRule="auto"/>
+              <w:jc w:val="center"/>
+            </w:pPr>
+            <w:r/>
+            <w:r>
+              <w:rPr>
+                <w:rFonts w:ascii="Calibri" w:hAnsi="Calibri" w:eastAsia="宋体"/>
+                <w:b w:val="0"/>
+                <w:color w:val="2D2D2D"/>
+                <w:sz w:val="21"/>
+              </w:rPr>
+              <w:t>1</w:t>
+            </w:r>
+          </w:p>
+        </w:tc>
+        <w:tc>
+          <w:tcPr>
+            <w:tcW w:type="dxa" w:w="1020"/>
+            <w:tcBorders>
+              <w:top w:val="single" w:sz="4" w:space="0" w:color="8FAADC"/>
+              <w:left w:val="single" w:sz="4" w:space="0" w:color="8FAADC"/>
+              <w:bottom w:val="single" w:sz="4" w:space="0" w:color="8FAADC"/>
+              <w:right w:val="single" w:sz="4" w:space="0" w:color="8FAADC"/>
+            </w:tcBorders>
+            <w:tcMar>
+              <w:top w:w="40" w:type="dxa"/>
+              <w:left w:w="60" w:type="dxa"/>
+              <w:bottom w:w="40" w:type="dxa"/>
+              <w:right w:w="60" w:type="dxa"/>
+            </w:tcMar>
+            <w:vAlign w:val="center"/>
+            <w:shd w:val="clear" w:color="auto" w:fill="F7FAFC"/>
+          </w:tcPr>
+          <w:p>
+            <w:pPr>
+              <w:spacing w:before="0" w:after="0" w:line="259" w:lineRule="auto"/>
+              <w:jc w:val="center"/>
+            </w:pPr>
+            <w:r/>
+            <w:r>
+              <w:rPr>
+                <w:rFonts w:ascii="Calibri" w:hAnsi="Calibri" w:eastAsia="宋体"/>
+                <w:b w:val="0"/>
+                <w:color w:val="2D2D2D"/>
+                <w:sz w:val="21"/>
+              </w:rPr>
+              <w:t>治疗</w:t>
+            </w:r>
+          </w:p>
+        </w:tc>
+        <w:tc>
+          <w:tcPr>
+            <w:tcW w:type="dxa" w:w="4876"/>
+            <w:tcBorders>
+              <w:top w:val="single" w:sz="4" w:space="0" w:color="8FAADC"/>
+              <w:left w:val="single" w:sz="4" w:space="0" w:color="8FAADC"/>
+              <w:bottom w:val="single" w:sz="4" w:space="0" w:color="8FAADC"/>
+              <w:right w:val="single" w:sz="4" w:space="0" w:color="8FAADC"/>
+            </w:tcBorders>
+            <w:tcMar>
+              <w:top w:w="40" w:type="dxa"/>
+              <w:left w:w="60" w:type="dxa"/>
+              <w:bottom w:w="40" w:type="dxa"/>
+              <w:right w:w="60" w:type="dxa"/>
+            </w:tcMar>
+            <w:vAlign w:val="center"/>
+            <w:shd w:val="clear" w:color="auto" w:fill="F7FAFC"/>
+          </w:tcPr>
+          <w:p>
+            <w:pPr>
+              <w:spacing w:before="0" w:after="0" w:line="259" w:lineRule="auto"/>
+              <w:jc w:val="left"/>
+            </w:pPr>
+            <w:r/>
+            <w:r>
+              <w:rPr>
+                <w:rFonts w:ascii="Calibri" w:hAnsi="Calibri" w:eastAsia="宋体"/>
+                <w:b w:val="0"/>
+                <w:color w:val="2D2D2D"/>
+                <w:sz w:val="21"/>
+              </w:rPr>
+              <w:t>恢复自己 2 点血量，并为一名玩家增加 1 点防御</w:t>
+            </w:r>
+          </w:p>
+        </w:tc>
+        <w:tc>
+          <w:tcPr>
+            <w:tcW w:type="dxa" w:w="4139"/>
+            <w:tcBorders>
+              <w:top w:val="single" w:sz="4" w:space="0" w:color="8FAADC"/>
+              <w:left w:val="single" w:sz="4" w:space="0" w:color="8FAADC"/>
+              <w:bottom w:val="single" w:sz="4" w:space="0" w:color="8FAADC"/>
+              <w:right w:val="single" w:sz="4" w:space="0" w:color="8FAADC"/>
+            </w:tcBorders>
+            <w:tcMar>
+              <w:top w:w="40" w:type="dxa"/>
+              <w:left w:w="60" w:type="dxa"/>
+              <w:bottom w:w="40" w:type="dxa"/>
+              <w:right w:w="60" w:type="dxa"/>
+            </w:tcMar>
+            <w:vAlign w:val="center"/>
+            <w:shd w:val="clear" w:color="auto" w:fill="F7FAFC"/>
+          </w:tcPr>
+          <w:p>
+            <w:pPr>
+              <w:spacing w:before="0" w:after="0" w:line="259" w:lineRule="auto"/>
+              <w:jc w:val="left"/>
+            </w:pPr>
+            <w:r/>
+            <w:r>
+              <w:rPr>
+                <w:rFonts w:ascii="Calibri" w:hAnsi="Calibri" w:eastAsia="宋体"/>
+                <w:b w:val="0"/>
+                <w:color w:val="2D2D2D"/>
+                <w:sz w:val="21"/>
+              </w:rPr>
+              <w:t>校历自养：自奶 2 + 任意盾 1；草药师是任意奶 2 + 任意盾 1。</w:t>
+            </w:r>
+          </w:p>
+        </w:tc>
+      </w:tr>
+      <w:tr>
+        <w:tc>
+          <w:tcPr>
+            <w:tcW w:type="dxa" w:w="1247"/>
+            <w:tcBorders>
+              <w:top w:val="single" w:sz="4" w:space="0" w:color="8FAADC"/>
+              <w:left w:val="single" w:sz="4" w:space="0" w:color="8FAADC"/>
+              <w:bottom w:val="single" w:sz="4" w:space="0" w:color="8FAADC"/>
+              <w:right w:val="single" w:sz="4" w:space="0" w:color="8FAADC"/>
+            </w:tcBorders>
+            <w:tcMar>
+              <w:top w:w="40" w:type="dxa"/>
+              <w:left w:w="60" w:type="dxa"/>
+              <w:bottom w:w="40" w:type="dxa"/>
+              <w:right w:w="60" w:type="dxa"/>
+            </w:tcMar>
+            <w:vAlign w:val="center"/>
+          </w:tcPr>
+          <w:p>
+            <w:pPr>
+              <w:spacing w:before="0" w:after="0" w:line="259" w:lineRule="auto"/>
+              <w:jc w:val="center"/>
+            </w:pPr>
+            <w:r/>
+            <w:r>
+              <w:rPr>
+                <w:rFonts w:ascii="Calibri" w:hAnsi="Calibri" w:eastAsia="宋体"/>
+                <w:b w:val="0"/>
+                <w:color w:val="2D2D2D"/>
+                <w:sz w:val="21"/>
+              </w:rPr>
+              <w:t>T-06</w:t>
+            </w:r>
+          </w:p>
+        </w:tc>
+        <w:tc>
+          <w:tcPr>
+            <w:tcW w:type="dxa" w:w="1474"/>
+            <w:tcBorders>
+              <w:top w:val="single" w:sz="4" w:space="0" w:color="8FAADC"/>
+              <w:left w:val="single" w:sz="4" w:space="0" w:color="8FAADC"/>
+              <w:bottom w:val="single" w:sz="4" w:space="0" w:color="8FAADC"/>
+              <w:right w:val="single" w:sz="4" w:space="0" w:color="8FAADC"/>
+            </w:tcBorders>
+            <w:tcMar>
+              <w:top w:w="40" w:type="dxa"/>
+              <w:left w:w="60" w:type="dxa"/>
+              <w:bottom w:w="40" w:type="dxa"/>
+              <w:right w:w="60" w:type="dxa"/>
+            </w:tcMar>
+            <w:vAlign w:val="center"/>
+          </w:tcPr>
+          <w:p>
+            <w:pPr>
+              <w:spacing w:before="0" w:after="0" w:line="259" w:lineRule="auto"/>
+              <w:jc w:val="left"/>
+            </w:pPr>
+            <w:r/>
+            <w:r>
+              <w:rPr>
+                <w:rFonts w:ascii="Calibri" w:hAnsi="Calibri" w:eastAsia="宋体"/>
+                <w:b w:val="0"/>
+                <w:color w:val="2D2D2D"/>
+                <w:sz w:val="21"/>
+              </w:rPr>
+              <w:t>倦籍郎</w:t>
+            </w:r>
+          </w:p>
+        </w:tc>
+        <w:tc>
+          <w:tcPr>
+            <w:tcW w:type="dxa" w:w="850"/>
+            <w:tcBorders>
+              <w:top w:val="single" w:sz="4" w:space="0" w:color="8FAADC"/>
+              <w:left w:val="single" w:sz="4" w:space="0" w:color="8FAADC"/>
+              <w:bottom w:val="single" w:sz="4" w:space="0" w:color="8FAADC"/>
+              <w:right w:val="single" w:sz="4" w:space="0" w:color="8FAADC"/>
+            </w:tcBorders>
+            <w:tcMar>
+              <w:top w:w="40" w:type="dxa"/>
+              <w:left w:w="60" w:type="dxa"/>
+              <w:bottom w:w="40" w:type="dxa"/>
+              <w:right w:w="60" w:type="dxa"/>
+            </w:tcMar>
+            <w:vAlign w:val="center"/>
+          </w:tcPr>
+          <w:p>
+            <w:pPr>
+              <w:spacing w:before="0" w:after="0" w:line="259" w:lineRule="auto"/>
+              <w:jc w:val="center"/>
+            </w:pPr>
+            <w:r/>
+            <w:r>
+              <w:rPr>
+                <w:rFonts w:ascii="Calibri" w:hAnsi="Calibri" w:eastAsia="宋体"/>
+                <w:b w:val="0"/>
+                <w:color w:val="2D2D2D"/>
+                <w:sz w:val="21"/>
+              </w:rPr>
+              <w:t>2</w:t>
+            </w:r>
+          </w:p>
+        </w:tc>
+        <w:tc>
+          <w:tcPr>
+            <w:tcW w:type="dxa" w:w="1020"/>
+            <w:tcBorders>
+              <w:top w:val="single" w:sz="4" w:space="0" w:color="8FAADC"/>
+              <w:left w:val="single" w:sz="4" w:space="0" w:color="8FAADC"/>
+              <w:bottom w:val="single" w:sz="4" w:space="0" w:color="8FAADC"/>
+              <w:right w:val="single" w:sz="4" w:space="0" w:color="8FAADC"/>
+            </w:tcBorders>
+            <w:tcMar>
+              <w:top w:w="40" w:type="dxa"/>
+              <w:left w:w="60" w:type="dxa"/>
+              <w:bottom w:w="40" w:type="dxa"/>
+              <w:right w:w="60" w:type="dxa"/>
+            </w:tcMar>
+            <w:vAlign w:val="center"/>
+          </w:tcPr>
+          <w:p>
+            <w:pPr>
+              <w:spacing w:before="0" w:after="0" w:line="259" w:lineRule="auto"/>
+              <w:jc w:val="center"/>
+            </w:pPr>
+            <w:r/>
+            <w:r>
+              <w:rPr>
+                <w:rFonts w:ascii="Calibri" w:hAnsi="Calibri" w:eastAsia="宋体"/>
+                <w:b w:val="0"/>
+                <w:color w:val="2D2D2D"/>
+                <w:sz w:val="21"/>
+              </w:rPr>
+              <w:t>治疗</w:t>
+            </w:r>
+          </w:p>
+        </w:tc>
+        <w:tc>
+          <w:tcPr>
+            <w:tcW w:type="dxa" w:w="4876"/>
+            <w:tcBorders>
+              <w:top w:val="single" w:sz="4" w:space="0" w:color="8FAADC"/>
+              <w:left w:val="single" w:sz="4" w:space="0" w:color="8FAADC"/>
+              <w:bottom w:val="single" w:sz="4" w:space="0" w:color="8FAADC"/>
+              <w:right w:val="single" w:sz="4" w:space="0" w:color="8FAADC"/>
+            </w:tcBorders>
+            <w:tcMar>
+              <w:top w:w="40" w:type="dxa"/>
+              <w:left w:w="60" w:type="dxa"/>
+              <w:bottom w:w="40" w:type="dxa"/>
+              <w:right w:w="60" w:type="dxa"/>
+            </w:tcMar>
+            <w:vAlign w:val="center"/>
+          </w:tcPr>
+          <w:p>
+            <w:pPr>
+              <w:spacing w:before="0" w:after="0" w:line="259" w:lineRule="auto"/>
+              <w:jc w:val="left"/>
+            </w:pPr>
+            <w:r/>
+            <w:r>
+              <w:rPr>
+                <w:rFonts w:ascii="Calibri" w:hAnsi="Calibri" w:eastAsia="宋体"/>
+                <w:b w:val="0"/>
+                <w:color w:val="2D2D2D"/>
+                <w:sz w:val="21"/>
+              </w:rPr>
+              <w:t>恢复自己 2 点血量，下回合再恢复自己 2 点血量</w:t>
+            </w:r>
+          </w:p>
+        </w:tc>
+        <w:tc>
+          <w:tcPr>
+            <w:tcW w:type="dxa" w:w="4139"/>
+            <w:tcBorders>
+              <w:top w:val="single" w:sz="4" w:space="0" w:color="8FAADC"/>
+              <w:left w:val="single" w:sz="4" w:space="0" w:color="8FAADC"/>
+              <w:bottom w:val="single" w:sz="4" w:space="0" w:color="8FAADC"/>
+              <w:right w:val="single" w:sz="4" w:space="0" w:color="8FAADC"/>
+            </w:tcBorders>
+            <w:tcMar>
+              <w:top w:w="40" w:type="dxa"/>
+              <w:left w:w="60" w:type="dxa"/>
+              <w:bottom w:w="40" w:type="dxa"/>
+              <w:right w:w="60" w:type="dxa"/>
+            </w:tcMar>
+            <w:vAlign w:val="center"/>
+          </w:tcPr>
+          <w:p>
+            <w:pPr>
+              <w:spacing w:before="0" w:after="0" w:line="259" w:lineRule="auto"/>
+              <w:jc w:val="left"/>
+            </w:pPr>
+            <w:r/>
+            <w:r>
+              <w:rPr>
+                <w:rFonts w:ascii="Calibri" w:hAnsi="Calibri" w:eastAsia="宋体"/>
+                <w:b w:val="0"/>
+                <w:color w:val="2D2D2D"/>
+                <w:sz w:val="21"/>
+              </w:rPr>
+              <w:t>残灯回神：自奶分两拍；渔妇是任意目标 2+2。</w:t>
+            </w:r>
+          </w:p>
+        </w:tc>
+      </w:tr>
+      <w:tr>
+        <w:tc>
+          <w:tcPr>
+            <w:tcW w:type="dxa" w:w="1247"/>
+            <w:tcBorders>
+              <w:top w:val="single" w:sz="4" w:space="0" w:color="8FAADC"/>
+              <w:left w:val="single" w:sz="4" w:space="0" w:color="8FAADC"/>
+              <w:bottom w:val="single" w:sz="4" w:space="0" w:color="8FAADC"/>
+              <w:right w:val="single" w:sz="4" w:space="0" w:color="8FAADC"/>
+            </w:tcBorders>
+            <w:tcMar>
+              <w:top w:w="40" w:type="dxa"/>
+              <w:left w:w="60" w:type="dxa"/>
+              <w:bottom w:w="40" w:type="dxa"/>
+              <w:right w:w="60" w:type="dxa"/>
+            </w:tcMar>
+            <w:vAlign w:val="center"/>
+            <w:shd w:val="clear" w:color="auto" w:fill="F7FAFC"/>
+          </w:tcPr>
+          <w:p>
+            <w:pPr>
+              <w:spacing w:before="0" w:after="0" w:line="259" w:lineRule="auto"/>
+              <w:jc w:val="center"/>
+            </w:pPr>
+            <w:r/>
+            <w:r>
+              <w:rPr>
+                <w:rFonts w:ascii="Calibri" w:hAnsi="Calibri" w:eastAsia="宋体"/>
+                <w:b w:val="0"/>
+                <w:color w:val="2D2D2D"/>
+                <w:sz w:val="21"/>
+              </w:rPr>
+              <w:t>T-07</w:t>
+            </w:r>
+          </w:p>
+        </w:tc>
+        <w:tc>
+          <w:tcPr>
+            <w:tcW w:type="dxa" w:w="1474"/>
+            <w:tcBorders>
+              <w:top w:val="single" w:sz="4" w:space="0" w:color="8FAADC"/>
+              <w:left w:val="single" w:sz="4" w:space="0" w:color="8FAADC"/>
+              <w:bottom w:val="single" w:sz="4" w:space="0" w:color="8FAADC"/>
+              <w:right w:val="single" w:sz="4" w:space="0" w:color="8FAADC"/>
+            </w:tcBorders>
+            <w:tcMar>
+              <w:top w:w="40" w:type="dxa"/>
+              <w:left w:w="60" w:type="dxa"/>
+              <w:bottom w:w="40" w:type="dxa"/>
+              <w:right w:w="60" w:type="dxa"/>
+            </w:tcMar>
+            <w:vAlign w:val="center"/>
+            <w:shd w:val="clear" w:color="auto" w:fill="F7FAFC"/>
+          </w:tcPr>
+          <w:p>
+            <w:pPr>
+              <w:spacing w:before="0" w:after="0" w:line="259" w:lineRule="auto"/>
+              <w:jc w:val="left"/>
+            </w:pPr>
+            <w:r/>
+            <w:r>
+              <w:rPr>
+                <w:rFonts w:ascii="Calibri" w:hAnsi="Calibri" w:eastAsia="宋体"/>
+                <w:b w:val="0"/>
+                <w:color w:val="2D2D2D"/>
+                <w:sz w:val="21"/>
+              </w:rPr>
+              <w:t>望楼吏</w:t>
+            </w:r>
+          </w:p>
+        </w:tc>
+        <w:tc>
+          <w:tcPr>
+            <w:tcW w:type="dxa" w:w="850"/>
+            <w:tcBorders>
+              <w:top w:val="single" w:sz="4" w:space="0" w:color="8FAADC"/>
+              <w:left w:val="single" w:sz="4" w:space="0" w:color="8FAADC"/>
+              <w:bottom w:val="single" w:sz="4" w:space="0" w:color="8FAADC"/>
+              <w:right w:val="single" w:sz="4" w:space="0" w:color="8FAADC"/>
+            </w:tcBorders>
+            <w:tcMar>
+              <w:top w:w="40" w:type="dxa"/>
+              <w:left w:w="60" w:type="dxa"/>
+              <w:bottom w:w="40" w:type="dxa"/>
+              <w:right w:w="60" w:type="dxa"/>
+            </w:tcMar>
+            <w:vAlign w:val="center"/>
+            <w:shd w:val="clear" w:color="auto" w:fill="F7FAFC"/>
+          </w:tcPr>
+          <w:p>
+            <w:pPr>
+              <w:spacing w:before="0" w:after="0" w:line="259" w:lineRule="auto"/>
+              <w:jc w:val="center"/>
+            </w:pPr>
+            <w:r/>
+            <w:r>
+              <w:rPr>
+                <w:rFonts w:ascii="Calibri" w:hAnsi="Calibri" w:eastAsia="宋体"/>
+                <w:b w:val="0"/>
+                <w:color w:val="2D2D2D"/>
+                <w:sz w:val="21"/>
+              </w:rPr>
+              <w:t>1</w:t>
+            </w:r>
+          </w:p>
+        </w:tc>
+        <w:tc>
+          <w:tcPr>
+            <w:tcW w:type="dxa" w:w="1020"/>
+            <w:tcBorders>
+              <w:top w:val="single" w:sz="4" w:space="0" w:color="8FAADC"/>
+              <w:left w:val="single" w:sz="4" w:space="0" w:color="8FAADC"/>
+              <w:bottom w:val="single" w:sz="4" w:space="0" w:color="8FAADC"/>
+              <w:right w:val="single" w:sz="4" w:space="0" w:color="8FAADC"/>
+            </w:tcBorders>
+            <w:tcMar>
+              <w:top w:w="40" w:type="dxa"/>
+              <w:left w:w="60" w:type="dxa"/>
+              <w:bottom w:w="40" w:type="dxa"/>
+              <w:right w:w="60" w:type="dxa"/>
+            </w:tcMar>
+            <w:vAlign w:val="center"/>
+            <w:shd w:val="clear" w:color="auto" w:fill="F7FAFC"/>
+          </w:tcPr>
+          <w:p>
+            <w:pPr>
+              <w:spacing w:before="0" w:after="0" w:line="259" w:lineRule="auto"/>
+              <w:jc w:val="center"/>
+            </w:pPr>
+            <w:r/>
+            <w:r>
+              <w:rPr>
+                <w:rFonts w:ascii="Calibri" w:hAnsi="Calibri" w:eastAsia="宋体"/>
+                <w:b w:val="0"/>
+                <w:color w:val="2D2D2D"/>
+                <w:sz w:val="21"/>
+              </w:rPr>
+              <w:t>支援</w:t>
+            </w:r>
+          </w:p>
+        </w:tc>
+        <w:tc>
+          <w:tcPr>
+            <w:tcW w:type="dxa" w:w="4876"/>
+            <w:tcBorders>
+              <w:top w:val="single" w:sz="4" w:space="0" w:color="8FAADC"/>
+              <w:left w:val="single" w:sz="4" w:space="0" w:color="8FAADC"/>
+              <w:bottom w:val="single" w:sz="4" w:space="0" w:color="8FAADC"/>
+              <w:right w:val="single" w:sz="4" w:space="0" w:color="8FAADC"/>
+            </w:tcBorders>
+            <w:tcMar>
+              <w:top w:w="40" w:type="dxa"/>
+              <w:left w:w="60" w:type="dxa"/>
+              <w:bottom w:w="40" w:type="dxa"/>
+              <w:right w:w="60" w:type="dxa"/>
+            </w:tcMar>
+            <w:vAlign w:val="center"/>
+            <w:shd w:val="clear" w:color="auto" w:fill="F7FAFC"/>
+          </w:tcPr>
+          <w:p>
+            <w:pPr>
+              <w:spacing w:before="0" w:after="0" w:line="259" w:lineRule="auto"/>
+              <w:jc w:val="left"/>
+            </w:pPr>
+            <w:r/>
+            <w:r>
+              <w:rPr>
+                <w:rFonts w:ascii="Calibri" w:hAnsi="Calibri" w:eastAsia="宋体"/>
+                <w:b w:val="0"/>
+                <w:color w:val="2D2D2D"/>
+                <w:sz w:val="21"/>
+              </w:rPr>
+              <w:t>抽 1 张牌，下回合为自己增加 2 点防御</w:t>
+            </w:r>
+          </w:p>
+        </w:tc>
+        <w:tc>
+          <w:tcPr>
+            <w:tcW w:type="dxa" w:w="4139"/>
+            <w:tcBorders>
+              <w:top w:val="single" w:sz="4" w:space="0" w:color="8FAADC"/>
+              <w:left w:val="single" w:sz="4" w:space="0" w:color="8FAADC"/>
+              <w:bottom w:val="single" w:sz="4" w:space="0" w:color="8FAADC"/>
+              <w:right w:val="single" w:sz="4" w:space="0" w:color="8FAADC"/>
+            </w:tcBorders>
+            <w:tcMar>
+              <w:top w:w="40" w:type="dxa"/>
+              <w:left w:w="60" w:type="dxa"/>
+              <w:bottom w:w="40" w:type="dxa"/>
+              <w:right w:w="60" w:type="dxa"/>
+            </w:tcMar>
+            <w:vAlign w:val="center"/>
+            <w:shd w:val="clear" w:color="auto" w:fill="F7FAFC"/>
+          </w:tcPr>
+          <w:p>
+            <w:pPr>
+              <w:spacing w:before="0" w:after="0" w:line="259" w:lineRule="auto"/>
+              <w:jc w:val="left"/>
+            </w:pPr>
+            <w:r/>
+            <w:r>
+              <w:rPr>
+                <w:rFonts w:ascii="Calibri" w:hAnsi="Calibri" w:eastAsia="宋体"/>
+                <w:b w:val="0"/>
+                <w:color w:val="2D2D2D"/>
+                <w:sz w:val="21"/>
+              </w:rPr>
+              <w:t>先望再守：现抽 + 下回合自盾 2；典选官是现抽现自盾 1。</w:t>
             </w:r>
           </w:p>
         </w:tc>
@@ -3501,7 +6321,7 @@
                 <w:color w:val="2D2D2D"/>
                 <w:sz w:val="21"/>
               </w:rPr>
-              <w:t>新建第二版，收录自今日起新增卡。首张 B-08 花舫主；卡面胸部已打码。</w:t>
+              <w:t>新建第二版，收录自今日起新增卡。首张 B-08 花舫主。</w:t>
             </w:r>
           </w:p>
         </w:tc>
@@ -3642,6 +6462,286 @@
                 <w:sz w:val="21"/>
               </w:rPr>
               <w:t>「你的0来了」续收 Z-07～Z-12：亵衣浣手、双面龟奴、舔靴门客、跪香奴、红唇奉盏、鸨母强吻。</w:t>
+            </w:r>
+          </w:p>
+        </w:tc>
+      </w:tr>
+      <w:tr>
+        <w:tc>
+          <w:tcPr>
+            <w:tcW w:type="dxa" w:w="7126"/>
+            <w:tcBorders>
+              <w:top w:val="single" w:sz="4" w:space="0" w:color="8FAADC"/>
+              <w:left w:val="single" w:sz="4" w:space="0" w:color="8FAADC"/>
+              <w:bottom w:val="single" w:sz="4" w:space="0" w:color="8FAADC"/>
+              <w:right w:val="single" w:sz="4" w:space="0" w:color="8FAADC"/>
+            </w:tcBorders>
+            <w:tcMar>
+              <w:top w:w="40" w:type="dxa"/>
+              <w:left w:w="60" w:type="dxa"/>
+              <w:bottom w:w="40" w:type="dxa"/>
+              <w:right w:w="60" w:type="dxa"/>
+            </w:tcMar>
+            <w:vAlign w:val="center"/>
+          </w:tcPr>
+          <w:p>
+            <w:pPr>
+              <w:spacing w:before="0" w:after="0" w:line="259" w:lineRule="auto"/>
+              <w:jc w:val="center"/>
+            </w:pPr>
+            <w:r/>
+            <w:r>
+              <w:rPr>
+                <w:rFonts w:ascii="Calibri" w:hAnsi="Calibri" w:eastAsia="宋体"/>
+                <w:b w:val="0"/>
+                <w:color w:val="2D2D2D"/>
+                <w:sz w:val="21"/>
+              </w:rPr>
+              <w:t>2026-08-24</w:t>
+            </w:r>
+          </w:p>
+        </w:tc>
+        <w:tc>
+          <w:tcPr>
+            <w:tcW w:type="dxa" w:w="7126"/>
+            <w:tcBorders>
+              <w:top w:val="single" w:sz="4" w:space="0" w:color="8FAADC"/>
+              <w:left w:val="single" w:sz="4" w:space="0" w:color="8FAADC"/>
+              <w:bottom w:val="single" w:sz="4" w:space="0" w:color="8FAADC"/>
+              <w:right w:val="single" w:sz="4" w:space="0" w:color="8FAADC"/>
+            </w:tcBorders>
+            <w:tcMar>
+              <w:top w:w="40" w:type="dxa"/>
+              <w:left w:w="60" w:type="dxa"/>
+              <w:bottom w:w="40" w:type="dxa"/>
+              <w:right w:w="60" w:type="dxa"/>
+            </w:tcMar>
+            <w:vAlign w:val="center"/>
+          </w:tcPr>
+          <w:p>
+            <w:pPr>
+              <w:spacing w:before="0" w:after="0" w:line="259" w:lineRule="auto"/>
+              <w:jc w:val="left"/>
+            </w:pPr>
+            <w:r/>
+            <w:r>
+              <w:rPr>
+                <w:rFonts w:ascii="Calibri" w:hAnsi="Calibri" w:eastAsia="宋体"/>
+                <w:b w:val="0"/>
+                <w:color w:val="2D2D2D"/>
+                <w:sz w:val="21"/>
+              </w:rPr>
+              <w:t>花舫主卡面按实拍笑容重绘，动作改为持扇立姿。</w:t>
+            </w:r>
+          </w:p>
+        </w:tc>
+      </w:tr>
+      <w:tr>
+        <w:tc>
+          <w:tcPr>
+            <w:tcW w:type="dxa" w:w="7126"/>
+            <w:tcBorders>
+              <w:top w:val="single" w:sz="4" w:space="0" w:color="8FAADC"/>
+              <w:left w:val="single" w:sz="4" w:space="0" w:color="8FAADC"/>
+              <w:bottom w:val="single" w:sz="4" w:space="0" w:color="8FAADC"/>
+              <w:right w:val="single" w:sz="4" w:space="0" w:color="8FAADC"/>
+            </w:tcBorders>
+            <w:tcMar>
+              <w:top w:w="40" w:type="dxa"/>
+              <w:left w:w="60" w:type="dxa"/>
+              <w:bottom w:w="40" w:type="dxa"/>
+              <w:right w:w="60" w:type="dxa"/>
+            </w:tcMar>
+            <w:vAlign w:val="center"/>
+          </w:tcPr>
+          <w:p>
+            <w:pPr>
+              <w:spacing w:before="0" w:after="0" w:line="259" w:lineRule="auto"/>
+              <w:jc w:val="center"/>
+            </w:pPr>
+            <w:r/>
+            <w:r>
+              <w:rPr>
+                <w:rFonts w:ascii="Calibri" w:hAnsi="Calibri" w:eastAsia="宋体"/>
+                <w:b w:val="0"/>
+                <w:color w:val="2D2D2D"/>
+                <w:sz w:val="21"/>
+              </w:rPr>
+              <w:t>2026-08-25</w:t>
+            </w:r>
+          </w:p>
+        </w:tc>
+        <w:tc>
+          <w:tcPr>
+            <w:tcW w:type="dxa" w:w="7126"/>
+            <w:tcBorders>
+              <w:top w:val="single" w:sz="4" w:space="0" w:color="8FAADC"/>
+              <w:left w:val="single" w:sz="4" w:space="0" w:color="8FAADC"/>
+              <w:bottom w:val="single" w:sz="4" w:space="0" w:color="8FAADC"/>
+              <w:right w:val="single" w:sz="4" w:space="0" w:color="8FAADC"/>
+            </w:tcBorders>
+            <w:tcMar>
+              <w:top w:w="40" w:type="dxa"/>
+              <w:left w:w="60" w:type="dxa"/>
+              <w:bottom w:w="40" w:type="dxa"/>
+              <w:right w:w="60" w:type="dxa"/>
+            </w:tcMar>
+            <w:vAlign w:val="center"/>
+          </w:tcPr>
+          <w:p>
+            <w:pPr>
+              <w:spacing w:before="0" w:after="0" w:line="259" w:lineRule="auto"/>
+              <w:jc w:val="left"/>
+            </w:pPr>
+            <w:r/>
+            <w:r>
+              <w:rPr>
+                <w:rFonts w:ascii="Calibri" w:hAnsi="Calibri" w:eastAsia="宋体"/>
+                <w:b w:val="0"/>
+                <w:color w:val="2D2D2D"/>
+                <w:sz w:val="21"/>
+              </w:rPr>
+              <w:t>新增 B-09 华辂主、B-10 会馆主、S-25 马帮客、S-26 山客、S-27 揽客商，不替换现有卡面。</w:t>
+            </w:r>
+          </w:p>
+        </w:tc>
+      </w:tr>
+      <w:tr>
+        <w:tc>
+          <w:tcPr>
+            <w:tcW w:type="dxa" w:w="7126"/>
+            <w:tcBorders>
+              <w:top w:val="single" w:sz="4" w:space="0" w:color="8FAADC"/>
+              <w:left w:val="single" w:sz="4" w:space="0" w:color="8FAADC"/>
+              <w:bottom w:val="single" w:sz="4" w:space="0" w:color="8FAADC"/>
+              <w:right w:val="single" w:sz="4" w:space="0" w:color="8FAADC"/>
+            </w:tcBorders>
+            <w:tcMar>
+              <w:top w:w="40" w:type="dxa"/>
+              <w:left w:w="60" w:type="dxa"/>
+              <w:bottom w:w="40" w:type="dxa"/>
+              <w:right w:w="60" w:type="dxa"/>
+            </w:tcMar>
+            <w:vAlign w:val="center"/>
+          </w:tcPr>
+          <w:p>
+            <w:pPr>
+              <w:spacing w:before="0" w:after="0" w:line="259" w:lineRule="auto"/>
+              <w:jc w:val="center"/>
+            </w:pPr>
+            <w:r/>
+            <w:r>
+              <w:rPr>
+                <w:rFonts w:ascii="Calibri" w:hAnsi="Calibri" w:eastAsia="宋体"/>
+                <w:b w:val="0"/>
+                <w:color w:val="2D2D2D"/>
+                <w:sz w:val="21"/>
+              </w:rPr>
+              <w:t>2026-08-25</w:t>
+            </w:r>
+          </w:p>
+        </w:tc>
+        <w:tc>
+          <w:tcPr>
+            <w:tcW w:type="dxa" w:w="7126"/>
+            <w:tcBorders>
+              <w:top w:val="single" w:sz="4" w:space="0" w:color="8FAADC"/>
+              <w:left w:val="single" w:sz="4" w:space="0" w:color="8FAADC"/>
+              <w:bottom w:val="single" w:sz="4" w:space="0" w:color="8FAADC"/>
+              <w:right w:val="single" w:sz="4" w:space="0" w:color="8FAADC"/>
+            </w:tcBorders>
+            <w:tcMar>
+              <w:top w:w="40" w:type="dxa"/>
+              <w:left w:w="60" w:type="dxa"/>
+              <w:bottom w:w="40" w:type="dxa"/>
+              <w:right w:w="60" w:type="dxa"/>
+            </w:tcMar>
+            <w:vAlign w:val="center"/>
+          </w:tcPr>
+          <w:p>
+            <w:pPr>
+              <w:spacing w:before="0" w:after="0" w:line="259" w:lineRule="auto"/>
+              <w:jc w:val="left"/>
+            </w:pPr>
+            <w:r/>
+            <w:r>
+              <w:rPr>
+                <w:rFonts w:ascii="Calibri" w:hAnsi="Calibri" w:eastAsia="宋体"/>
+                <w:b w:val="0"/>
+                <w:color w:val="2D2D2D"/>
+                <w:sz w:val="21"/>
+              </w:rPr>
+              <w:t>新增技术收藏卡 T-02 察微郎、T-03 覆面吏、T-04 浑仪生、T-05 司历官，不替换现有卡面。</w:t>
+            </w:r>
+          </w:p>
+        </w:tc>
+      </w:tr>
+      <w:tr>
+        <w:tc>
+          <w:tcPr>
+            <w:tcW w:type="dxa" w:w="7126"/>
+            <w:tcBorders>
+              <w:top w:val="single" w:sz="4" w:space="0" w:color="8FAADC"/>
+              <w:left w:val="single" w:sz="4" w:space="0" w:color="8FAADC"/>
+              <w:bottom w:val="single" w:sz="4" w:space="0" w:color="8FAADC"/>
+              <w:right w:val="single" w:sz="4" w:space="0" w:color="8FAADC"/>
+            </w:tcBorders>
+            <w:tcMar>
+              <w:top w:w="40" w:type="dxa"/>
+              <w:left w:w="60" w:type="dxa"/>
+              <w:bottom w:w="40" w:type="dxa"/>
+              <w:right w:w="60" w:type="dxa"/>
+            </w:tcMar>
+            <w:vAlign w:val="center"/>
+          </w:tcPr>
+          <w:p>
+            <w:pPr>
+              <w:spacing w:before="0" w:after="0" w:line="259" w:lineRule="auto"/>
+              <w:jc w:val="center"/>
+            </w:pPr>
+            <w:r/>
+            <w:r>
+              <w:rPr>
+                <w:rFonts w:ascii="Calibri" w:hAnsi="Calibri" w:eastAsia="宋体"/>
+                <w:b w:val="0"/>
+                <w:color w:val="2D2D2D"/>
+                <w:sz w:val="21"/>
+              </w:rPr>
+              <w:t>2026-08-25</w:t>
+            </w:r>
+          </w:p>
+        </w:tc>
+        <w:tc>
+          <w:tcPr>
+            <w:tcW w:type="dxa" w:w="7126"/>
+            <w:tcBorders>
+              <w:top w:val="single" w:sz="4" w:space="0" w:color="8FAADC"/>
+              <w:left w:val="single" w:sz="4" w:space="0" w:color="8FAADC"/>
+              <w:bottom w:val="single" w:sz="4" w:space="0" w:color="8FAADC"/>
+              <w:right w:val="single" w:sz="4" w:space="0" w:color="8FAADC"/>
+            </w:tcBorders>
+            <w:tcMar>
+              <w:top w:w="40" w:type="dxa"/>
+              <w:left w:w="60" w:type="dxa"/>
+              <w:bottom w:w="40" w:type="dxa"/>
+              <w:right w:w="60" w:type="dxa"/>
+            </w:tcMar>
+            <w:vAlign w:val="center"/>
+          </w:tcPr>
+          <w:p>
+            <w:pPr>
+              <w:spacing w:before="0" w:after="0" w:line="259" w:lineRule="auto"/>
+              <w:jc w:val="left"/>
+            </w:pPr>
+            <w:r/>
+            <w:r>
+              <w:rPr>
+                <w:rFonts w:ascii="Calibri" w:hAnsi="Calibri" w:eastAsia="宋体"/>
+                <w:b w:val="0"/>
+                <w:color w:val="2D2D2D"/>
+                <w:sz w:val="21"/>
+              </w:rPr>
+              <w:t>新增技术收藏卡 T-06 倦籍郎、T-07 望楼吏，不替换现有卡面。</w:t>
             </w:r>
           </w:p>
         </w:tc>

</xml_diff>

<commit_message>
Add medieval boss, sales, and purchase collectible cards.
Ship B-11~B-16, S-28~S-34, and P-21~P-25 with unique effects, restyle 察微郎 to painted art, and leave existing card faces unchanged.

Co-authored-by: Cursor <cursoragent@cursor.com>
</commit_message>
<xml_diff>
--- a/backend/mdFile/新卡牌专属效果（第二版）.docx
+++ b/backend/mdFile/新卡牌专属效果（第二版）.docx
@@ -985,6 +985,1260 @@
           </w:p>
         </w:tc>
       </w:tr>
+      <w:tr>
+        <w:tc>
+          <w:tcPr>
+            <w:tcW w:type="dxa" w:w="1247"/>
+            <w:tcBorders>
+              <w:top w:val="single" w:sz="4" w:space="0" w:color="8FAADC"/>
+              <w:left w:val="single" w:sz="4" w:space="0" w:color="8FAADC"/>
+              <w:bottom w:val="single" w:sz="4" w:space="0" w:color="8FAADC"/>
+              <w:right w:val="single" w:sz="4" w:space="0" w:color="8FAADC"/>
+            </w:tcBorders>
+            <w:tcMar>
+              <w:top w:w="40" w:type="dxa"/>
+              <w:left w:w="60" w:type="dxa"/>
+              <w:bottom w:w="40" w:type="dxa"/>
+              <w:right w:w="60" w:type="dxa"/>
+            </w:tcMar>
+            <w:vAlign w:val="center"/>
+            <w:shd w:val="clear" w:color="auto" w:fill="F7FAFC"/>
+          </w:tcPr>
+          <w:p>
+            <w:pPr>
+              <w:spacing w:before="0" w:after="0" w:line="259" w:lineRule="auto"/>
+              <w:jc w:val="center"/>
+            </w:pPr>
+            <w:r/>
+            <w:r>
+              <w:rPr>
+                <w:rFonts w:ascii="Calibri" w:hAnsi="Calibri" w:eastAsia="宋体"/>
+                <w:b w:val="0"/>
+                <w:color w:val="2D2D2D"/>
+                <w:sz w:val="21"/>
+              </w:rPr>
+              <w:t>B-11</w:t>
+            </w:r>
+          </w:p>
+        </w:tc>
+        <w:tc>
+          <w:tcPr>
+            <w:tcW w:type="dxa" w:w="1474"/>
+            <w:tcBorders>
+              <w:top w:val="single" w:sz="4" w:space="0" w:color="8FAADC"/>
+              <w:left w:val="single" w:sz="4" w:space="0" w:color="8FAADC"/>
+              <w:bottom w:val="single" w:sz="4" w:space="0" w:color="8FAADC"/>
+              <w:right w:val="single" w:sz="4" w:space="0" w:color="8FAADC"/>
+            </w:tcBorders>
+            <w:tcMar>
+              <w:top w:w="40" w:type="dxa"/>
+              <w:left w:w="60" w:type="dxa"/>
+              <w:bottom w:w="40" w:type="dxa"/>
+              <w:right w:w="60" w:type="dxa"/>
+            </w:tcMar>
+            <w:vAlign w:val="center"/>
+            <w:shd w:val="clear" w:color="auto" w:fill="F7FAFC"/>
+          </w:tcPr>
+          <w:p>
+            <w:pPr>
+              <w:spacing w:before="0" w:after="0" w:line="259" w:lineRule="auto"/>
+              <w:jc w:val="left"/>
+            </w:pPr>
+            <w:r/>
+            <w:r>
+              <w:rPr>
+                <w:rFonts w:ascii="Calibri" w:hAnsi="Calibri" w:eastAsia="宋体"/>
+                <w:b w:val="0"/>
+                <w:color w:val="2D2D2D"/>
+                <w:sz w:val="21"/>
+              </w:rPr>
+              <w:t>津梁主</w:t>
+            </w:r>
+          </w:p>
+        </w:tc>
+        <w:tc>
+          <w:tcPr>
+            <w:tcW w:type="dxa" w:w="850"/>
+            <w:tcBorders>
+              <w:top w:val="single" w:sz="4" w:space="0" w:color="8FAADC"/>
+              <w:left w:val="single" w:sz="4" w:space="0" w:color="8FAADC"/>
+              <w:bottom w:val="single" w:sz="4" w:space="0" w:color="8FAADC"/>
+              <w:right w:val="single" w:sz="4" w:space="0" w:color="8FAADC"/>
+            </w:tcBorders>
+            <w:tcMar>
+              <w:top w:w="40" w:type="dxa"/>
+              <w:left w:w="60" w:type="dxa"/>
+              <w:bottom w:w="40" w:type="dxa"/>
+              <w:right w:w="60" w:type="dxa"/>
+            </w:tcMar>
+            <w:vAlign w:val="center"/>
+            <w:shd w:val="clear" w:color="auto" w:fill="F7FAFC"/>
+          </w:tcPr>
+          <w:p>
+            <w:pPr>
+              <w:spacing w:before="0" w:after="0" w:line="259" w:lineRule="auto"/>
+              <w:jc w:val="center"/>
+            </w:pPr>
+            <w:r/>
+            <w:r>
+              <w:rPr>
+                <w:rFonts w:ascii="Calibri" w:hAnsi="Calibri" w:eastAsia="宋体"/>
+                <w:b w:val="0"/>
+                <w:color w:val="2D2D2D"/>
+                <w:sz w:val="21"/>
+              </w:rPr>
+              <w:t>2</w:t>
+            </w:r>
+          </w:p>
+        </w:tc>
+        <w:tc>
+          <w:tcPr>
+            <w:tcW w:type="dxa" w:w="1020"/>
+            <w:tcBorders>
+              <w:top w:val="single" w:sz="4" w:space="0" w:color="8FAADC"/>
+              <w:left w:val="single" w:sz="4" w:space="0" w:color="8FAADC"/>
+              <w:bottom w:val="single" w:sz="4" w:space="0" w:color="8FAADC"/>
+              <w:right w:val="single" w:sz="4" w:space="0" w:color="8FAADC"/>
+            </w:tcBorders>
+            <w:tcMar>
+              <w:top w:w="40" w:type="dxa"/>
+              <w:left w:w="60" w:type="dxa"/>
+              <w:bottom w:w="40" w:type="dxa"/>
+              <w:right w:w="60" w:type="dxa"/>
+            </w:tcMar>
+            <w:vAlign w:val="center"/>
+            <w:shd w:val="clear" w:color="auto" w:fill="F7FAFC"/>
+          </w:tcPr>
+          <w:p>
+            <w:pPr>
+              <w:spacing w:before="0" w:after="0" w:line="259" w:lineRule="auto"/>
+              <w:jc w:val="center"/>
+            </w:pPr>
+            <w:r/>
+            <w:r>
+              <w:rPr>
+                <w:rFonts w:ascii="Calibri" w:hAnsi="Calibri" w:eastAsia="宋体"/>
+                <w:b w:val="0"/>
+                <w:color w:val="2D2D2D"/>
+                <w:sz w:val="21"/>
+              </w:rPr>
+              <w:t>支援</w:t>
+            </w:r>
+          </w:p>
+        </w:tc>
+        <w:tc>
+          <w:tcPr>
+            <w:tcW w:type="dxa" w:w="4876"/>
+            <w:tcBorders>
+              <w:top w:val="single" w:sz="4" w:space="0" w:color="8FAADC"/>
+              <w:left w:val="single" w:sz="4" w:space="0" w:color="8FAADC"/>
+              <w:bottom w:val="single" w:sz="4" w:space="0" w:color="8FAADC"/>
+              <w:right w:val="single" w:sz="4" w:space="0" w:color="8FAADC"/>
+            </w:tcBorders>
+            <w:tcMar>
+              <w:top w:w="40" w:type="dxa"/>
+              <w:left w:w="60" w:type="dxa"/>
+              <w:bottom w:w="40" w:type="dxa"/>
+              <w:right w:w="60" w:type="dxa"/>
+            </w:tcMar>
+            <w:vAlign w:val="center"/>
+            <w:shd w:val="clear" w:color="auto" w:fill="F7FAFC"/>
+          </w:tcPr>
+          <w:p>
+            <w:pPr>
+              <w:spacing w:before="0" w:after="0" w:line="259" w:lineRule="auto"/>
+              <w:jc w:val="left"/>
+            </w:pPr>
+            <w:r/>
+            <w:r>
+              <w:rPr>
+                <w:rFonts w:ascii="Calibri" w:hAnsi="Calibri" w:eastAsia="宋体"/>
+                <w:b w:val="0"/>
+                <w:color w:val="2D2D2D"/>
+                <w:sz w:val="21"/>
+              </w:rPr>
+              <w:t>双方各增加 1 点调用机会，并恢复一名玩家 3 点血量</w:t>
+            </w:r>
+          </w:p>
+        </w:tc>
+        <w:tc>
+          <w:tcPr>
+            <w:tcW w:type="dxa" w:w="4139"/>
+            <w:tcBorders>
+              <w:top w:val="single" w:sz="4" w:space="0" w:color="8FAADC"/>
+              <w:left w:val="single" w:sz="4" w:space="0" w:color="8FAADC"/>
+              <w:bottom w:val="single" w:sz="4" w:space="0" w:color="8FAADC"/>
+              <w:right w:val="single" w:sz="4" w:space="0" w:color="8FAADC"/>
+            </w:tcBorders>
+            <w:tcMar>
+              <w:top w:w="40" w:type="dxa"/>
+              <w:left w:w="60" w:type="dxa"/>
+              <w:bottom w:w="40" w:type="dxa"/>
+              <w:right w:w="60" w:type="dxa"/>
+            </w:tcMar>
+            <w:vAlign w:val="center"/>
+            <w:shd w:val="clear" w:color="auto" w:fill="F7FAFC"/>
+          </w:tcPr>
+          <w:p>
+            <w:pPr>
+              <w:spacing w:before="0" w:after="0" w:line="259" w:lineRule="auto"/>
+              <w:jc w:val="left"/>
+            </w:pPr>
+            <w:r/>
+            <w:r>
+              <w:rPr>
+                <w:rFonts w:ascii="Calibri" w:hAnsi="Calibri" w:eastAsia="宋体"/>
+                <w:b w:val="0"/>
+                <w:color w:val="2D2D2D"/>
+                <w:sz w:val="21"/>
+              </w:rPr>
+              <w:t>渡口祈福：猎场主是双调用+伤 3，这里改成双调用+任意奶 3；酒庄主是任意奶 3+双盾。举手礼势。</w:t>
+            </w:r>
+          </w:p>
+        </w:tc>
+      </w:tr>
+      <w:tr>
+        <w:tc>
+          <w:tcPr>
+            <w:tcW w:type="dxa" w:w="1247"/>
+            <w:tcBorders>
+              <w:top w:val="single" w:sz="4" w:space="0" w:color="8FAADC"/>
+              <w:left w:val="single" w:sz="4" w:space="0" w:color="8FAADC"/>
+              <w:bottom w:val="single" w:sz="4" w:space="0" w:color="8FAADC"/>
+              <w:right w:val="single" w:sz="4" w:space="0" w:color="8FAADC"/>
+            </w:tcBorders>
+            <w:tcMar>
+              <w:top w:w="40" w:type="dxa"/>
+              <w:left w:w="60" w:type="dxa"/>
+              <w:bottom w:w="40" w:type="dxa"/>
+              <w:right w:w="60" w:type="dxa"/>
+            </w:tcMar>
+            <w:vAlign w:val="center"/>
+          </w:tcPr>
+          <w:p>
+            <w:pPr>
+              <w:spacing w:before="0" w:after="0" w:line="259" w:lineRule="auto"/>
+              <w:jc w:val="center"/>
+            </w:pPr>
+            <w:r/>
+            <w:r>
+              <w:rPr>
+                <w:rFonts w:ascii="Calibri" w:hAnsi="Calibri" w:eastAsia="宋体"/>
+                <w:b w:val="0"/>
+                <w:color w:val="2D2D2D"/>
+                <w:sz w:val="21"/>
+              </w:rPr>
+              <w:t>B-12</w:t>
+            </w:r>
+          </w:p>
+        </w:tc>
+        <w:tc>
+          <w:tcPr>
+            <w:tcW w:type="dxa" w:w="1474"/>
+            <w:tcBorders>
+              <w:top w:val="single" w:sz="4" w:space="0" w:color="8FAADC"/>
+              <w:left w:val="single" w:sz="4" w:space="0" w:color="8FAADC"/>
+              <w:bottom w:val="single" w:sz="4" w:space="0" w:color="8FAADC"/>
+              <w:right w:val="single" w:sz="4" w:space="0" w:color="8FAADC"/>
+            </w:tcBorders>
+            <w:tcMar>
+              <w:top w:w="40" w:type="dxa"/>
+              <w:left w:w="60" w:type="dxa"/>
+              <w:bottom w:w="40" w:type="dxa"/>
+              <w:right w:w="60" w:type="dxa"/>
+            </w:tcMar>
+            <w:vAlign w:val="center"/>
+          </w:tcPr>
+          <w:p>
+            <w:pPr>
+              <w:spacing w:before="0" w:after="0" w:line="259" w:lineRule="auto"/>
+              <w:jc w:val="left"/>
+            </w:pPr>
+            <w:r/>
+            <w:r>
+              <w:rPr>
+                <w:rFonts w:ascii="Calibri" w:hAnsi="Calibri" w:eastAsia="宋体"/>
+                <w:b w:val="0"/>
+                <w:color w:val="2D2D2D"/>
+                <w:sz w:val="21"/>
+              </w:rPr>
+              <w:t>津埠主</w:t>
+            </w:r>
+          </w:p>
+        </w:tc>
+        <w:tc>
+          <w:tcPr>
+            <w:tcW w:type="dxa" w:w="850"/>
+            <w:tcBorders>
+              <w:top w:val="single" w:sz="4" w:space="0" w:color="8FAADC"/>
+              <w:left w:val="single" w:sz="4" w:space="0" w:color="8FAADC"/>
+              <w:bottom w:val="single" w:sz="4" w:space="0" w:color="8FAADC"/>
+              <w:right w:val="single" w:sz="4" w:space="0" w:color="8FAADC"/>
+            </w:tcBorders>
+            <w:tcMar>
+              <w:top w:w="40" w:type="dxa"/>
+              <w:left w:w="60" w:type="dxa"/>
+              <w:bottom w:w="40" w:type="dxa"/>
+              <w:right w:w="60" w:type="dxa"/>
+            </w:tcMar>
+            <w:vAlign w:val="center"/>
+          </w:tcPr>
+          <w:p>
+            <w:pPr>
+              <w:spacing w:before="0" w:after="0" w:line="259" w:lineRule="auto"/>
+              <w:jc w:val="center"/>
+            </w:pPr>
+            <w:r/>
+            <w:r>
+              <w:rPr>
+                <w:rFonts w:ascii="Calibri" w:hAnsi="Calibri" w:eastAsia="宋体"/>
+                <w:b w:val="0"/>
+                <w:color w:val="2D2D2D"/>
+                <w:sz w:val="21"/>
+              </w:rPr>
+              <w:t>2</w:t>
+            </w:r>
+          </w:p>
+        </w:tc>
+        <w:tc>
+          <w:tcPr>
+            <w:tcW w:type="dxa" w:w="1020"/>
+            <w:tcBorders>
+              <w:top w:val="single" w:sz="4" w:space="0" w:color="8FAADC"/>
+              <w:left w:val="single" w:sz="4" w:space="0" w:color="8FAADC"/>
+              <w:bottom w:val="single" w:sz="4" w:space="0" w:color="8FAADC"/>
+              <w:right w:val="single" w:sz="4" w:space="0" w:color="8FAADC"/>
+            </w:tcBorders>
+            <w:tcMar>
+              <w:top w:w="40" w:type="dxa"/>
+              <w:left w:w="60" w:type="dxa"/>
+              <w:bottom w:w="40" w:type="dxa"/>
+              <w:right w:w="60" w:type="dxa"/>
+            </w:tcMar>
+            <w:vAlign w:val="center"/>
+          </w:tcPr>
+          <w:p>
+            <w:pPr>
+              <w:spacing w:before="0" w:after="0" w:line="259" w:lineRule="auto"/>
+              <w:jc w:val="center"/>
+            </w:pPr>
+            <w:r/>
+            <w:r>
+              <w:rPr>
+                <w:rFonts w:ascii="Calibri" w:hAnsi="Calibri" w:eastAsia="宋体"/>
+                <w:b w:val="0"/>
+                <w:color w:val="2D2D2D"/>
+                <w:sz w:val="21"/>
+              </w:rPr>
+              <w:t>治疗</w:t>
+            </w:r>
+          </w:p>
+        </w:tc>
+        <w:tc>
+          <w:tcPr>
+            <w:tcW w:type="dxa" w:w="4876"/>
+            <w:tcBorders>
+              <w:top w:val="single" w:sz="4" w:space="0" w:color="8FAADC"/>
+              <w:left w:val="single" w:sz="4" w:space="0" w:color="8FAADC"/>
+              <w:bottom w:val="single" w:sz="4" w:space="0" w:color="8FAADC"/>
+              <w:right w:val="single" w:sz="4" w:space="0" w:color="8FAADC"/>
+            </w:tcBorders>
+            <w:tcMar>
+              <w:top w:w="40" w:type="dxa"/>
+              <w:left w:w="60" w:type="dxa"/>
+              <w:bottom w:w="40" w:type="dxa"/>
+              <w:right w:w="60" w:type="dxa"/>
+            </w:tcMar>
+            <w:vAlign w:val="center"/>
+          </w:tcPr>
+          <w:p>
+            <w:pPr>
+              <w:spacing w:before="0" w:after="0" w:line="259" w:lineRule="auto"/>
+              <w:jc w:val="left"/>
+            </w:pPr>
+            <w:r/>
+            <w:r>
+              <w:rPr>
+                <w:rFonts w:ascii="Calibri" w:hAnsi="Calibri" w:eastAsia="宋体"/>
+                <w:b w:val="0"/>
+                <w:color w:val="2D2D2D"/>
+                <w:sz w:val="21"/>
+              </w:rPr>
+              <w:t>双方各恢复 1 点血量，下回合再各恢复 2 点血量</w:t>
+            </w:r>
+          </w:p>
+        </w:tc>
+        <w:tc>
+          <w:tcPr>
+            <w:tcW w:type="dxa" w:w="4139"/>
+            <w:tcBorders>
+              <w:top w:val="single" w:sz="4" w:space="0" w:color="8FAADC"/>
+              <w:left w:val="single" w:sz="4" w:space="0" w:color="8FAADC"/>
+              <w:bottom w:val="single" w:sz="4" w:space="0" w:color="8FAADC"/>
+              <w:right w:val="single" w:sz="4" w:space="0" w:color="8FAADC"/>
+            </w:tcBorders>
+            <w:tcMar>
+              <w:top w:w="40" w:type="dxa"/>
+              <w:left w:w="60" w:type="dxa"/>
+              <w:bottom w:w="40" w:type="dxa"/>
+              <w:right w:w="60" w:type="dxa"/>
+            </w:tcMar>
+            <w:vAlign w:val="center"/>
+          </w:tcPr>
+          <w:p>
+            <w:pPr>
+              <w:spacing w:before="0" w:after="0" w:line="259" w:lineRule="auto"/>
+              <w:jc w:val="left"/>
+            </w:pPr>
+            <w:r/>
+            <w:r>
+              <w:rPr>
+                <w:rFonts w:ascii="Calibri" w:hAnsi="Calibri" w:eastAsia="宋体"/>
+                <w:b w:val="0"/>
+                <w:color w:val="2D2D2D"/>
+                <w:sz w:val="21"/>
+              </w:rPr>
+              <w:t>津头回航：全场奶分两拍，总量 6；乐师是立即双奶 2，渔妇是任意目标 2+2。</w:t>
+            </w:r>
+          </w:p>
+        </w:tc>
+      </w:tr>
+      <w:tr>
+        <w:tc>
+          <w:tcPr>
+            <w:tcW w:type="dxa" w:w="1247"/>
+            <w:tcBorders>
+              <w:top w:val="single" w:sz="4" w:space="0" w:color="8FAADC"/>
+              <w:left w:val="single" w:sz="4" w:space="0" w:color="8FAADC"/>
+              <w:bottom w:val="single" w:sz="4" w:space="0" w:color="8FAADC"/>
+              <w:right w:val="single" w:sz="4" w:space="0" w:color="8FAADC"/>
+            </w:tcBorders>
+            <w:tcMar>
+              <w:top w:w="40" w:type="dxa"/>
+              <w:left w:w="60" w:type="dxa"/>
+              <w:bottom w:w="40" w:type="dxa"/>
+              <w:right w:w="60" w:type="dxa"/>
+            </w:tcMar>
+            <w:vAlign w:val="center"/>
+            <w:shd w:val="clear" w:color="auto" w:fill="F7FAFC"/>
+          </w:tcPr>
+          <w:p>
+            <w:pPr>
+              <w:spacing w:before="0" w:after="0" w:line="259" w:lineRule="auto"/>
+              <w:jc w:val="center"/>
+            </w:pPr>
+            <w:r/>
+            <w:r>
+              <w:rPr>
+                <w:rFonts w:ascii="Calibri" w:hAnsi="Calibri" w:eastAsia="宋体"/>
+                <w:b w:val="0"/>
+                <w:color w:val="2D2D2D"/>
+                <w:sz w:val="21"/>
+              </w:rPr>
+              <w:t>B-13</w:t>
+            </w:r>
+          </w:p>
+        </w:tc>
+        <w:tc>
+          <w:tcPr>
+            <w:tcW w:type="dxa" w:w="1474"/>
+            <w:tcBorders>
+              <w:top w:val="single" w:sz="4" w:space="0" w:color="8FAADC"/>
+              <w:left w:val="single" w:sz="4" w:space="0" w:color="8FAADC"/>
+              <w:bottom w:val="single" w:sz="4" w:space="0" w:color="8FAADC"/>
+              <w:right w:val="single" w:sz="4" w:space="0" w:color="8FAADC"/>
+            </w:tcBorders>
+            <w:tcMar>
+              <w:top w:w="40" w:type="dxa"/>
+              <w:left w:w="60" w:type="dxa"/>
+              <w:bottom w:w="40" w:type="dxa"/>
+              <w:right w:w="60" w:type="dxa"/>
+            </w:tcMar>
+            <w:vAlign w:val="center"/>
+            <w:shd w:val="clear" w:color="auto" w:fill="F7FAFC"/>
+          </w:tcPr>
+          <w:p>
+            <w:pPr>
+              <w:spacing w:before="0" w:after="0" w:line="259" w:lineRule="auto"/>
+              <w:jc w:val="left"/>
+            </w:pPr>
+            <w:r/>
+            <w:r>
+              <w:rPr>
+                <w:rFonts w:ascii="Calibri" w:hAnsi="Calibri" w:eastAsia="宋体"/>
+                <w:b w:val="0"/>
+                <w:color w:val="2D2D2D"/>
+                <w:sz w:val="21"/>
+              </w:rPr>
+              <w:t>岭关主</w:t>
+            </w:r>
+          </w:p>
+        </w:tc>
+        <w:tc>
+          <w:tcPr>
+            <w:tcW w:type="dxa" w:w="850"/>
+            <w:tcBorders>
+              <w:top w:val="single" w:sz="4" w:space="0" w:color="8FAADC"/>
+              <w:left w:val="single" w:sz="4" w:space="0" w:color="8FAADC"/>
+              <w:bottom w:val="single" w:sz="4" w:space="0" w:color="8FAADC"/>
+              <w:right w:val="single" w:sz="4" w:space="0" w:color="8FAADC"/>
+            </w:tcBorders>
+            <w:tcMar>
+              <w:top w:w="40" w:type="dxa"/>
+              <w:left w:w="60" w:type="dxa"/>
+              <w:bottom w:w="40" w:type="dxa"/>
+              <w:right w:w="60" w:type="dxa"/>
+            </w:tcMar>
+            <w:vAlign w:val="center"/>
+            <w:shd w:val="clear" w:color="auto" w:fill="F7FAFC"/>
+          </w:tcPr>
+          <w:p>
+            <w:pPr>
+              <w:spacing w:before="0" w:after="0" w:line="259" w:lineRule="auto"/>
+              <w:jc w:val="center"/>
+            </w:pPr>
+            <w:r/>
+            <w:r>
+              <w:rPr>
+                <w:rFonts w:ascii="Calibri" w:hAnsi="Calibri" w:eastAsia="宋体"/>
+                <w:b w:val="0"/>
+                <w:color w:val="2D2D2D"/>
+                <w:sz w:val="21"/>
+              </w:rPr>
+              <w:t>3</w:t>
+            </w:r>
+          </w:p>
+        </w:tc>
+        <w:tc>
+          <w:tcPr>
+            <w:tcW w:type="dxa" w:w="1020"/>
+            <w:tcBorders>
+              <w:top w:val="single" w:sz="4" w:space="0" w:color="8FAADC"/>
+              <w:left w:val="single" w:sz="4" w:space="0" w:color="8FAADC"/>
+              <w:bottom w:val="single" w:sz="4" w:space="0" w:color="8FAADC"/>
+              <w:right w:val="single" w:sz="4" w:space="0" w:color="8FAADC"/>
+            </w:tcBorders>
+            <w:tcMar>
+              <w:top w:w="40" w:type="dxa"/>
+              <w:left w:w="60" w:type="dxa"/>
+              <w:bottom w:w="40" w:type="dxa"/>
+              <w:right w:w="60" w:type="dxa"/>
+            </w:tcMar>
+            <w:vAlign w:val="center"/>
+            <w:shd w:val="clear" w:color="auto" w:fill="F7FAFC"/>
+          </w:tcPr>
+          <w:p>
+            <w:pPr>
+              <w:spacing w:before="0" w:after="0" w:line="259" w:lineRule="auto"/>
+              <w:jc w:val="center"/>
+            </w:pPr>
+            <w:r/>
+            <w:r>
+              <w:rPr>
+                <w:rFonts w:ascii="Calibri" w:hAnsi="Calibri" w:eastAsia="宋体"/>
+                <w:b w:val="0"/>
+                <w:color w:val="2D2D2D"/>
+                <w:sz w:val="21"/>
+              </w:rPr>
+              <w:t>防御</w:t>
+            </w:r>
+          </w:p>
+        </w:tc>
+        <w:tc>
+          <w:tcPr>
+            <w:tcW w:type="dxa" w:w="4876"/>
+            <w:tcBorders>
+              <w:top w:val="single" w:sz="4" w:space="0" w:color="8FAADC"/>
+              <w:left w:val="single" w:sz="4" w:space="0" w:color="8FAADC"/>
+              <w:bottom w:val="single" w:sz="4" w:space="0" w:color="8FAADC"/>
+              <w:right w:val="single" w:sz="4" w:space="0" w:color="8FAADC"/>
+            </w:tcBorders>
+            <w:tcMar>
+              <w:top w:w="40" w:type="dxa"/>
+              <w:left w:w="60" w:type="dxa"/>
+              <w:bottom w:w="40" w:type="dxa"/>
+              <w:right w:w="60" w:type="dxa"/>
+            </w:tcMar>
+            <w:vAlign w:val="center"/>
+            <w:shd w:val="clear" w:color="auto" w:fill="F7FAFC"/>
+          </w:tcPr>
+          <w:p>
+            <w:pPr>
+              <w:spacing w:before="0" w:after="0" w:line="259" w:lineRule="auto"/>
+              <w:jc w:val="left"/>
+            </w:pPr>
+            <w:r/>
+            <w:r>
+              <w:rPr>
+                <w:rFonts w:ascii="Calibri" w:hAnsi="Calibri" w:eastAsia="宋体"/>
+                <w:b w:val="0"/>
+                <w:color w:val="2D2D2D"/>
+                <w:sz w:val="21"/>
+              </w:rPr>
+              <w:t>为自己增加 3 点防御，下回合双方各获得 3 点防御</w:t>
+            </w:r>
+          </w:p>
+        </w:tc>
+        <w:tc>
+          <w:tcPr>
+            <w:tcW w:type="dxa" w:w="4139"/>
+            <w:tcBorders>
+              <w:top w:val="single" w:sz="4" w:space="0" w:color="8FAADC"/>
+              <w:left w:val="single" w:sz="4" w:space="0" w:color="8FAADC"/>
+              <w:bottom w:val="single" w:sz="4" w:space="0" w:color="8FAADC"/>
+              <w:right w:val="single" w:sz="4" w:space="0" w:color="8FAADC"/>
+            </w:tcBorders>
+            <w:tcMar>
+              <w:top w:w="40" w:type="dxa"/>
+              <w:left w:w="60" w:type="dxa"/>
+              <w:bottom w:w="40" w:type="dxa"/>
+              <w:right w:w="60" w:type="dxa"/>
+            </w:tcMar>
+            <w:vAlign w:val="center"/>
+            <w:shd w:val="clear" w:color="auto" w:fill="F7FAFC"/>
+          </w:tcPr>
+          <w:p>
+            <w:pPr>
+              <w:spacing w:before="0" w:after="0" w:line="259" w:lineRule="auto"/>
+              <w:jc w:val="left"/>
+            </w:pPr>
+            <w:r/>
+            <w:r>
+              <w:rPr>
+                <w:rFonts w:ascii="Calibri" w:hAnsi="Calibri" w:eastAsia="宋体"/>
+                <w:b w:val="0"/>
+                <w:color w:val="2D2D2D"/>
+                <w:sz w:val="21"/>
+              </w:rPr>
+              <w:t>开关护岭：先自盾 3，下回合双盾 3；军需官是立即双盾 3，织工是双盾 1+1。半心手势迎客。</w:t>
+            </w:r>
+          </w:p>
+        </w:tc>
+      </w:tr>
+      <w:tr>
+        <w:tc>
+          <w:tcPr>
+            <w:tcW w:type="dxa" w:w="1247"/>
+            <w:tcBorders>
+              <w:top w:val="single" w:sz="4" w:space="0" w:color="8FAADC"/>
+              <w:left w:val="single" w:sz="4" w:space="0" w:color="8FAADC"/>
+              <w:bottom w:val="single" w:sz="4" w:space="0" w:color="8FAADC"/>
+              <w:right w:val="single" w:sz="4" w:space="0" w:color="8FAADC"/>
+            </w:tcBorders>
+            <w:tcMar>
+              <w:top w:w="40" w:type="dxa"/>
+              <w:left w:w="60" w:type="dxa"/>
+              <w:bottom w:w="40" w:type="dxa"/>
+              <w:right w:w="60" w:type="dxa"/>
+            </w:tcMar>
+            <w:vAlign w:val="center"/>
+          </w:tcPr>
+          <w:p>
+            <w:pPr>
+              <w:spacing w:before="0" w:after="0" w:line="259" w:lineRule="auto"/>
+              <w:jc w:val="center"/>
+            </w:pPr>
+            <w:r/>
+            <w:r>
+              <w:rPr>
+                <w:rFonts w:ascii="Calibri" w:hAnsi="Calibri" w:eastAsia="宋体"/>
+                <w:b w:val="0"/>
+                <w:color w:val="2D2D2D"/>
+                <w:sz w:val="21"/>
+              </w:rPr>
+              <w:t>B-14</w:t>
+            </w:r>
+          </w:p>
+        </w:tc>
+        <w:tc>
+          <w:tcPr>
+            <w:tcW w:type="dxa" w:w="1474"/>
+            <w:tcBorders>
+              <w:top w:val="single" w:sz="4" w:space="0" w:color="8FAADC"/>
+              <w:left w:val="single" w:sz="4" w:space="0" w:color="8FAADC"/>
+              <w:bottom w:val="single" w:sz="4" w:space="0" w:color="8FAADC"/>
+              <w:right w:val="single" w:sz="4" w:space="0" w:color="8FAADC"/>
+            </w:tcBorders>
+            <w:tcMar>
+              <w:top w:w="40" w:type="dxa"/>
+              <w:left w:w="60" w:type="dxa"/>
+              <w:bottom w:w="40" w:type="dxa"/>
+              <w:right w:w="60" w:type="dxa"/>
+            </w:tcMar>
+            <w:vAlign w:val="center"/>
+          </w:tcPr>
+          <w:p>
+            <w:pPr>
+              <w:spacing w:before="0" w:after="0" w:line="259" w:lineRule="auto"/>
+              <w:jc w:val="left"/>
+            </w:pPr>
+            <w:r/>
+            <w:r>
+              <w:rPr>
+                <w:rFonts w:ascii="Calibri" w:hAnsi="Calibri" w:eastAsia="宋体"/>
+                <w:b w:val="0"/>
+                <w:color w:val="2D2D2D"/>
+                <w:sz w:val="21"/>
+              </w:rPr>
+              <w:t>柜坊主</w:t>
+            </w:r>
+          </w:p>
+        </w:tc>
+        <w:tc>
+          <w:tcPr>
+            <w:tcW w:type="dxa" w:w="850"/>
+            <w:tcBorders>
+              <w:top w:val="single" w:sz="4" w:space="0" w:color="8FAADC"/>
+              <w:left w:val="single" w:sz="4" w:space="0" w:color="8FAADC"/>
+              <w:bottom w:val="single" w:sz="4" w:space="0" w:color="8FAADC"/>
+              <w:right w:val="single" w:sz="4" w:space="0" w:color="8FAADC"/>
+            </w:tcBorders>
+            <w:tcMar>
+              <w:top w:w="40" w:type="dxa"/>
+              <w:left w:w="60" w:type="dxa"/>
+              <w:bottom w:w="40" w:type="dxa"/>
+              <w:right w:w="60" w:type="dxa"/>
+            </w:tcMar>
+            <w:vAlign w:val="center"/>
+          </w:tcPr>
+          <w:p>
+            <w:pPr>
+              <w:spacing w:before="0" w:after="0" w:line="259" w:lineRule="auto"/>
+              <w:jc w:val="center"/>
+            </w:pPr>
+            <w:r/>
+            <w:r>
+              <w:rPr>
+                <w:rFonts w:ascii="Calibri" w:hAnsi="Calibri" w:eastAsia="宋体"/>
+                <w:b w:val="0"/>
+                <w:color w:val="2D2D2D"/>
+                <w:sz w:val="21"/>
+              </w:rPr>
+              <w:t>1</w:t>
+            </w:r>
+          </w:p>
+        </w:tc>
+        <w:tc>
+          <w:tcPr>
+            <w:tcW w:type="dxa" w:w="1020"/>
+            <w:tcBorders>
+              <w:top w:val="single" w:sz="4" w:space="0" w:color="8FAADC"/>
+              <w:left w:val="single" w:sz="4" w:space="0" w:color="8FAADC"/>
+              <w:bottom w:val="single" w:sz="4" w:space="0" w:color="8FAADC"/>
+              <w:right w:val="single" w:sz="4" w:space="0" w:color="8FAADC"/>
+            </w:tcBorders>
+            <w:tcMar>
+              <w:top w:w="40" w:type="dxa"/>
+              <w:left w:w="60" w:type="dxa"/>
+              <w:bottom w:w="40" w:type="dxa"/>
+              <w:right w:w="60" w:type="dxa"/>
+            </w:tcMar>
+            <w:vAlign w:val="center"/>
+          </w:tcPr>
+          <w:p>
+            <w:pPr>
+              <w:spacing w:before="0" w:after="0" w:line="259" w:lineRule="auto"/>
+              <w:jc w:val="center"/>
+            </w:pPr>
+            <w:r/>
+            <w:r>
+              <w:rPr>
+                <w:rFonts w:ascii="Calibri" w:hAnsi="Calibri" w:eastAsia="宋体"/>
+                <w:b w:val="0"/>
+                <w:color w:val="2D2D2D"/>
+                <w:sz w:val="21"/>
+              </w:rPr>
+              <w:t>支援</w:t>
+            </w:r>
+          </w:p>
+        </w:tc>
+        <w:tc>
+          <w:tcPr>
+            <w:tcW w:type="dxa" w:w="4876"/>
+            <w:tcBorders>
+              <w:top w:val="single" w:sz="4" w:space="0" w:color="8FAADC"/>
+              <w:left w:val="single" w:sz="4" w:space="0" w:color="8FAADC"/>
+              <w:bottom w:val="single" w:sz="4" w:space="0" w:color="8FAADC"/>
+              <w:right w:val="single" w:sz="4" w:space="0" w:color="8FAADC"/>
+            </w:tcBorders>
+            <w:tcMar>
+              <w:top w:w="40" w:type="dxa"/>
+              <w:left w:w="60" w:type="dxa"/>
+              <w:bottom w:w="40" w:type="dxa"/>
+              <w:right w:w="60" w:type="dxa"/>
+            </w:tcMar>
+            <w:vAlign w:val="center"/>
+          </w:tcPr>
+          <w:p>
+            <w:pPr>
+              <w:spacing w:before="0" w:after="0" w:line="259" w:lineRule="auto"/>
+              <w:jc w:val="left"/>
+            </w:pPr>
+            <w:r/>
+            <w:r>
+              <w:rPr>
+                <w:rFonts w:ascii="Calibri" w:hAnsi="Calibri" w:eastAsia="宋体"/>
+                <w:b w:val="0"/>
+                <w:color w:val="2D2D2D"/>
+                <w:sz w:val="21"/>
+              </w:rPr>
+              <w:t>抽 1 张牌，双方各获得 1 点防御，本回合霸凌者攻击 -1</w:t>
+            </w:r>
+          </w:p>
+        </w:tc>
+        <w:tc>
+          <w:tcPr>
+            <w:tcW w:type="dxa" w:w="4139"/>
+            <w:tcBorders>
+              <w:top w:val="single" w:sz="4" w:space="0" w:color="8FAADC"/>
+              <w:left w:val="single" w:sz="4" w:space="0" w:color="8FAADC"/>
+              <w:bottom w:val="single" w:sz="4" w:space="0" w:color="8FAADC"/>
+              <w:right w:val="single" w:sz="4" w:space="0" w:color="8FAADC"/>
+            </w:tcBorders>
+            <w:tcMar>
+              <w:top w:w="40" w:type="dxa"/>
+              <w:left w:w="60" w:type="dxa"/>
+              <w:bottom w:w="40" w:type="dxa"/>
+              <w:right w:w="60" w:type="dxa"/>
+            </w:tcMar>
+            <w:vAlign w:val="center"/>
+          </w:tcPr>
+          <w:p>
+            <w:pPr>
+              <w:spacing w:before="0" w:after="0" w:line="259" w:lineRule="auto"/>
+              <w:jc w:val="left"/>
+            </w:pPr>
+            <w:r/>
+            <w:r>
+              <w:rPr>
+                <w:rFonts w:ascii="Calibri" w:hAnsi="Calibri" w:eastAsia="宋体"/>
+                <w:b w:val="0"/>
+                <w:color w:val="2D2D2D"/>
+                <w:sz w:val="21"/>
+              </w:rPr>
+              <w:t>笑账压场：现抽+双盾 1+减攻 1；皮货采买是抽+减攻+自盾 2，东家是双奶+双盾+减攻。伏案交臂。</w:t>
+            </w:r>
+          </w:p>
+        </w:tc>
+      </w:tr>
+      <w:tr>
+        <w:tc>
+          <w:tcPr>
+            <w:tcW w:type="dxa" w:w="1247"/>
+            <w:tcBorders>
+              <w:top w:val="single" w:sz="4" w:space="0" w:color="8FAADC"/>
+              <w:left w:val="single" w:sz="4" w:space="0" w:color="8FAADC"/>
+              <w:bottom w:val="single" w:sz="4" w:space="0" w:color="8FAADC"/>
+              <w:right w:val="single" w:sz="4" w:space="0" w:color="8FAADC"/>
+            </w:tcBorders>
+            <w:tcMar>
+              <w:top w:w="40" w:type="dxa"/>
+              <w:left w:w="60" w:type="dxa"/>
+              <w:bottom w:w="40" w:type="dxa"/>
+              <w:right w:w="60" w:type="dxa"/>
+            </w:tcMar>
+            <w:vAlign w:val="center"/>
+            <w:shd w:val="clear" w:color="auto" w:fill="F7FAFC"/>
+          </w:tcPr>
+          <w:p>
+            <w:pPr>
+              <w:spacing w:before="0" w:after="0" w:line="259" w:lineRule="auto"/>
+              <w:jc w:val="center"/>
+            </w:pPr>
+            <w:r/>
+            <w:r>
+              <w:rPr>
+                <w:rFonts w:ascii="Calibri" w:hAnsi="Calibri" w:eastAsia="宋体"/>
+                <w:b w:val="0"/>
+                <w:color w:val="2D2D2D"/>
+                <w:sz w:val="21"/>
+              </w:rPr>
+              <w:t>B-15</w:t>
+            </w:r>
+          </w:p>
+        </w:tc>
+        <w:tc>
+          <w:tcPr>
+            <w:tcW w:type="dxa" w:w="1474"/>
+            <w:tcBorders>
+              <w:top w:val="single" w:sz="4" w:space="0" w:color="8FAADC"/>
+              <w:left w:val="single" w:sz="4" w:space="0" w:color="8FAADC"/>
+              <w:bottom w:val="single" w:sz="4" w:space="0" w:color="8FAADC"/>
+              <w:right w:val="single" w:sz="4" w:space="0" w:color="8FAADC"/>
+            </w:tcBorders>
+            <w:tcMar>
+              <w:top w:w="40" w:type="dxa"/>
+              <w:left w:w="60" w:type="dxa"/>
+              <w:bottom w:w="40" w:type="dxa"/>
+              <w:right w:w="60" w:type="dxa"/>
+            </w:tcMar>
+            <w:vAlign w:val="center"/>
+            <w:shd w:val="clear" w:color="auto" w:fill="F7FAFC"/>
+          </w:tcPr>
+          <w:p>
+            <w:pPr>
+              <w:spacing w:before="0" w:after="0" w:line="259" w:lineRule="auto"/>
+              <w:jc w:val="left"/>
+            </w:pPr>
+            <w:r/>
+            <w:r>
+              <w:rPr>
+                <w:rFonts w:ascii="Calibri" w:hAnsi="Calibri" w:eastAsia="宋体"/>
+                <w:b w:val="0"/>
+                <w:color w:val="2D2D2D"/>
+                <w:sz w:val="21"/>
+              </w:rPr>
+              <w:t>金帐主</w:t>
+            </w:r>
+          </w:p>
+        </w:tc>
+        <w:tc>
+          <w:tcPr>
+            <w:tcW w:type="dxa" w:w="850"/>
+            <w:tcBorders>
+              <w:top w:val="single" w:sz="4" w:space="0" w:color="8FAADC"/>
+              <w:left w:val="single" w:sz="4" w:space="0" w:color="8FAADC"/>
+              <w:bottom w:val="single" w:sz="4" w:space="0" w:color="8FAADC"/>
+              <w:right w:val="single" w:sz="4" w:space="0" w:color="8FAADC"/>
+            </w:tcBorders>
+            <w:tcMar>
+              <w:top w:w="40" w:type="dxa"/>
+              <w:left w:w="60" w:type="dxa"/>
+              <w:bottom w:w="40" w:type="dxa"/>
+              <w:right w:w="60" w:type="dxa"/>
+            </w:tcMar>
+            <w:vAlign w:val="center"/>
+            <w:shd w:val="clear" w:color="auto" w:fill="F7FAFC"/>
+          </w:tcPr>
+          <w:p>
+            <w:pPr>
+              <w:spacing w:before="0" w:after="0" w:line="259" w:lineRule="auto"/>
+              <w:jc w:val="center"/>
+            </w:pPr>
+            <w:r/>
+            <w:r>
+              <w:rPr>
+                <w:rFonts w:ascii="Calibri" w:hAnsi="Calibri" w:eastAsia="宋体"/>
+                <w:b w:val="0"/>
+                <w:color w:val="2D2D2D"/>
+                <w:sz w:val="21"/>
+              </w:rPr>
+              <w:t>3</w:t>
+            </w:r>
+          </w:p>
+        </w:tc>
+        <w:tc>
+          <w:tcPr>
+            <w:tcW w:type="dxa" w:w="1020"/>
+            <w:tcBorders>
+              <w:top w:val="single" w:sz="4" w:space="0" w:color="8FAADC"/>
+              <w:left w:val="single" w:sz="4" w:space="0" w:color="8FAADC"/>
+              <w:bottom w:val="single" w:sz="4" w:space="0" w:color="8FAADC"/>
+              <w:right w:val="single" w:sz="4" w:space="0" w:color="8FAADC"/>
+            </w:tcBorders>
+            <w:tcMar>
+              <w:top w:w="40" w:type="dxa"/>
+              <w:left w:w="60" w:type="dxa"/>
+              <w:bottom w:w="40" w:type="dxa"/>
+              <w:right w:w="60" w:type="dxa"/>
+            </w:tcMar>
+            <w:vAlign w:val="center"/>
+            <w:shd w:val="clear" w:color="auto" w:fill="F7FAFC"/>
+          </w:tcPr>
+          <w:p>
+            <w:pPr>
+              <w:spacing w:before="0" w:after="0" w:line="259" w:lineRule="auto"/>
+              <w:jc w:val="center"/>
+            </w:pPr>
+            <w:r/>
+            <w:r>
+              <w:rPr>
+                <w:rFonts w:ascii="Calibri" w:hAnsi="Calibri" w:eastAsia="宋体"/>
+                <w:b w:val="0"/>
+                <w:color w:val="2D2D2D"/>
+                <w:sz w:val="21"/>
+              </w:rPr>
+              <w:t>攻击</w:t>
+            </w:r>
+          </w:p>
+        </w:tc>
+        <w:tc>
+          <w:tcPr>
+            <w:tcW w:type="dxa" w:w="4876"/>
+            <w:tcBorders>
+              <w:top w:val="single" w:sz="4" w:space="0" w:color="8FAADC"/>
+              <w:left w:val="single" w:sz="4" w:space="0" w:color="8FAADC"/>
+              <w:bottom w:val="single" w:sz="4" w:space="0" w:color="8FAADC"/>
+              <w:right w:val="single" w:sz="4" w:space="0" w:color="8FAADC"/>
+            </w:tcBorders>
+            <w:tcMar>
+              <w:top w:w="40" w:type="dxa"/>
+              <w:left w:w="60" w:type="dxa"/>
+              <w:bottom w:w="40" w:type="dxa"/>
+              <w:right w:w="60" w:type="dxa"/>
+            </w:tcMar>
+            <w:vAlign w:val="center"/>
+            <w:shd w:val="clear" w:color="auto" w:fill="F7FAFC"/>
+          </w:tcPr>
+          <w:p>
+            <w:pPr>
+              <w:spacing w:before="0" w:after="0" w:line="259" w:lineRule="auto"/>
+              <w:jc w:val="left"/>
+            </w:pPr>
+            <w:r/>
+            <w:r>
+              <w:rPr>
+                <w:rFonts w:ascii="Calibri" w:hAnsi="Calibri" w:eastAsia="宋体"/>
+                <w:b w:val="0"/>
+                <w:color w:val="2D2D2D"/>
+                <w:sz w:val="21"/>
+              </w:rPr>
+              <w:t>立即造成 5 点伤害，本回合员工调用机会 +1，并为自己增加 2 点防御</w:t>
+            </w:r>
+          </w:p>
+        </w:tc>
+        <w:tc>
+          <w:tcPr>
+            <w:tcW w:type="dxa" w:w="4139"/>
+            <w:tcBorders>
+              <w:top w:val="single" w:sz="4" w:space="0" w:color="8FAADC"/>
+              <w:left w:val="single" w:sz="4" w:space="0" w:color="8FAADC"/>
+              <w:bottom w:val="single" w:sz="4" w:space="0" w:color="8FAADC"/>
+              <w:right w:val="single" w:sz="4" w:space="0" w:color="8FAADC"/>
+            </w:tcBorders>
+            <w:tcMar>
+              <w:top w:w="40" w:type="dxa"/>
+              <w:left w:w="60" w:type="dxa"/>
+              <w:bottom w:w="40" w:type="dxa"/>
+              <w:right w:w="60" w:type="dxa"/>
+            </w:tcMar>
+            <w:vAlign w:val="center"/>
+            <w:shd w:val="clear" w:color="auto" w:fill="F7FAFC"/>
+          </w:tcPr>
+          <w:p>
+            <w:pPr>
+              <w:spacing w:before="0" w:after="0" w:line="259" w:lineRule="auto"/>
+              <w:jc w:val="left"/>
+            </w:pPr>
+            <w:r/>
+            <w:r>
+              <w:rPr>
+                <w:rFonts w:ascii="Calibri" w:hAnsi="Calibri" w:eastAsia="宋体"/>
+                <w:b w:val="0"/>
+                <w:color w:val="2D2D2D"/>
+                <w:sz w:val="21"/>
+              </w:rPr>
+              <w:t>金帐号令：伤 5+自调用+自盾 2，同费约 8；领主是伤 5 双盾 2，花舫主是伤 4 自奶 2。叉腰金氅。</w:t>
+            </w:r>
+          </w:p>
+        </w:tc>
+      </w:tr>
+      <w:tr>
+        <w:tc>
+          <w:tcPr>
+            <w:tcW w:type="dxa" w:w="1247"/>
+            <w:tcBorders>
+              <w:top w:val="single" w:sz="4" w:space="0" w:color="8FAADC"/>
+              <w:left w:val="single" w:sz="4" w:space="0" w:color="8FAADC"/>
+              <w:bottom w:val="single" w:sz="4" w:space="0" w:color="8FAADC"/>
+              <w:right w:val="single" w:sz="4" w:space="0" w:color="8FAADC"/>
+            </w:tcBorders>
+            <w:tcMar>
+              <w:top w:w="40" w:type="dxa"/>
+              <w:left w:w="60" w:type="dxa"/>
+              <w:bottom w:w="40" w:type="dxa"/>
+              <w:right w:w="60" w:type="dxa"/>
+            </w:tcMar>
+            <w:vAlign w:val="center"/>
+          </w:tcPr>
+          <w:p>
+            <w:pPr>
+              <w:spacing w:before="0" w:after="0" w:line="259" w:lineRule="auto"/>
+              <w:jc w:val="center"/>
+            </w:pPr>
+            <w:r/>
+            <w:r>
+              <w:rPr>
+                <w:rFonts w:ascii="Calibri" w:hAnsi="Calibri" w:eastAsia="宋体"/>
+                <w:b w:val="0"/>
+                <w:color w:val="2D2D2D"/>
+                <w:sz w:val="21"/>
+              </w:rPr>
+              <w:t>B-16</w:t>
+            </w:r>
+          </w:p>
+        </w:tc>
+        <w:tc>
+          <w:tcPr>
+            <w:tcW w:type="dxa" w:w="1474"/>
+            <w:tcBorders>
+              <w:top w:val="single" w:sz="4" w:space="0" w:color="8FAADC"/>
+              <w:left w:val="single" w:sz="4" w:space="0" w:color="8FAADC"/>
+              <w:bottom w:val="single" w:sz="4" w:space="0" w:color="8FAADC"/>
+              <w:right w:val="single" w:sz="4" w:space="0" w:color="8FAADC"/>
+            </w:tcBorders>
+            <w:tcMar>
+              <w:top w:w="40" w:type="dxa"/>
+              <w:left w:w="60" w:type="dxa"/>
+              <w:bottom w:w="40" w:type="dxa"/>
+              <w:right w:w="60" w:type="dxa"/>
+            </w:tcMar>
+            <w:vAlign w:val="center"/>
+          </w:tcPr>
+          <w:p>
+            <w:pPr>
+              <w:spacing w:before="0" w:after="0" w:line="259" w:lineRule="auto"/>
+              <w:jc w:val="left"/>
+            </w:pPr>
+            <w:r/>
+            <w:r>
+              <w:rPr>
+                <w:rFonts w:ascii="Calibri" w:hAnsi="Calibri" w:eastAsia="宋体"/>
+                <w:b w:val="0"/>
+                <w:color w:val="2D2D2D"/>
+                <w:sz w:val="21"/>
+              </w:rPr>
+              <w:t>宴府主</w:t>
+            </w:r>
+          </w:p>
+        </w:tc>
+        <w:tc>
+          <w:tcPr>
+            <w:tcW w:type="dxa" w:w="850"/>
+            <w:tcBorders>
+              <w:top w:val="single" w:sz="4" w:space="0" w:color="8FAADC"/>
+              <w:left w:val="single" w:sz="4" w:space="0" w:color="8FAADC"/>
+              <w:bottom w:val="single" w:sz="4" w:space="0" w:color="8FAADC"/>
+              <w:right w:val="single" w:sz="4" w:space="0" w:color="8FAADC"/>
+            </w:tcBorders>
+            <w:tcMar>
+              <w:top w:w="40" w:type="dxa"/>
+              <w:left w:w="60" w:type="dxa"/>
+              <w:bottom w:w="40" w:type="dxa"/>
+              <w:right w:w="60" w:type="dxa"/>
+            </w:tcMar>
+            <w:vAlign w:val="center"/>
+          </w:tcPr>
+          <w:p>
+            <w:pPr>
+              <w:spacing w:before="0" w:after="0" w:line="259" w:lineRule="auto"/>
+              <w:jc w:val="center"/>
+            </w:pPr>
+            <w:r/>
+            <w:r>
+              <w:rPr>
+                <w:rFonts w:ascii="Calibri" w:hAnsi="Calibri" w:eastAsia="宋体"/>
+                <w:b w:val="0"/>
+                <w:color w:val="2D2D2D"/>
+                <w:sz w:val="21"/>
+              </w:rPr>
+              <w:t>2</w:t>
+            </w:r>
+          </w:p>
+        </w:tc>
+        <w:tc>
+          <w:tcPr>
+            <w:tcW w:type="dxa" w:w="1020"/>
+            <w:tcBorders>
+              <w:top w:val="single" w:sz="4" w:space="0" w:color="8FAADC"/>
+              <w:left w:val="single" w:sz="4" w:space="0" w:color="8FAADC"/>
+              <w:bottom w:val="single" w:sz="4" w:space="0" w:color="8FAADC"/>
+              <w:right w:val="single" w:sz="4" w:space="0" w:color="8FAADC"/>
+            </w:tcBorders>
+            <w:tcMar>
+              <w:top w:w="40" w:type="dxa"/>
+              <w:left w:w="60" w:type="dxa"/>
+              <w:bottom w:w="40" w:type="dxa"/>
+              <w:right w:w="60" w:type="dxa"/>
+            </w:tcMar>
+            <w:vAlign w:val="center"/>
+          </w:tcPr>
+          <w:p>
+            <w:pPr>
+              <w:spacing w:before="0" w:after="0" w:line="259" w:lineRule="auto"/>
+              <w:jc w:val="center"/>
+            </w:pPr>
+            <w:r/>
+            <w:r>
+              <w:rPr>
+                <w:rFonts w:ascii="Calibri" w:hAnsi="Calibri" w:eastAsia="宋体"/>
+                <w:b w:val="0"/>
+                <w:color w:val="2D2D2D"/>
+                <w:sz w:val="21"/>
+              </w:rPr>
+              <w:t>治疗</w:t>
+            </w:r>
+          </w:p>
+        </w:tc>
+        <w:tc>
+          <w:tcPr>
+            <w:tcW w:type="dxa" w:w="4876"/>
+            <w:tcBorders>
+              <w:top w:val="single" w:sz="4" w:space="0" w:color="8FAADC"/>
+              <w:left w:val="single" w:sz="4" w:space="0" w:color="8FAADC"/>
+              <w:bottom w:val="single" w:sz="4" w:space="0" w:color="8FAADC"/>
+              <w:right w:val="single" w:sz="4" w:space="0" w:color="8FAADC"/>
+            </w:tcBorders>
+            <w:tcMar>
+              <w:top w:w="40" w:type="dxa"/>
+              <w:left w:w="60" w:type="dxa"/>
+              <w:bottom w:w="40" w:type="dxa"/>
+              <w:right w:w="60" w:type="dxa"/>
+            </w:tcMar>
+            <w:vAlign w:val="center"/>
+          </w:tcPr>
+          <w:p>
+            <w:pPr>
+              <w:spacing w:before="0" w:after="0" w:line="259" w:lineRule="auto"/>
+              <w:jc w:val="left"/>
+            </w:pPr>
+            <w:r/>
+            <w:r>
+              <w:rPr>
+                <w:rFonts w:ascii="Calibri" w:hAnsi="Calibri" w:eastAsia="宋体"/>
+                <w:b w:val="0"/>
+                <w:color w:val="2D2D2D"/>
+                <w:sz w:val="21"/>
+              </w:rPr>
+              <w:t>双方各恢复 3 点血量</w:t>
+            </w:r>
+          </w:p>
+        </w:tc>
+        <w:tc>
+          <w:tcPr>
+            <w:tcW w:type="dxa" w:w="4139"/>
+            <w:tcBorders>
+              <w:top w:val="single" w:sz="4" w:space="0" w:color="8FAADC"/>
+              <w:left w:val="single" w:sz="4" w:space="0" w:color="8FAADC"/>
+              <w:bottom w:val="single" w:sz="4" w:space="0" w:color="8FAADC"/>
+              <w:right w:val="single" w:sz="4" w:space="0" w:color="8FAADC"/>
+            </w:tcBorders>
+            <w:tcMar>
+              <w:top w:w="40" w:type="dxa"/>
+              <w:left w:w="60" w:type="dxa"/>
+              <w:bottom w:w="40" w:type="dxa"/>
+              <w:right w:w="60" w:type="dxa"/>
+            </w:tcMar>
+            <w:vAlign w:val="center"/>
+          </w:tcPr>
+          <w:p>
+            <w:pPr>
+              <w:spacing w:before="0" w:after="0" w:line="259" w:lineRule="auto"/>
+              <w:jc w:val="left"/>
+            </w:pPr>
+            <w:r/>
+            <w:r>
+              <w:rPr>
+                <w:rFonts w:ascii="Calibri" w:hAnsi="Calibri" w:eastAsia="宋体"/>
+                <w:b w:val="0"/>
+                <w:color w:val="2D2D2D"/>
+                <w:sz w:val="21"/>
+              </w:rPr>
+              <w:t>分糕同宴：纯双奶 3，同费总量 6；乐师是双奶 2，会馆主是抽+双奶 2。举烛奉糕。</w:t>
+            </w:r>
+          </w:p>
+        </w:tc>
+      </w:tr>
     </w:tbl>
     <w:p>
       <w:pPr>
@@ -1867,6 +3121,2776 @@
                 <w:sz w:val="21"/>
               </w:rPr>
               <w:t>伸手揽客：伤 3 自奶 1；强于酒娘的伤 2 自奶 1，也不撞香囊商的伤 2 任意奶。</w:t>
+            </w:r>
+          </w:p>
+        </w:tc>
+      </w:tr>
+      <w:tr>
+        <w:tc>
+          <w:tcPr>
+            <w:tcW w:type="dxa" w:w="1247"/>
+            <w:tcBorders>
+              <w:top w:val="single" w:sz="4" w:space="0" w:color="8FAADC"/>
+              <w:left w:val="single" w:sz="4" w:space="0" w:color="8FAADC"/>
+              <w:bottom w:val="single" w:sz="4" w:space="0" w:color="8FAADC"/>
+              <w:right w:val="single" w:sz="4" w:space="0" w:color="8FAADC"/>
+            </w:tcBorders>
+            <w:tcMar>
+              <w:top w:w="40" w:type="dxa"/>
+              <w:left w:w="60" w:type="dxa"/>
+              <w:bottom w:w="40" w:type="dxa"/>
+              <w:right w:w="60" w:type="dxa"/>
+            </w:tcMar>
+            <w:vAlign w:val="center"/>
+            <w:shd w:val="clear" w:color="auto" w:fill="F7FAFC"/>
+          </w:tcPr>
+          <w:p>
+            <w:pPr>
+              <w:spacing w:before="0" w:after="0" w:line="259" w:lineRule="auto"/>
+              <w:jc w:val="center"/>
+            </w:pPr>
+            <w:r/>
+            <w:r>
+              <w:rPr>
+                <w:rFonts w:ascii="Calibri" w:hAnsi="Calibri" w:eastAsia="宋体"/>
+                <w:b w:val="0"/>
+                <w:color w:val="2D2D2D"/>
+                <w:sz w:val="21"/>
+              </w:rPr>
+              <w:t>S-28</w:t>
+            </w:r>
+          </w:p>
+        </w:tc>
+        <w:tc>
+          <w:tcPr>
+            <w:tcW w:type="dxa" w:w="1474"/>
+            <w:tcBorders>
+              <w:top w:val="single" w:sz="4" w:space="0" w:color="8FAADC"/>
+              <w:left w:val="single" w:sz="4" w:space="0" w:color="8FAADC"/>
+              <w:bottom w:val="single" w:sz="4" w:space="0" w:color="8FAADC"/>
+              <w:right w:val="single" w:sz="4" w:space="0" w:color="8FAADC"/>
+            </w:tcBorders>
+            <w:tcMar>
+              <w:top w:w="40" w:type="dxa"/>
+              <w:left w:w="60" w:type="dxa"/>
+              <w:bottom w:w="40" w:type="dxa"/>
+              <w:right w:w="60" w:type="dxa"/>
+            </w:tcMar>
+            <w:vAlign w:val="center"/>
+            <w:shd w:val="clear" w:color="auto" w:fill="F7FAFC"/>
+          </w:tcPr>
+          <w:p>
+            <w:pPr>
+              <w:spacing w:before="0" w:after="0" w:line="259" w:lineRule="auto"/>
+              <w:jc w:val="left"/>
+            </w:pPr>
+            <w:r/>
+            <w:r>
+              <w:rPr>
+                <w:rFonts w:ascii="Calibri" w:hAnsi="Calibri" w:eastAsia="宋体"/>
+                <w:b w:val="0"/>
+                <w:color w:val="2D2D2D"/>
+                <w:sz w:val="21"/>
+              </w:rPr>
+              <w:t>坐柜牙人</w:t>
+            </w:r>
+          </w:p>
+        </w:tc>
+        <w:tc>
+          <w:tcPr>
+            <w:tcW w:type="dxa" w:w="850"/>
+            <w:tcBorders>
+              <w:top w:val="single" w:sz="4" w:space="0" w:color="8FAADC"/>
+              <w:left w:val="single" w:sz="4" w:space="0" w:color="8FAADC"/>
+              <w:bottom w:val="single" w:sz="4" w:space="0" w:color="8FAADC"/>
+              <w:right w:val="single" w:sz="4" w:space="0" w:color="8FAADC"/>
+            </w:tcBorders>
+            <w:tcMar>
+              <w:top w:w="40" w:type="dxa"/>
+              <w:left w:w="60" w:type="dxa"/>
+              <w:bottom w:w="40" w:type="dxa"/>
+              <w:right w:w="60" w:type="dxa"/>
+            </w:tcMar>
+            <w:vAlign w:val="center"/>
+            <w:shd w:val="clear" w:color="auto" w:fill="F7FAFC"/>
+          </w:tcPr>
+          <w:p>
+            <w:pPr>
+              <w:spacing w:before="0" w:after="0" w:line="259" w:lineRule="auto"/>
+              <w:jc w:val="center"/>
+            </w:pPr>
+            <w:r/>
+            <w:r>
+              <w:rPr>
+                <w:rFonts w:ascii="Calibri" w:hAnsi="Calibri" w:eastAsia="宋体"/>
+                <w:b w:val="0"/>
+                <w:color w:val="2D2D2D"/>
+                <w:sz w:val="21"/>
+              </w:rPr>
+              <w:t>1</w:t>
+            </w:r>
+          </w:p>
+        </w:tc>
+        <w:tc>
+          <w:tcPr>
+            <w:tcW w:type="dxa" w:w="1020"/>
+            <w:tcBorders>
+              <w:top w:val="single" w:sz="4" w:space="0" w:color="8FAADC"/>
+              <w:left w:val="single" w:sz="4" w:space="0" w:color="8FAADC"/>
+              <w:bottom w:val="single" w:sz="4" w:space="0" w:color="8FAADC"/>
+              <w:right w:val="single" w:sz="4" w:space="0" w:color="8FAADC"/>
+            </w:tcBorders>
+            <w:tcMar>
+              <w:top w:w="40" w:type="dxa"/>
+              <w:left w:w="60" w:type="dxa"/>
+              <w:bottom w:w="40" w:type="dxa"/>
+              <w:right w:w="60" w:type="dxa"/>
+            </w:tcMar>
+            <w:vAlign w:val="center"/>
+            <w:shd w:val="clear" w:color="auto" w:fill="F7FAFC"/>
+          </w:tcPr>
+          <w:p>
+            <w:pPr>
+              <w:spacing w:before="0" w:after="0" w:line="259" w:lineRule="auto"/>
+              <w:jc w:val="center"/>
+            </w:pPr>
+            <w:r/>
+            <w:r>
+              <w:rPr>
+                <w:rFonts w:ascii="Calibri" w:hAnsi="Calibri" w:eastAsia="宋体"/>
+                <w:b w:val="0"/>
+                <w:color w:val="2D2D2D"/>
+                <w:sz w:val="21"/>
+              </w:rPr>
+              <w:t>支援</w:t>
+            </w:r>
+          </w:p>
+        </w:tc>
+        <w:tc>
+          <w:tcPr>
+            <w:tcW w:type="dxa" w:w="4876"/>
+            <w:tcBorders>
+              <w:top w:val="single" w:sz="4" w:space="0" w:color="8FAADC"/>
+              <w:left w:val="single" w:sz="4" w:space="0" w:color="8FAADC"/>
+              <w:bottom w:val="single" w:sz="4" w:space="0" w:color="8FAADC"/>
+              <w:right w:val="single" w:sz="4" w:space="0" w:color="8FAADC"/>
+            </w:tcBorders>
+            <w:tcMar>
+              <w:top w:w="40" w:type="dxa"/>
+              <w:left w:w="60" w:type="dxa"/>
+              <w:bottom w:w="40" w:type="dxa"/>
+              <w:right w:w="60" w:type="dxa"/>
+            </w:tcMar>
+            <w:vAlign w:val="center"/>
+            <w:shd w:val="clear" w:color="auto" w:fill="F7FAFC"/>
+          </w:tcPr>
+          <w:p>
+            <w:pPr>
+              <w:spacing w:before="0" w:after="0" w:line="259" w:lineRule="auto"/>
+              <w:jc w:val="left"/>
+            </w:pPr>
+            <w:r/>
+            <w:r>
+              <w:rPr>
+                <w:rFonts w:ascii="Calibri" w:hAnsi="Calibri" w:eastAsia="宋体"/>
+                <w:b w:val="0"/>
+                <w:color w:val="2D2D2D"/>
+                <w:sz w:val="21"/>
+              </w:rPr>
+              <w:t>抽 1 张牌，并恢复自己 1 点血量</w:t>
+            </w:r>
+          </w:p>
+        </w:tc>
+        <w:tc>
+          <w:tcPr>
+            <w:tcW w:type="dxa" w:w="4139"/>
+            <w:tcBorders>
+              <w:top w:val="single" w:sz="4" w:space="0" w:color="8FAADC"/>
+              <w:left w:val="single" w:sz="4" w:space="0" w:color="8FAADC"/>
+              <w:bottom w:val="single" w:sz="4" w:space="0" w:color="8FAADC"/>
+              <w:right w:val="single" w:sz="4" w:space="0" w:color="8FAADC"/>
+            </w:tcBorders>
+            <w:tcMar>
+              <w:top w:w="40" w:type="dxa"/>
+              <w:left w:w="60" w:type="dxa"/>
+              <w:bottom w:w="40" w:type="dxa"/>
+              <w:right w:w="60" w:type="dxa"/>
+            </w:tcMar>
+            <w:vAlign w:val="center"/>
+            <w:shd w:val="clear" w:color="auto" w:fill="F7FAFC"/>
+          </w:tcPr>
+          <w:p>
+            <w:pPr>
+              <w:spacing w:before="0" w:after="0" w:line="259" w:lineRule="auto"/>
+              <w:jc w:val="left"/>
+            </w:pPr>
+            <w:r/>
+            <w:r>
+              <w:rPr>
+                <w:rFonts w:ascii="Calibri" w:hAnsi="Calibri" w:eastAsia="宋体"/>
+                <w:b w:val="0"/>
+                <w:color w:val="2D2D2D"/>
+                <w:sz w:val="21"/>
+              </w:rPr>
+              <w:t>伏案核账：现抽+自奶 1；典选官是抽+自盾，勋籍郎是调用+抽。托腮持册。</w:t>
+            </w:r>
+          </w:p>
+        </w:tc>
+      </w:tr>
+      <w:tr>
+        <w:tc>
+          <w:tcPr>
+            <w:tcW w:type="dxa" w:w="1247"/>
+            <w:tcBorders>
+              <w:top w:val="single" w:sz="4" w:space="0" w:color="8FAADC"/>
+              <w:left w:val="single" w:sz="4" w:space="0" w:color="8FAADC"/>
+              <w:bottom w:val="single" w:sz="4" w:space="0" w:color="8FAADC"/>
+              <w:right w:val="single" w:sz="4" w:space="0" w:color="8FAADC"/>
+            </w:tcBorders>
+            <w:tcMar>
+              <w:top w:w="40" w:type="dxa"/>
+              <w:left w:w="60" w:type="dxa"/>
+              <w:bottom w:w="40" w:type="dxa"/>
+              <w:right w:w="60" w:type="dxa"/>
+            </w:tcMar>
+            <w:vAlign w:val="center"/>
+          </w:tcPr>
+          <w:p>
+            <w:pPr>
+              <w:spacing w:before="0" w:after="0" w:line="259" w:lineRule="auto"/>
+              <w:jc w:val="center"/>
+            </w:pPr>
+            <w:r/>
+            <w:r>
+              <w:rPr>
+                <w:rFonts w:ascii="Calibri" w:hAnsi="Calibri" w:eastAsia="宋体"/>
+                <w:b w:val="0"/>
+                <w:color w:val="2D2D2D"/>
+                <w:sz w:val="21"/>
+              </w:rPr>
+              <w:t>S-29</w:t>
+            </w:r>
+          </w:p>
+        </w:tc>
+        <w:tc>
+          <w:tcPr>
+            <w:tcW w:type="dxa" w:w="1474"/>
+            <w:tcBorders>
+              <w:top w:val="single" w:sz="4" w:space="0" w:color="8FAADC"/>
+              <w:left w:val="single" w:sz="4" w:space="0" w:color="8FAADC"/>
+              <w:bottom w:val="single" w:sz="4" w:space="0" w:color="8FAADC"/>
+              <w:right w:val="single" w:sz="4" w:space="0" w:color="8FAADC"/>
+            </w:tcBorders>
+            <w:tcMar>
+              <w:top w:w="40" w:type="dxa"/>
+              <w:left w:w="60" w:type="dxa"/>
+              <w:bottom w:w="40" w:type="dxa"/>
+              <w:right w:w="60" w:type="dxa"/>
+            </w:tcMar>
+            <w:vAlign w:val="center"/>
+          </w:tcPr>
+          <w:p>
+            <w:pPr>
+              <w:spacing w:before="0" w:after="0" w:line="259" w:lineRule="auto"/>
+              <w:jc w:val="left"/>
+            </w:pPr>
+            <w:r/>
+            <w:r>
+              <w:rPr>
+                <w:rFonts w:ascii="Calibri" w:hAnsi="Calibri" w:eastAsia="宋体"/>
+                <w:b w:val="0"/>
+                <w:color w:val="2D2D2D"/>
+                <w:sz w:val="21"/>
+              </w:rPr>
+              <w:t>滑舌商</w:t>
+            </w:r>
+          </w:p>
+        </w:tc>
+        <w:tc>
+          <w:tcPr>
+            <w:tcW w:type="dxa" w:w="850"/>
+            <w:tcBorders>
+              <w:top w:val="single" w:sz="4" w:space="0" w:color="8FAADC"/>
+              <w:left w:val="single" w:sz="4" w:space="0" w:color="8FAADC"/>
+              <w:bottom w:val="single" w:sz="4" w:space="0" w:color="8FAADC"/>
+              <w:right w:val="single" w:sz="4" w:space="0" w:color="8FAADC"/>
+            </w:tcBorders>
+            <w:tcMar>
+              <w:top w:w="40" w:type="dxa"/>
+              <w:left w:w="60" w:type="dxa"/>
+              <w:bottom w:w="40" w:type="dxa"/>
+              <w:right w:w="60" w:type="dxa"/>
+            </w:tcMar>
+            <w:vAlign w:val="center"/>
+          </w:tcPr>
+          <w:p>
+            <w:pPr>
+              <w:spacing w:before="0" w:after="0" w:line="259" w:lineRule="auto"/>
+              <w:jc w:val="center"/>
+            </w:pPr>
+            <w:r/>
+            <w:r>
+              <w:rPr>
+                <w:rFonts w:ascii="Calibri" w:hAnsi="Calibri" w:eastAsia="宋体"/>
+                <w:b w:val="0"/>
+                <w:color w:val="2D2D2D"/>
+                <w:sz w:val="21"/>
+              </w:rPr>
+              <w:t>2</w:t>
+            </w:r>
+          </w:p>
+        </w:tc>
+        <w:tc>
+          <w:tcPr>
+            <w:tcW w:type="dxa" w:w="1020"/>
+            <w:tcBorders>
+              <w:top w:val="single" w:sz="4" w:space="0" w:color="8FAADC"/>
+              <w:left w:val="single" w:sz="4" w:space="0" w:color="8FAADC"/>
+              <w:bottom w:val="single" w:sz="4" w:space="0" w:color="8FAADC"/>
+              <w:right w:val="single" w:sz="4" w:space="0" w:color="8FAADC"/>
+            </w:tcBorders>
+            <w:tcMar>
+              <w:top w:w="40" w:type="dxa"/>
+              <w:left w:w="60" w:type="dxa"/>
+              <w:bottom w:w="40" w:type="dxa"/>
+              <w:right w:w="60" w:type="dxa"/>
+            </w:tcMar>
+            <w:vAlign w:val="center"/>
+          </w:tcPr>
+          <w:p>
+            <w:pPr>
+              <w:spacing w:before="0" w:after="0" w:line="259" w:lineRule="auto"/>
+              <w:jc w:val="center"/>
+            </w:pPr>
+            <w:r/>
+            <w:r>
+              <w:rPr>
+                <w:rFonts w:ascii="Calibri" w:hAnsi="Calibri" w:eastAsia="宋体"/>
+                <w:b w:val="0"/>
+                <w:color w:val="2D2D2D"/>
+                <w:sz w:val="21"/>
+              </w:rPr>
+              <w:t>攻击</w:t>
+            </w:r>
+          </w:p>
+        </w:tc>
+        <w:tc>
+          <w:tcPr>
+            <w:tcW w:type="dxa" w:w="4876"/>
+            <w:tcBorders>
+              <w:top w:val="single" w:sz="4" w:space="0" w:color="8FAADC"/>
+              <w:left w:val="single" w:sz="4" w:space="0" w:color="8FAADC"/>
+              <w:bottom w:val="single" w:sz="4" w:space="0" w:color="8FAADC"/>
+              <w:right w:val="single" w:sz="4" w:space="0" w:color="8FAADC"/>
+            </w:tcBorders>
+            <w:tcMar>
+              <w:top w:w="40" w:type="dxa"/>
+              <w:left w:w="60" w:type="dxa"/>
+              <w:bottom w:w="40" w:type="dxa"/>
+              <w:right w:w="60" w:type="dxa"/>
+            </w:tcMar>
+            <w:vAlign w:val="center"/>
+          </w:tcPr>
+          <w:p>
+            <w:pPr>
+              <w:spacing w:before="0" w:after="0" w:line="259" w:lineRule="auto"/>
+              <w:jc w:val="left"/>
+            </w:pPr>
+            <w:r/>
+            <w:r>
+              <w:rPr>
+                <w:rFonts w:ascii="Calibri" w:hAnsi="Calibri" w:eastAsia="宋体"/>
+                <w:b w:val="0"/>
+                <w:color w:val="2D2D2D"/>
+                <w:sz w:val="21"/>
+              </w:rPr>
+              <w:t>立即造成 2 点伤害，本回合员工调用机会 +1</w:t>
+            </w:r>
+          </w:p>
+        </w:tc>
+        <w:tc>
+          <w:tcPr>
+            <w:tcW w:type="dxa" w:w="4139"/>
+            <w:tcBorders>
+              <w:top w:val="single" w:sz="4" w:space="0" w:color="8FAADC"/>
+              <w:left w:val="single" w:sz="4" w:space="0" w:color="8FAADC"/>
+              <w:bottom w:val="single" w:sz="4" w:space="0" w:color="8FAADC"/>
+              <w:right w:val="single" w:sz="4" w:space="0" w:color="8FAADC"/>
+            </w:tcBorders>
+            <w:tcMar>
+              <w:top w:w="40" w:type="dxa"/>
+              <w:left w:w="60" w:type="dxa"/>
+              <w:bottom w:w="40" w:type="dxa"/>
+              <w:right w:w="60" w:type="dxa"/>
+            </w:tcMar>
+            <w:vAlign w:val="center"/>
+          </w:tcPr>
+          <w:p>
+            <w:pPr>
+              <w:spacing w:before="0" w:after="0" w:line="259" w:lineRule="auto"/>
+              <w:jc w:val="left"/>
+            </w:pPr>
+            <w:r/>
+            <w:r>
+              <w:rPr>
+                <w:rFonts w:ascii="Calibri" w:hAnsi="Calibri" w:eastAsia="宋体"/>
+                <w:b w:val="0"/>
+                <w:color w:val="2D2D2D"/>
+                <w:sz w:val="21"/>
+              </w:rPr>
+              <w:t>巧嘴成交：伤 2+自调用；山客是减攻+调用，猎场主是伤 3 双调用。偷笑。</w:t>
+            </w:r>
+          </w:p>
+        </w:tc>
+      </w:tr>
+      <w:tr>
+        <w:tc>
+          <w:tcPr>
+            <w:tcW w:type="dxa" w:w="1247"/>
+            <w:tcBorders>
+              <w:top w:val="single" w:sz="4" w:space="0" w:color="8FAADC"/>
+              <w:left w:val="single" w:sz="4" w:space="0" w:color="8FAADC"/>
+              <w:bottom w:val="single" w:sz="4" w:space="0" w:color="8FAADC"/>
+              <w:right w:val="single" w:sz="4" w:space="0" w:color="8FAADC"/>
+            </w:tcBorders>
+            <w:tcMar>
+              <w:top w:w="40" w:type="dxa"/>
+              <w:left w:w="60" w:type="dxa"/>
+              <w:bottom w:w="40" w:type="dxa"/>
+              <w:right w:w="60" w:type="dxa"/>
+            </w:tcMar>
+            <w:vAlign w:val="center"/>
+            <w:shd w:val="clear" w:color="auto" w:fill="F7FAFC"/>
+          </w:tcPr>
+          <w:p>
+            <w:pPr>
+              <w:spacing w:before="0" w:after="0" w:line="259" w:lineRule="auto"/>
+              <w:jc w:val="center"/>
+            </w:pPr>
+            <w:r/>
+            <w:r>
+              <w:rPr>
+                <w:rFonts w:ascii="Calibri" w:hAnsi="Calibri" w:eastAsia="宋体"/>
+                <w:b w:val="0"/>
+                <w:color w:val="2D2D2D"/>
+                <w:sz w:val="21"/>
+              </w:rPr>
+              <w:t>S-30</w:t>
+            </w:r>
+          </w:p>
+        </w:tc>
+        <w:tc>
+          <w:tcPr>
+            <w:tcW w:type="dxa" w:w="1474"/>
+            <w:tcBorders>
+              <w:top w:val="single" w:sz="4" w:space="0" w:color="8FAADC"/>
+              <w:left w:val="single" w:sz="4" w:space="0" w:color="8FAADC"/>
+              <w:bottom w:val="single" w:sz="4" w:space="0" w:color="8FAADC"/>
+              <w:right w:val="single" w:sz="4" w:space="0" w:color="8FAADC"/>
+            </w:tcBorders>
+            <w:tcMar>
+              <w:top w:w="40" w:type="dxa"/>
+              <w:left w:w="60" w:type="dxa"/>
+              <w:bottom w:w="40" w:type="dxa"/>
+              <w:right w:w="60" w:type="dxa"/>
+            </w:tcMar>
+            <w:vAlign w:val="center"/>
+            <w:shd w:val="clear" w:color="auto" w:fill="F7FAFC"/>
+          </w:tcPr>
+          <w:p>
+            <w:pPr>
+              <w:spacing w:before="0" w:after="0" w:line="259" w:lineRule="auto"/>
+              <w:jc w:val="left"/>
+            </w:pPr>
+            <w:r/>
+            <w:r>
+              <w:rPr>
+                <w:rFonts w:ascii="Calibri" w:hAnsi="Calibri" w:eastAsia="宋体"/>
+                <w:b w:val="0"/>
+                <w:color w:val="2D2D2D"/>
+                <w:sz w:val="21"/>
+              </w:rPr>
+              <w:t>负箱商</w:t>
+            </w:r>
+          </w:p>
+        </w:tc>
+        <w:tc>
+          <w:tcPr>
+            <w:tcW w:type="dxa" w:w="850"/>
+            <w:tcBorders>
+              <w:top w:val="single" w:sz="4" w:space="0" w:color="8FAADC"/>
+              <w:left w:val="single" w:sz="4" w:space="0" w:color="8FAADC"/>
+              <w:bottom w:val="single" w:sz="4" w:space="0" w:color="8FAADC"/>
+              <w:right w:val="single" w:sz="4" w:space="0" w:color="8FAADC"/>
+            </w:tcBorders>
+            <w:tcMar>
+              <w:top w:w="40" w:type="dxa"/>
+              <w:left w:w="60" w:type="dxa"/>
+              <w:bottom w:w="40" w:type="dxa"/>
+              <w:right w:w="60" w:type="dxa"/>
+            </w:tcMar>
+            <w:vAlign w:val="center"/>
+            <w:shd w:val="clear" w:color="auto" w:fill="F7FAFC"/>
+          </w:tcPr>
+          <w:p>
+            <w:pPr>
+              <w:spacing w:before="0" w:after="0" w:line="259" w:lineRule="auto"/>
+              <w:jc w:val="center"/>
+            </w:pPr>
+            <w:r/>
+            <w:r>
+              <w:rPr>
+                <w:rFonts w:ascii="Calibri" w:hAnsi="Calibri" w:eastAsia="宋体"/>
+                <w:b w:val="0"/>
+                <w:color w:val="2D2D2D"/>
+                <w:sz w:val="21"/>
+              </w:rPr>
+              <w:t>2</w:t>
+            </w:r>
+          </w:p>
+        </w:tc>
+        <w:tc>
+          <w:tcPr>
+            <w:tcW w:type="dxa" w:w="1020"/>
+            <w:tcBorders>
+              <w:top w:val="single" w:sz="4" w:space="0" w:color="8FAADC"/>
+              <w:left w:val="single" w:sz="4" w:space="0" w:color="8FAADC"/>
+              <w:bottom w:val="single" w:sz="4" w:space="0" w:color="8FAADC"/>
+              <w:right w:val="single" w:sz="4" w:space="0" w:color="8FAADC"/>
+            </w:tcBorders>
+            <w:tcMar>
+              <w:top w:w="40" w:type="dxa"/>
+              <w:left w:w="60" w:type="dxa"/>
+              <w:bottom w:w="40" w:type="dxa"/>
+              <w:right w:w="60" w:type="dxa"/>
+            </w:tcMar>
+            <w:vAlign w:val="center"/>
+            <w:shd w:val="clear" w:color="auto" w:fill="F7FAFC"/>
+          </w:tcPr>
+          <w:p>
+            <w:pPr>
+              <w:spacing w:before="0" w:after="0" w:line="259" w:lineRule="auto"/>
+              <w:jc w:val="center"/>
+            </w:pPr>
+            <w:r/>
+            <w:r>
+              <w:rPr>
+                <w:rFonts w:ascii="Calibri" w:hAnsi="Calibri" w:eastAsia="宋体"/>
+                <w:b w:val="0"/>
+                <w:color w:val="2D2D2D"/>
+                <w:sz w:val="21"/>
+              </w:rPr>
+              <w:t>攻击</w:t>
+            </w:r>
+          </w:p>
+        </w:tc>
+        <w:tc>
+          <w:tcPr>
+            <w:tcW w:type="dxa" w:w="4876"/>
+            <w:tcBorders>
+              <w:top w:val="single" w:sz="4" w:space="0" w:color="8FAADC"/>
+              <w:left w:val="single" w:sz="4" w:space="0" w:color="8FAADC"/>
+              <w:bottom w:val="single" w:sz="4" w:space="0" w:color="8FAADC"/>
+              <w:right w:val="single" w:sz="4" w:space="0" w:color="8FAADC"/>
+            </w:tcBorders>
+            <w:tcMar>
+              <w:top w:w="40" w:type="dxa"/>
+              <w:left w:w="60" w:type="dxa"/>
+              <w:bottom w:w="40" w:type="dxa"/>
+              <w:right w:w="60" w:type="dxa"/>
+            </w:tcMar>
+            <w:vAlign w:val="center"/>
+            <w:shd w:val="clear" w:color="auto" w:fill="F7FAFC"/>
+          </w:tcPr>
+          <w:p>
+            <w:pPr>
+              <w:spacing w:before="0" w:after="0" w:line="259" w:lineRule="auto"/>
+              <w:jc w:val="left"/>
+            </w:pPr>
+            <w:r/>
+            <w:r>
+              <w:rPr>
+                <w:rFonts w:ascii="Calibri" w:hAnsi="Calibri" w:eastAsia="宋体"/>
+                <w:b w:val="0"/>
+                <w:color w:val="2D2D2D"/>
+                <w:sz w:val="21"/>
+              </w:rPr>
+              <w:t>立即造成 2 点伤害，下回合为自己增加 2 点防御</w:t>
+            </w:r>
+          </w:p>
+        </w:tc>
+        <w:tc>
+          <w:tcPr>
+            <w:tcW w:type="dxa" w:w="4139"/>
+            <w:tcBorders>
+              <w:top w:val="single" w:sz="4" w:space="0" w:color="8FAADC"/>
+              <w:left w:val="single" w:sz="4" w:space="0" w:color="8FAADC"/>
+              <w:bottom w:val="single" w:sz="4" w:space="0" w:color="8FAADC"/>
+              <w:right w:val="single" w:sz="4" w:space="0" w:color="8FAADC"/>
+            </w:tcBorders>
+            <w:tcMar>
+              <w:top w:w="40" w:type="dxa"/>
+              <w:left w:w="60" w:type="dxa"/>
+              <w:bottom w:w="40" w:type="dxa"/>
+              <w:right w:w="60" w:type="dxa"/>
+            </w:tcMar>
+            <w:vAlign w:val="center"/>
+            <w:shd w:val="clear" w:color="auto" w:fill="F7FAFC"/>
+          </w:tcPr>
+          <w:p>
+            <w:pPr>
+              <w:spacing w:before="0" w:after="0" w:line="259" w:lineRule="auto"/>
+              <w:jc w:val="left"/>
+            </w:pPr>
+            <w:r/>
+            <w:r>
+              <w:rPr>
+                <w:rFonts w:ascii="Calibri" w:hAnsi="Calibri" w:eastAsia="宋体"/>
+                <w:b w:val="0"/>
+                <w:color w:val="2D2D2D"/>
+                <w:sz w:val="21"/>
+              </w:rPr>
+              <w:t>负箱赶路：伤 2+下回合自盾 2；绣娘是伤 2+下回合任意盾 1。回身负箱。</w:t>
+            </w:r>
+          </w:p>
+        </w:tc>
+      </w:tr>
+      <w:tr>
+        <w:tc>
+          <w:tcPr>
+            <w:tcW w:type="dxa" w:w="1247"/>
+            <w:tcBorders>
+              <w:top w:val="single" w:sz="4" w:space="0" w:color="8FAADC"/>
+              <w:left w:val="single" w:sz="4" w:space="0" w:color="8FAADC"/>
+              <w:bottom w:val="single" w:sz="4" w:space="0" w:color="8FAADC"/>
+              <w:right w:val="single" w:sz="4" w:space="0" w:color="8FAADC"/>
+            </w:tcBorders>
+            <w:tcMar>
+              <w:top w:w="40" w:type="dxa"/>
+              <w:left w:w="60" w:type="dxa"/>
+              <w:bottom w:w="40" w:type="dxa"/>
+              <w:right w:w="60" w:type="dxa"/>
+            </w:tcMar>
+            <w:vAlign w:val="center"/>
+          </w:tcPr>
+          <w:p>
+            <w:pPr>
+              <w:spacing w:before="0" w:after="0" w:line="259" w:lineRule="auto"/>
+              <w:jc w:val="center"/>
+            </w:pPr>
+            <w:r/>
+            <w:r>
+              <w:rPr>
+                <w:rFonts w:ascii="Calibri" w:hAnsi="Calibri" w:eastAsia="宋体"/>
+                <w:b w:val="0"/>
+                <w:color w:val="2D2D2D"/>
+                <w:sz w:val="21"/>
+              </w:rPr>
+              <w:t>S-31</w:t>
+            </w:r>
+          </w:p>
+        </w:tc>
+        <w:tc>
+          <w:tcPr>
+            <w:tcW w:type="dxa" w:w="1474"/>
+            <w:tcBorders>
+              <w:top w:val="single" w:sz="4" w:space="0" w:color="8FAADC"/>
+              <w:left w:val="single" w:sz="4" w:space="0" w:color="8FAADC"/>
+              <w:bottom w:val="single" w:sz="4" w:space="0" w:color="8FAADC"/>
+              <w:right w:val="single" w:sz="4" w:space="0" w:color="8FAADC"/>
+            </w:tcBorders>
+            <w:tcMar>
+              <w:top w:w="40" w:type="dxa"/>
+              <w:left w:w="60" w:type="dxa"/>
+              <w:bottom w:w="40" w:type="dxa"/>
+              <w:right w:w="60" w:type="dxa"/>
+            </w:tcMar>
+            <w:vAlign w:val="center"/>
+          </w:tcPr>
+          <w:p>
+            <w:pPr>
+              <w:spacing w:before="0" w:after="0" w:line="259" w:lineRule="auto"/>
+              <w:jc w:val="left"/>
+            </w:pPr>
+            <w:r/>
+            <w:r>
+              <w:rPr>
+                <w:rFonts w:ascii="Calibri" w:hAnsi="Calibri" w:eastAsia="宋体"/>
+                <w:b w:val="0"/>
+                <w:color w:val="2D2D2D"/>
+                <w:sz w:val="21"/>
+              </w:rPr>
+              <w:t>津口商</w:t>
+            </w:r>
+          </w:p>
+        </w:tc>
+        <w:tc>
+          <w:tcPr>
+            <w:tcW w:type="dxa" w:w="850"/>
+            <w:tcBorders>
+              <w:top w:val="single" w:sz="4" w:space="0" w:color="8FAADC"/>
+              <w:left w:val="single" w:sz="4" w:space="0" w:color="8FAADC"/>
+              <w:bottom w:val="single" w:sz="4" w:space="0" w:color="8FAADC"/>
+              <w:right w:val="single" w:sz="4" w:space="0" w:color="8FAADC"/>
+            </w:tcBorders>
+            <w:tcMar>
+              <w:top w:w="40" w:type="dxa"/>
+              <w:left w:w="60" w:type="dxa"/>
+              <w:bottom w:w="40" w:type="dxa"/>
+              <w:right w:w="60" w:type="dxa"/>
+            </w:tcMar>
+            <w:vAlign w:val="center"/>
+          </w:tcPr>
+          <w:p>
+            <w:pPr>
+              <w:spacing w:before="0" w:after="0" w:line="259" w:lineRule="auto"/>
+              <w:jc w:val="center"/>
+            </w:pPr>
+            <w:r/>
+            <w:r>
+              <w:rPr>
+                <w:rFonts w:ascii="Calibri" w:hAnsi="Calibri" w:eastAsia="宋体"/>
+                <w:b w:val="0"/>
+                <w:color w:val="2D2D2D"/>
+                <w:sz w:val="21"/>
+              </w:rPr>
+              <w:t>1</w:t>
+            </w:r>
+          </w:p>
+        </w:tc>
+        <w:tc>
+          <w:tcPr>
+            <w:tcW w:type="dxa" w:w="1020"/>
+            <w:tcBorders>
+              <w:top w:val="single" w:sz="4" w:space="0" w:color="8FAADC"/>
+              <w:left w:val="single" w:sz="4" w:space="0" w:color="8FAADC"/>
+              <w:bottom w:val="single" w:sz="4" w:space="0" w:color="8FAADC"/>
+              <w:right w:val="single" w:sz="4" w:space="0" w:color="8FAADC"/>
+            </w:tcBorders>
+            <w:tcMar>
+              <w:top w:w="40" w:type="dxa"/>
+              <w:left w:w="60" w:type="dxa"/>
+              <w:bottom w:w="40" w:type="dxa"/>
+              <w:right w:w="60" w:type="dxa"/>
+            </w:tcMar>
+            <w:vAlign w:val="center"/>
+          </w:tcPr>
+          <w:p>
+            <w:pPr>
+              <w:spacing w:before="0" w:after="0" w:line="259" w:lineRule="auto"/>
+              <w:jc w:val="center"/>
+            </w:pPr>
+            <w:r/>
+            <w:r>
+              <w:rPr>
+                <w:rFonts w:ascii="Calibri" w:hAnsi="Calibri" w:eastAsia="宋体"/>
+                <w:b w:val="0"/>
+                <w:color w:val="2D2D2D"/>
+                <w:sz w:val="21"/>
+              </w:rPr>
+              <w:t>攻击</w:t>
+            </w:r>
+          </w:p>
+        </w:tc>
+        <w:tc>
+          <w:tcPr>
+            <w:tcW w:type="dxa" w:w="4876"/>
+            <w:tcBorders>
+              <w:top w:val="single" w:sz="4" w:space="0" w:color="8FAADC"/>
+              <w:left w:val="single" w:sz="4" w:space="0" w:color="8FAADC"/>
+              <w:bottom w:val="single" w:sz="4" w:space="0" w:color="8FAADC"/>
+              <w:right w:val="single" w:sz="4" w:space="0" w:color="8FAADC"/>
+            </w:tcBorders>
+            <w:tcMar>
+              <w:top w:w="40" w:type="dxa"/>
+              <w:left w:w="60" w:type="dxa"/>
+              <w:bottom w:w="40" w:type="dxa"/>
+              <w:right w:w="60" w:type="dxa"/>
+            </w:tcMar>
+            <w:vAlign w:val="center"/>
+          </w:tcPr>
+          <w:p>
+            <w:pPr>
+              <w:spacing w:before="0" w:after="0" w:line="259" w:lineRule="auto"/>
+              <w:jc w:val="left"/>
+            </w:pPr>
+            <w:r/>
+            <w:r>
+              <w:rPr>
+                <w:rFonts w:ascii="Calibri" w:hAnsi="Calibri" w:eastAsia="宋体"/>
+                <w:b w:val="0"/>
+                <w:color w:val="2D2D2D"/>
+                <w:sz w:val="21"/>
+              </w:rPr>
+              <w:t>立即造成 1 点伤害，双方各获得 1 点防御</w:t>
+            </w:r>
+          </w:p>
+        </w:tc>
+        <w:tc>
+          <w:tcPr>
+            <w:tcW w:type="dxa" w:w="4139"/>
+            <w:tcBorders>
+              <w:top w:val="single" w:sz="4" w:space="0" w:color="8FAADC"/>
+              <w:left w:val="single" w:sz="4" w:space="0" w:color="8FAADC"/>
+              <w:bottom w:val="single" w:sz="4" w:space="0" w:color="8FAADC"/>
+              <w:right w:val="single" w:sz="4" w:space="0" w:color="8FAADC"/>
+            </w:tcBorders>
+            <w:tcMar>
+              <w:top w:w="40" w:type="dxa"/>
+              <w:left w:w="60" w:type="dxa"/>
+              <w:bottom w:w="40" w:type="dxa"/>
+              <w:right w:w="60" w:type="dxa"/>
+            </w:tcMar>
+            <w:vAlign w:val="center"/>
+          </w:tcPr>
+          <w:p>
+            <w:pPr>
+              <w:spacing w:before="0" w:after="0" w:line="259" w:lineRule="auto"/>
+              <w:jc w:val="left"/>
+            </w:pPr>
+            <w:r/>
+            <w:r>
+              <w:rPr>
+                <w:rFonts w:ascii="Calibri" w:hAnsi="Calibri" w:eastAsia="宋体"/>
+                <w:b w:val="0"/>
+                <w:color w:val="2D2D2D"/>
+                <w:sz w:val="21"/>
+              </w:rPr>
+              <w:t>津头招手：伤 1 双盾 1；摊贩是伤 1 任意盾 1，杂货商是伤 2 双盾 1。船上比耶。</w:t>
+            </w:r>
+          </w:p>
+        </w:tc>
+      </w:tr>
+      <w:tr>
+        <w:tc>
+          <w:tcPr>
+            <w:tcW w:type="dxa" w:w="1247"/>
+            <w:tcBorders>
+              <w:top w:val="single" w:sz="4" w:space="0" w:color="8FAADC"/>
+              <w:left w:val="single" w:sz="4" w:space="0" w:color="8FAADC"/>
+              <w:bottom w:val="single" w:sz="4" w:space="0" w:color="8FAADC"/>
+              <w:right w:val="single" w:sz="4" w:space="0" w:color="8FAADC"/>
+            </w:tcBorders>
+            <w:tcMar>
+              <w:top w:w="40" w:type="dxa"/>
+              <w:left w:w="60" w:type="dxa"/>
+              <w:bottom w:w="40" w:type="dxa"/>
+              <w:right w:w="60" w:type="dxa"/>
+            </w:tcMar>
+            <w:vAlign w:val="center"/>
+            <w:shd w:val="clear" w:color="auto" w:fill="F7FAFC"/>
+          </w:tcPr>
+          <w:p>
+            <w:pPr>
+              <w:spacing w:before="0" w:after="0" w:line="259" w:lineRule="auto"/>
+              <w:jc w:val="center"/>
+            </w:pPr>
+            <w:r/>
+            <w:r>
+              <w:rPr>
+                <w:rFonts w:ascii="Calibri" w:hAnsi="Calibri" w:eastAsia="宋体"/>
+                <w:b w:val="0"/>
+                <w:color w:val="2D2D2D"/>
+                <w:sz w:val="21"/>
+              </w:rPr>
+              <w:t>S-32</w:t>
+            </w:r>
+          </w:p>
+        </w:tc>
+        <w:tc>
+          <w:tcPr>
+            <w:tcW w:type="dxa" w:w="1474"/>
+            <w:tcBorders>
+              <w:top w:val="single" w:sz="4" w:space="0" w:color="8FAADC"/>
+              <w:left w:val="single" w:sz="4" w:space="0" w:color="8FAADC"/>
+              <w:bottom w:val="single" w:sz="4" w:space="0" w:color="8FAADC"/>
+              <w:right w:val="single" w:sz="4" w:space="0" w:color="8FAADC"/>
+            </w:tcBorders>
+            <w:tcMar>
+              <w:top w:w="40" w:type="dxa"/>
+              <w:left w:w="60" w:type="dxa"/>
+              <w:bottom w:w="40" w:type="dxa"/>
+              <w:right w:w="60" w:type="dxa"/>
+            </w:tcMar>
+            <w:vAlign w:val="center"/>
+            <w:shd w:val="clear" w:color="auto" w:fill="F7FAFC"/>
+          </w:tcPr>
+          <w:p>
+            <w:pPr>
+              <w:spacing w:before="0" w:after="0" w:line="259" w:lineRule="auto"/>
+              <w:jc w:val="left"/>
+            </w:pPr>
+            <w:r/>
+            <w:r>
+              <w:rPr>
+                <w:rFonts w:ascii="Calibri" w:hAnsi="Calibri" w:eastAsia="宋体"/>
+                <w:b w:val="0"/>
+                <w:color w:val="2D2D2D"/>
+                <w:sz w:val="21"/>
+              </w:rPr>
+              <w:t>盟心商</w:t>
+            </w:r>
+          </w:p>
+        </w:tc>
+        <w:tc>
+          <w:tcPr>
+            <w:tcW w:type="dxa" w:w="850"/>
+            <w:tcBorders>
+              <w:top w:val="single" w:sz="4" w:space="0" w:color="8FAADC"/>
+              <w:left w:val="single" w:sz="4" w:space="0" w:color="8FAADC"/>
+              <w:bottom w:val="single" w:sz="4" w:space="0" w:color="8FAADC"/>
+              <w:right w:val="single" w:sz="4" w:space="0" w:color="8FAADC"/>
+            </w:tcBorders>
+            <w:tcMar>
+              <w:top w:w="40" w:type="dxa"/>
+              <w:left w:w="60" w:type="dxa"/>
+              <w:bottom w:w="40" w:type="dxa"/>
+              <w:right w:w="60" w:type="dxa"/>
+            </w:tcMar>
+            <w:vAlign w:val="center"/>
+            <w:shd w:val="clear" w:color="auto" w:fill="F7FAFC"/>
+          </w:tcPr>
+          <w:p>
+            <w:pPr>
+              <w:spacing w:before="0" w:after="0" w:line="259" w:lineRule="auto"/>
+              <w:jc w:val="center"/>
+            </w:pPr>
+            <w:r/>
+            <w:r>
+              <w:rPr>
+                <w:rFonts w:ascii="Calibri" w:hAnsi="Calibri" w:eastAsia="宋体"/>
+                <w:b w:val="0"/>
+                <w:color w:val="2D2D2D"/>
+                <w:sz w:val="21"/>
+              </w:rPr>
+              <w:t>2</w:t>
+            </w:r>
+          </w:p>
+        </w:tc>
+        <w:tc>
+          <w:tcPr>
+            <w:tcW w:type="dxa" w:w="1020"/>
+            <w:tcBorders>
+              <w:top w:val="single" w:sz="4" w:space="0" w:color="8FAADC"/>
+              <w:left w:val="single" w:sz="4" w:space="0" w:color="8FAADC"/>
+              <w:bottom w:val="single" w:sz="4" w:space="0" w:color="8FAADC"/>
+              <w:right w:val="single" w:sz="4" w:space="0" w:color="8FAADC"/>
+            </w:tcBorders>
+            <w:tcMar>
+              <w:top w:w="40" w:type="dxa"/>
+              <w:left w:w="60" w:type="dxa"/>
+              <w:bottom w:w="40" w:type="dxa"/>
+              <w:right w:w="60" w:type="dxa"/>
+            </w:tcMar>
+            <w:vAlign w:val="center"/>
+            <w:shd w:val="clear" w:color="auto" w:fill="F7FAFC"/>
+          </w:tcPr>
+          <w:p>
+            <w:pPr>
+              <w:spacing w:before="0" w:after="0" w:line="259" w:lineRule="auto"/>
+              <w:jc w:val="center"/>
+            </w:pPr>
+            <w:r/>
+            <w:r>
+              <w:rPr>
+                <w:rFonts w:ascii="Calibri" w:hAnsi="Calibri" w:eastAsia="宋体"/>
+                <w:b w:val="0"/>
+                <w:color w:val="2D2D2D"/>
+                <w:sz w:val="21"/>
+              </w:rPr>
+              <w:t>治疗</w:t>
+            </w:r>
+          </w:p>
+        </w:tc>
+        <w:tc>
+          <w:tcPr>
+            <w:tcW w:type="dxa" w:w="4876"/>
+            <w:tcBorders>
+              <w:top w:val="single" w:sz="4" w:space="0" w:color="8FAADC"/>
+              <w:left w:val="single" w:sz="4" w:space="0" w:color="8FAADC"/>
+              <w:bottom w:val="single" w:sz="4" w:space="0" w:color="8FAADC"/>
+              <w:right w:val="single" w:sz="4" w:space="0" w:color="8FAADC"/>
+            </w:tcBorders>
+            <w:tcMar>
+              <w:top w:w="40" w:type="dxa"/>
+              <w:left w:w="60" w:type="dxa"/>
+              <w:bottom w:w="40" w:type="dxa"/>
+              <w:right w:w="60" w:type="dxa"/>
+            </w:tcMar>
+            <w:vAlign w:val="center"/>
+            <w:shd w:val="clear" w:color="auto" w:fill="F7FAFC"/>
+          </w:tcPr>
+          <w:p>
+            <w:pPr>
+              <w:spacing w:before="0" w:after="0" w:line="259" w:lineRule="auto"/>
+              <w:jc w:val="left"/>
+            </w:pPr>
+            <w:r/>
+            <w:r>
+              <w:rPr>
+                <w:rFonts w:ascii="Calibri" w:hAnsi="Calibri" w:eastAsia="宋体"/>
+                <w:b w:val="0"/>
+                <w:color w:val="2D2D2D"/>
+                <w:sz w:val="21"/>
+              </w:rPr>
+              <w:t>双方各恢复 1 点血量，并为双方各增加 1 点防御</w:t>
+            </w:r>
+          </w:p>
+        </w:tc>
+        <w:tc>
+          <w:tcPr>
+            <w:tcW w:type="dxa" w:w="4139"/>
+            <w:tcBorders>
+              <w:top w:val="single" w:sz="4" w:space="0" w:color="8FAADC"/>
+              <w:left w:val="single" w:sz="4" w:space="0" w:color="8FAADC"/>
+              <w:bottom w:val="single" w:sz="4" w:space="0" w:color="8FAADC"/>
+              <w:right w:val="single" w:sz="4" w:space="0" w:color="8FAADC"/>
+            </w:tcBorders>
+            <w:tcMar>
+              <w:top w:w="40" w:type="dxa"/>
+              <w:left w:w="60" w:type="dxa"/>
+              <w:bottom w:w="40" w:type="dxa"/>
+              <w:right w:w="60" w:type="dxa"/>
+            </w:tcMar>
+            <w:vAlign w:val="center"/>
+            <w:shd w:val="clear" w:color="auto" w:fill="F7FAFC"/>
+          </w:tcPr>
+          <w:p>
+            <w:pPr>
+              <w:spacing w:before="0" w:after="0" w:line="259" w:lineRule="auto"/>
+              <w:jc w:val="left"/>
+            </w:pPr>
+            <w:r/>
+            <w:r>
+              <w:rPr>
+                <w:rFonts w:ascii="Calibri" w:hAnsi="Calibri" w:eastAsia="宋体"/>
+                <w:b w:val="0"/>
+                <w:color w:val="2D2D2D"/>
+                <w:sz w:val="21"/>
+              </w:rPr>
+              <w:t>姐妹左心：双奶 1+双盾 1；东家是双奶 2+双盾 1+减攻。举左半心。</w:t>
+            </w:r>
+          </w:p>
+        </w:tc>
+      </w:tr>
+      <w:tr>
+        <w:tc>
+          <w:tcPr>
+            <w:tcW w:type="dxa" w:w="1247"/>
+            <w:tcBorders>
+              <w:top w:val="single" w:sz="4" w:space="0" w:color="8FAADC"/>
+              <w:left w:val="single" w:sz="4" w:space="0" w:color="8FAADC"/>
+              <w:bottom w:val="single" w:sz="4" w:space="0" w:color="8FAADC"/>
+              <w:right w:val="single" w:sz="4" w:space="0" w:color="8FAADC"/>
+            </w:tcBorders>
+            <w:tcMar>
+              <w:top w:w="40" w:type="dxa"/>
+              <w:left w:w="60" w:type="dxa"/>
+              <w:bottom w:w="40" w:type="dxa"/>
+              <w:right w:w="60" w:type="dxa"/>
+            </w:tcMar>
+            <w:vAlign w:val="center"/>
+          </w:tcPr>
+          <w:p>
+            <w:pPr>
+              <w:spacing w:before="0" w:after="0" w:line="259" w:lineRule="auto"/>
+              <w:jc w:val="center"/>
+            </w:pPr>
+            <w:r/>
+            <w:r>
+              <w:rPr>
+                <w:rFonts w:ascii="Calibri" w:hAnsi="Calibri" w:eastAsia="宋体"/>
+                <w:b w:val="0"/>
+                <w:color w:val="2D2D2D"/>
+                <w:sz w:val="21"/>
+              </w:rPr>
+              <w:t>S-33</w:t>
+            </w:r>
+          </w:p>
+        </w:tc>
+        <w:tc>
+          <w:tcPr>
+            <w:tcW w:type="dxa" w:w="1474"/>
+            <w:tcBorders>
+              <w:top w:val="single" w:sz="4" w:space="0" w:color="8FAADC"/>
+              <w:left w:val="single" w:sz="4" w:space="0" w:color="8FAADC"/>
+              <w:bottom w:val="single" w:sz="4" w:space="0" w:color="8FAADC"/>
+              <w:right w:val="single" w:sz="4" w:space="0" w:color="8FAADC"/>
+            </w:tcBorders>
+            <w:tcMar>
+              <w:top w:w="40" w:type="dxa"/>
+              <w:left w:w="60" w:type="dxa"/>
+              <w:bottom w:w="40" w:type="dxa"/>
+              <w:right w:w="60" w:type="dxa"/>
+            </w:tcMar>
+            <w:vAlign w:val="center"/>
+          </w:tcPr>
+          <w:p>
+            <w:pPr>
+              <w:spacing w:before="0" w:after="0" w:line="259" w:lineRule="auto"/>
+              <w:jc w:val="left"/>
+            </w:pPr>
+            <w:r/>
+            <w:r>
+              <w:rPr>
+                <w:rFonts w:ascii="Calibri" w:hAnsi="Calibri" w:eastAsia="宋体"/>
+                <w:b w:val="0"/>
+                <w:color w:val="2D2D2D"/>
+                <w:sz w:val="21"/>
+              </w:rPr>
+              <w:t>结契商</w:t>
+            </w:r>
+          </w:p>
+        </w:tc>
+        <w:tc>
+          <w:tcPr>
+            <w:tcW w:type="dxa" w:w="850"/>
+            <w:tcBorders>
+              <w:top w:val="single" w:sz="4" w:space="0" w:color="8FAADC"/>
+              <w:left w:val="single" w:sz="4" w:space="0" w:color="8FAADC"/>
+              <w:bottom w:val="single" w:sz="4" w:space="0" w:color="8FAADC"/>
+              <w:right w:val="single" w:sz="4" w:space="0" w:color="8FAADC"/>
+            </w:tcBorders>
+            <w:tcMar>
+              <w:top w:w="40" w:type="dxa"/>
+              <w:left w:w="60" w:type="dxa"/>
+              <w:bottom w:w="40" w:type="dxa"/>
+              <w:right w:w="60" w:type="dxa"/>
+            </w:tcMar>
+            <w:vAlign w:val="center"/>
+          </w:tcPr>
+          <w:p>
+            <w:pPr>
+              <w:spacing w:before="0" w:after="0" w:line="259" w:lineRule="auto"/>
+              <w:jc w:val="center"/>
+            </w:pPr>
+            <w:r/>
+            <w:r>
+              <w:rPr>
+                <w:rFonts w:ascii="Calibri" w:hAnsi="Calibri" w:eastAsia="宋体"/>
+                <w:b w:val="0"/>
+                <w:color w:val="2D2D2D"/>
+                <w:sz w:val="21"/>
+              </w:rPr>
+              <w:t>2</w:t>
+            </w:r>
+          </w:p>
+        </w:tc>
+        <w:tc>
+          <w:tcPr>
+            <w:tcW w:type="dxa" w:w="1020"/>
+            <w:tcBorders>
+              <w:top w:val="single" w:sz="4" w:space="0" w:color="8FAADC"/>
+              <w:left w:val="single" w:sz="4" w:space="0" w:color="8FAADC"/>
+              <w:bottom w:val="single" w:sz="4" w:space="0" w:color="8FAADC"/>
+              <w:right w:val="single" w:sz="4" w:space="0" w:color="8FAADC"/>
+            </w:tcBorders>
+            <w:tcMar>
+              <w:top w:w="40" w:type="dxa"/>
+              <w:left w:w="60" w:type="dxa"/>
+              <w:bottom w:w="40" w:type="dxa"/>
+              <w:right w:w="60" w:type="dxa"/>
+            </w:tcMar>
+            <w:vAlign w:val="center"/>
+          </w:tcPr>
+          <w:p>
+            <w:pPr>
+              <w:spacing w:before="0" w:after="0" w:line="259" w:lineRule="auto"/>
+              <w:jc w:val="center"/>
+            </w:pPr>
+            <w:r/>
+            <w:r>
+              <w:rPr>
+                <w:rFonts w:ascii="Calibri" w:hAnsi="Calibri" w:eastAsia="宋体"/>
+                <w:b w:val="0"/>
+                <w:color w:val="2D2D2D"/>
+                <w:sz w:val="21"/>
+              </w:rPr>
+              <w:t>治疗</w:t>
+            </w:r>
+          </w:p>
+        </w:tc>
+        <w:tc>
+          <w:tcPr>
+            <w:tcW w:type="dxa" w:w="4876"/>
+            <w:tcBorders>
+              <w:top w:val="single" w:sz="4" w:space="0" w:color="8FAADC"/>
+              <w:left w:val="single" w:sz="4" w:space="0" w:color="8FAADC"/>
+              <w:bottom w:val="single" w:sz="4" w:space="0" w:color="8FAADC"/>
+              <w:right w:val="single" w:sz="4" w:space="0" w:color="8FAADC"/>
+            </w:tcBorders>
+            <w:tcMar>
+              <w:top w:w="40" w:type="dxa"/>
+              <w:left w:w="60" w:type="dxa"/>
+              <w:bottom w:w="40" w:type="dxa"/>
+              <w:right w:w="60" w:type="dxa"/>
+            </w:tcMar>
+            <w:vAlign w:val="center"/>
+          </w:tcPr>
+          <w:p>
+            <w:pPr>
+              <w:spacing w:before="0" w:after="0" w:line="259" w:lineRule="auto"/>
+              <w:jc w:val="left"/>
+            </w:pPr>
+            <w:r/>
+            <w:r>
+              <w:rPr>
+                <w:rFonts w:ascii="Calibri" w:hAnsi="Calibri" w:eastAsia="宋体"/>
+                <w:b w:val="0"/>
+                <w:color w:val="2D2D2D"/>
+                <w:sz w:val="21"/>
+              </w:rPr>
+              <w:t>恢复一名玩家 2 点血量，下回合双方各恢复 1 点血量</w:t>
+            </w:r>
+          </w:p>
+        </w:tc>
+        <w:tc>
+          <w:tcPr>
+            <w:tcW w:type="dxa" w:w="4139"/>
+            <w:tcBorders>
+              <w:top w:val="single" w:sz="4" w:space="0" w:color="8FAADC"/>
+              <w:left w:val="single" w:sz="4" w:space="0" w:color="8FAADC"/>
+              <w:bottom w:val="single" w:sz="4" w:space="0" w:color="8FAADC"/>
+              <w:right w:val="single" w:sz="4" w:space="0" w:color="8FAADC"/>
+            </w:tcBorders>
+            <w:tcMar>
+              <w:top w:w="40" w:type="dxa"/>
+              <w:left w:w="60" w:type="dxa"/>
+              <w:bottom w:w="40" w:type="dxa"/>
+              <w:right w:w="60" w:type="dxa"/>
+            </w:tcMar>
+            <w:vAlign w:val="center"/>
+          </w:tcPr>
+          <w:p>
+            <w:pPr>
+              <w:spacing w:before="0" w:after="0" w:line="259" w:lineRule="auto"/>
+              <w:jc w:val="left"/>
+            </w:pPr>
+            <w:r/>
+            <w:r>
+              <w:rPr>
+                <w:rFonts w:ascii="Calibri" w:hAnsi="Calibri" w:eastAsia="宋体"/>
+                <w:b w:val="0"/>
+                <w:color w:val="2D2D2D"/>
+                <w:sz w:val="21"/>
+              </w:rPr>
+              <w:t>姐妹右心：任意奶 2+下回合双奶 1；津埠主是双奶 1+下回合双奶 2。举右半心。</w:t>
+            </w:r>
+          </w:p>
+        </w:tc>
+      </w:tr>
+      <w:tr>
+        <w:tc>
+          <w:tcPr>
+            <w:tcW w:type="dxa" w:w="1247"/>
+            <w:tcBorders>
+              <w:top w:val="single" w:sz="4" w:space="0" w:color="8FAADC"/>
+              <w:left w:val="single" w:sz="4" w:space="0" w:color="8FAADC"/>
+              <w:bottom w:val="single" w:sz="4" w:space="0" w:color="8FAADC"/>
+              <w:right w:val="single" w:sz="4" w:space="0" w:color="8FAADC"/>
+            </w:tcBorders>
+            <w:tcMar>
+              <w:top w:w="40" w:type="dxa"/>
+              <w:left w:w="60" w:type="dxa"/>
+              <w:bottom w:w="40" w:type="dxa"/>
+              <w:right w:w="60" w:type="dxa"/>
+            </w:tcMar>
+            <w:vAlign w:val="center"/>
+            <w:shd w:val="clear" w:color="auto" w:fill="F7FAFC"/>
+          </w:tcPr>
+          <w:p>
+            <w:pPr>
+              <w:spacing w:before="0" w:after="0" w:line="259" w:lineRule="auto"/>
+              <w:jc w:val="center"/>
+            </w:pPr>
+            <w:r/>
+            <w:r>
+              <w:rPr>
+                <w:rFonts w:ascii="Calibri" w:hAnsi="Calibri" w:eastAsia="宋体"/>
+                <w:b w:val="0"/>
+                <w:color w:val="2D2D2D"/>
+                <w:sz w:val="21"/>
+              </w:rPr>
+              <w:t>S-34</w:t>
+            </w:r>
+          </w:p>
+        </w:tc>
+        <w:tc>
+          <w:tcPr>
+            <w:tcW w:type="dxa" w:w="1474"/>
+            <w:tcBorders>
+              <w:top w:val="single" w:sz="4" w:space="0" w:color="8FAADC"/>
+              <w:left w:val="single" w:sz="4" w:space="0" w:color="8FAADC"/>
+              <w:bottom w:val="single" w:sz="4" w:space="0" w:color="8FAADC"/>
+              <w:right w:val="single" w:sz="4" w:space="0" w:color="8FAADC"/>
+            </w:tcBorders>
+            <w:tcMar>
+              <w:top w:w="40" w:type="dxa"/>
+              <w:left w:w="60" w:type="dxa"/>
+              <w:bottom w:w="40" w:type="dxa"/>
+              <w:right w:w="60" w:type="dxa"/>
+            </w:tcMar>
+            <w:vAlign w:val="center"/>
+            <w:shd w:val="clear" w:color="auto" w:fill="F7FAFC"/>
+          </w:tcPr>
+          <w:p>
+            <w:pPr>
+              <w:spacing w:before="0" w:after="0" w:line="259" w:lineRule="auto"/>
+              <w:jc w:val="left"/>
+            </w:pPr>
+            <w:r/>
+            <w:r>
+              <w:rPr>
+                <w:rFonts w:ascii="Calibri" w:hAnsi="Calibri" w:eastAsia="宋体"/>
+                <w:b w:val="0"/>
+                <w:color w:val="2D2D2D"/>
+                <w:sz w:val="21"/>
+              </w:rPr>
+              <w:t>蜜糕商</w:t>
+            </w:r>
+          </w:p>
+        </w:tc>
+        <w:tc>
+          <w:tcPr>
+            <w:tcW w:type="dxa" w:w="850"/>
+            <w:tcBorders>
+              <w:top w:val="single" w:sz="4" w:space="0" w:color="8FAADC"/>
+              <w:left w:val="single" w:sz="4" w:space="0" w:color="8FAADC"/>
+              <w:bottom w:val="single" w:sz="4" w:space="0" w:color="8FAADC"/>
+              <w:right w:val="single" w:sz="4" w:space="0" w:color="8FAADC"/>
+            </w:tcBorders>
+            <w:tcMar>
+              <w:top w:w="40" w:type="dxa"/>
+              <w:left w:w="60" w:type="dxa"/>
+              <w:bottom w:w="40" w:type="dxa"/>
+              <w:right w:w="60" w:type="dxa"/>
+            </w:tcMar>
+            <w:vAlign w:val="center"/>
+            <w:shd w:val="clear" w:color="auto" w:fill="F7FAFC"/>
+          </w:tcPr>
+          <w:p>
+            <w:pPr>
+              <w:spacing w:before="0" w:after="0" w:line="259" w:lineRule="auto"/>
+              <w:jc w:val="center"/>
+            </w:pPr>
+            <w:r/>
+            <w:r>
+              <w:rPr>
+                <w:rFonts w:ascii="Calibri" w:hAnsi="Calibri" w:eastAsia="宋体"/>
+                <w:b w:val="0"/>
+                <w:color w:val="2D2D2D"/>
+                <w:sz w:val="21"/>
+              </w:rPr>
+              <w:t>1</w:t>
+            </w:r>
+          </w:p>
+        </w:tc>
+        <w:tc>
+          <w:tcPr>
+            <w:tcW w:type="dxa" w:w="1020"/>
+            <w:tcBorders>
+              <w:top w:val="single" w:sz="4" w:space="0" w:color="8FAADC"/>
+              <w:left w:val="single" w:sz="4" w:space="0" w:color="8FAADC"/>
+              <w:bottom w:val="single" w:sz="4" w:space="0" w:color="8FAADC"/>
+              <w:right w:val="single" w:sz="4" w:space="0" w:color="8FAADC"/>
+            </w:tcBorders>
+            <w:tcMar>
+              <w:top w:w="40" w:type="dxa"/>
+              <w:left w:w="60" w:type="dxa"/>
+              <w:bottom w:w="40" w:type="dxa"/>
+              <w:right w:w="60" w:type="dxa"/>
+            </w:tcMar>
+            <w:vAlign w:val="center"/>
+            <w:shd w:val="clear" w:color="auto" w:fill="F7FAFC"/>
+          </w:tcPr>
+          <w:p>
+            <w:pPr>
+              <w:spacing w:before="0" w:after="0" w:line="259" w:lineRule="auto"/>
+              <w:jc w:val="center"/>
+            </w:pPr>
+            <w:r/>
+            <w:r>
+              <w:rPr>
+                <w:rFonts w:ascii="Calibri" w:hAnsi="Calibri" w:eastAsia="宋体"/>
+                <w:b w:val="0"/>
+                <w:color w:val="2D2D2D"/>
+                <w:sz w:val="21"/>
+              </w:rPr>
+              <w:t>治疗</w:t>
+            </w:r>
+          </w:p>
+        </w:tc>
+        <w:tc>
+          <w:tcPr>
+            <w:tcW w:type="dxa" w:w="4876"/>
+            <w:tcBorders>
+              <w:top w:val="single" w:sz="4" w:space="0" w:color="8FAADC"/>
+              <w:left w:val="single" w:sz="4" w:space="0" w:color="8FAADC"/>
+              <w:bottom w:val="single" w:sz="4" w:space="0" w:color="8FAADC"/>
+              <w:right w:val="single" w:sz="4" w:space="0" w:color="8FAADC"/>
+            </w:tcBorders>
+            <w:tcMar>
+              <w:top w:w="40" w:type="dxa"/>
+              <w:left w:w="60" w:type="dxa"/>
+              <w:bottom w:w="40" w:type="dxa"/>
+              <w:right w:w="60" w:type="dxa"/>
+            </w:tcMar>
+            <w:vAlign w:val="center"/>
+            <w:shd w:val="clear" w:color="auto" w:fill="F7FAFC"/>
+          </w:tcPr>
+          <w:p>
+            <w:pPr>
+              <w:spacing w:before="0" w:after="0" w:line="259" w:lineRule="auto"/>
+              <w:jc w:val="left"/>
+            </w:pPr>
+            <w:r/>
+            <w:r>
+              <w:rPr>
+                <w:rFonts w:ascii="Calibri" w:hAnsi="Calibri" w:eastAsia="宋体"/>
+                <w:b w:val="0"/>
+                <w:color w:val="2D2D2D"/>
+                <w:sz w:val="21"/>
+              </w:rPr>
+              <w:t>恢复自己 1 点血量，并为一名玩家增加 2 点防御</w:t>
+            </w:r>
+          </w:p>
+        </w:tc>
+        <w:tc>
+          <w:tcPr>
+            <w:tcW w:type="dxa" w:w="4139"/>
+            <w:tcBorders>
+              <w:top w:val="single" w:sz="4" w:space="0" w:color="8FAADC"/>
+              <w:left w:val="single" w:sz="4" w:space="0" w:color="8FAADC"/>
+              <w:bottom w:val="single" w:sz="4" w:space="0" w:color="8FAADC"/>
+              <w:right w:val="single" w:sz="4" w:space="0" w:color="8FAADC"/>
+            </w:tcBorders>
+            <w:tcMar>
+              <w:top w:w="40" w:type="dxa"/>
+              <w:left w:w="60" w:type="dxa"/>
+              <w:bottom w:w="40" w:type="dxa"/>
+              <w:right w:w="60" w:type="dxa"/>
+            </w:tcMar>
+            <w:vAlign w:val="center"/>
+            <w:shd w:val="clear" w:color="auto" w:fill="F7FAFC"/>
+          </w:tcPr>
+          <w:p>
+            <w:pPr>
+              <w:spacing w:before="0" w:after="0" w:line="259" w:lineRule="auto"/>
+              <w:jc w:val="left"/>
+            </w:pPr>
+            <w:r/>
+            <w:r>
+              <w:rPr>
+                <w:rFonts w:ascii="Calibri" w:hAnsi="Calibri" w:eastAsia="宋体"/>
+                <w:b w:val="0"/>
+                <w:color w:val="2D2D2D"/>
+                <w:sz w:val="21"/>
+              </w:rPr>
+              <w:t>分糕贺客：自奶 1+任意盾 2；司历官是自奶 2+任意盾 1。举糕比耶。</w:t>
+            </w:r>
+          </w:p>
+        </w:tc>
+      </w:tr>
+    </w:tbl>
+    <w:p>
+      <w:pPr>
+        <w:spacing w:before="200" w:after="160"/>
+      </w:pPr>
+      <w:r>
+        <w:rPr>
+          <w:rFonts w:ascii="Calibri" w:hAnsi="Calibri" w:eastAsia="微软雅黑"/>
+          <w:b/>
+          <w:color w:val="2E75B6"/>
+          <w:sz w:val="26"/>
+        </w:rPr>
+        <w:t>采购 P-21～P-25</w:t>
+      </w:r>
+    </w:p>
+    <w:p>
+      <w:pPr>
+        <w:spacing w:before="40" w:after="80" w:line="300" w:lineRule="auto"/>
+      </w:pPr>
+      <w:r>
+        <w:rPr>
+          <w:rFonts w:ascii="Calibri" w:hAnsi="Calibri" w:eastAsia="宋体"/>
+          <w:b w:val="0"/>
+          <w:color w:val="333333"/>
+          <w:sz w:val="22"/>
+        </w:rPr>
+        <w:t>中世纪办货。不替换现有采购卡面。</w:t>
+      </w:r>
+    </w:p>
+    <w:tbl>
+      <w:tblPr>
+        <w:tblW w:type="auto" w:w="0"/>
+        <w:jc w:val="center"/>
+        <w:tblLook w:firstColumn="1" w:firstRow="1" w:lastColumn="0" w:lastRow="0" w:noHBand="0" w:noVBand="1" w:val="04A0"/>
+        <w:tblW w:w="5000" w:type="pct"/>
+      </w:tblPr>
+      <w:tblGrid>
+        <w:gridCol w:w="2375"/>
+        <w:gridCol w:w="2375"/>
+        <w:gridCol w:w="2375"/>
+        <w:gridCol w:w="2375"/>
+        <w:gridCol w:w="2375"/>
+        <w:gridCol w:w="2375"/>
+      </w:tblGrid>
+      <w:tr>
+        <w:tc>
+          <w:tcPr>
+            <w:tcW w:type="dxa" w:w="1247"/>
+            <w:shd w:val="clear" w:color="auto" w:fill="E2EFDA"/>
+            <w:tcBorders>
+              <w:top w:val="single" w:sz="4" w:space="0" w:color="8FAADC"/>
+              <w:left w:val="single" w:sz="4" w:space="0" w:color="8FAADC"/>
+              <w:bottom w:val="single" w:sz="4" w:space="0" w:color="8FAADC"/>
+              <w:right w:val="single" w:sz="4" w:space="0" w:color="8FAADC"/>
+            </w:tcBorders>
+            <w:tcMar>
+              <w:top w:w="40" w:type="dxa"/>
+              <w:left w:w="60" w:type="dxa"/>
+              <w:bottom w:w="40" w:type="dxa"/>
+              <w:right w:w="60" w:type="dxa"/>
+            </w:tcMar>
+            <w:vAlign w:val="center"/>
+          </w:tcPr>
+          <w:p>
+            <w:pPr>
+              <w:spacing w:before="0" w:after="0" w:line="259" w:lineRule="auto"/>
+              <w:jc w:val="center"/>
+            </w:pPr>
+            <w:r/>
+            <w:r>
+              <w:rPr>
+                <w:rFonts w:ascii="Calibri" w:hAnsi="Calibri" w:eastAsia="微软雅黑"/>
+                <w:b/>
+                <w:i/>
+                <w:color w:val="C00000"/>
+                <w:sz w:val="21"/>
+              </w:rPr>
+              <w:t>编号</w:t>
+            </w:r>
+          </w:p>
+        </w:tc>
+        <w:tc>
+          <w:tcPr>
+            <w:tcW w:type="dxa" w:w="1474"/>
+            <w:shd w:val="clear" w:color="auto" w:fill="E2EFDA"/>
+            <w:tcBorders>
+              <w:top w:val="single" w:sz="4" w:space="0" w:color="8FAADC"/>
+              <w:left w:val="single" w:sz="4" w:space="0" w:color="8FAADC"/>
+              <w:bottom w:val="single" w:sz="4" w:space="0" w:color="8FAADC"/>
+              <w:right w:val="single" w:sz="4" w:space="0" w:color="8FAADC"/>
+            </w:tcBorders>
+            <w:tcMar>
+              <w:top w:w="40" w:type="dxa"/>
+              <w:left w:w="60" w:type="dxa"/>
+              <w:bottom w:w="40" w:type="dxa"/>
+              <w:right w:w="60" w:type="dxa"/>
+            </w:tcMar>
+            <w:vAlign w:val="center"/>
+          </w:tcPr>
+          <w:p>
+            <w:pPr>
+              <w:spacing w:before="0" w:after="0" w:line="259" w:lineRule="auto"/>
+              <w:jc w:val="center"/>
+            </w:pPr>
+            <w:r/>
+            <w:r>
+              <w:rPr>
+                <w:rFonts w:ascii="Calibri" w:hAnsi="Calibri" w:eastAsia="微软雅黑"/>
+                <w:b/>
+                <w:i/>
+                <w:color w:val="C00000"/>
+                <w:sz w:val="21"/>
+              </w:rPr>
+              <w:t>名称</w:t>
+            </w:r>
+          </w:p>
+        </w:tc>
+        <w:tc>
+          <w:tcPr>
+            <w:tcW w:type="dxa" w:w="850"/>
+            <w:shd w:val="clear" w:color="auto" w:fill="E2EFDA"/>
+            <w:tcBorders>
+              <w:top w:val="single" w:sz="4" w:space="0" w:color="8FAADC"/>
+              <w:left w:val="single" w:sz="4" w:space="0" w:color="8FAADC"/>
+              <w:bottom w:val="single" w:sz="4" w:space="0" w:color="8FAADC"/>
+              <w:right w:val="single" w:sz="4" w:space="0" w:color="8FAADC"/>
+            </w:tcBorders>
+            <w:tcMar>
+              <w:top w:w="40" w:type="dxa"/>
+              <w:left w:w="60" w:type="dxa"/>
+              <w:bottom w:w="40" w:type="dxa"/>
+              <w:right w:w="60" w:type="dxa"/>
+            </w:tcMar>
+            <w:vAlign w:val="center"/>
+          </w:tcPr>
+          <w:p>
+            <w:pPr>
+              <w:spacing w:before="0" w:after="0" w:line="259" w:lineRule="auto"/>
+              <w:jc w:val="center"/>
+            </w:pPr>
+            <w:r/>
+            <w:r>
+              <w:rPr>
+                <w:rFonts w:ascii="Calibri" w:hAnsi="Calibri" w:eastAsia="微软雅黑"/>
+                <w:b/>
+                <w:i/>
+                <w:color w:val="C00000"/>
+                <w:sz w:val="21"/>
+              </w:rPr>
+              <w:t>费用</w:t>
+            </w:r>
+          </w:p>
+        </w:tc>
+        <w:tc>
+          <w:tcPr>
+            <w:tcW w:type="dxa" w:w="1020"/>
+            <w:shd w:val="clear" w:color="auto" w:fill="E2EFDA"/>
+            <w:tcBorders>
+              <w:top w:val="single" w:sz="4" w:space="0" w:color="8FAADC"/>
+              <w:left w:val="single" w:sz="4" w:space="0" w:color="8FAADC"/>
+              <w:bottom w:val="single" w:sz="4" w:space="0" w:color="8FAADC"/>
+              <w:right w:val="single" w:sz="4" w:space="0" w:color="8FAADC"/>
+            </w:tcBorders>
+            <w:tcMar>
+              <w:top w:w="40" w:type="dxa"/>
+              <w:left w:w="60" w:type="dxa"/>
+              <w:bottom w:w="40" w:type="dxa"/>
+              <w:right w:w="60" w:type="dxa"/>
+            </w:tcMar>
+            <w:vAlign w:val="center"/>
+          </w:tcPr>
+          <w:p>
+            <w:pPr>
+              <w:spacing w:before="0" w:after="0" w:line="259" w:lineRule="auto"/>
+              <w:jc w:val="center"/>
+            </w:pPr>
+            <w:r/>
+            <w:r>
+              <w:rPr>
+                <w:rFonts w:ascii="Calibri" w:hAnsi="Calibri" w:eastAsia="微软雅黑"/>
+                <w:b/>
+                <w:i/>
+                <w:color w:val="C00000"/>
+                <w:sz w:val="21"/>
+              </w:rPr>
+              <w:t>类型</w:t>
+            </w:r>
+          </w:p>
+        </w:tc>
+        <w:tc>
+          <w:tcPr>
+            <w:tcW w:type="dxa" w:w="4876"/>
+            <w:shd w:val="clear" w:color="auto" w:fill="E2EFDA"/>
+            <w:tcBorders>
+              <w:top w:val="single" w:sz="4" w:space="0" w:color="8FAADC"/>
+              <w:left w:val="single" w:sz="4" w:space="0" w:color="8FAADC"/>
+              <w:bottom w:val="single" w:sz="4" w:space="0" w:color="8FAADC"/>
+              <w:right w:val="single" w:sz="4" w:space="0" w:color="8FAADC"/>
+            </w:tcBorders>
+            <w:tcMar>
+              <w:top w:w="40" w:type="dxa"/>
+              <w:left w:w="60" w:type="dxa"/>
+              <w:bottom w:w="40" w:type="dxa"/>
+              <w:right w:w="60" w:type="dxa"/>
+            </w:tcMar>
+            <w:vAlign w:val="center"/>
+          </w:tcPr>
+          <w:p>
+            <w:pPr>
+              <w:spacing w:before="0" w:after="0" w:line="259" w:lineRule="auto"/>
+              <w:jc w:val="center"/>
+            </w:pPr>
+            <w:r/>
+            <w:r>
+              <w:rPr>
+                <w:rFonts w:ascii="Calibri" w:hAnsi="Calibri" w:eastAsia="微软雅黑"/>
+                <w:b/>
+                <w:i/>
+                <w:color w:val="C00000"/>
+                <w:sz w:val="21"/>
+              </w:rPr>
+              <w:t>专属效果</w:t>
+            </w:r>
+          </w:p>
+        </w:tc>
+        <w:tc>
+          <w:tcPr>
+            <w:tcW w:type="dxa" w:w="4139"/>
+            <w:shd w:val="clear" w:color="auto" w:fill="E2EFDA"/>
+            <w:tcBorders>
+              <w:top w:val="single" w:sz="4" w:space="0" w:color="8FAADC"/>
+              <w:left w:val="single" w:sz="4" w:space="0" w:color="8FAADC"/>
+              <w:bottom w:val="single" w:sz="4" w:space="0" w:color="8FAADC"/>
+              <w:right w:val="single" w:sz="4" w:space="0" w:color="8FAADC"/>
+            </w:tcBorders>
+            <w:tcMar>
+              <w:top w:w="40" w:type="dxa"/>
+              <w:left w:w="60" w:type="dxa"/>
+              <w:bottom w:w="40" w:type="dxa"/>
+              <w:right w:w="60" w:type="dxa"/>
+            </w:tcMar>
+            <w:vAlign w:val="center"/>
+          </w:tcPr>
+          <w:p>
+            <w:pPr>
+              <w:spacing w:before="0" w:after="0" w:line="259" w:lineRule="auto"/>
+              <w:jc w:val="center"/>
+            </w:pPr>
+            <w:r/>
+            <w:r>
+              <w:rPr>
+                <w:rFonts w:ascii="Calibri" w:hAnsi="Calibri" w:eastAsia="微软雅黑"/>
+                <w:b/>
+                <w:i/>
+                <w:color w:val="C00000"/>
+                <w:sz w:val="21"/>
+              </w:rPr>
+              <w:t>设计说明</w:t>
+            </w:r>
+          </w:p>
+        </w:tc>
+      </w:tr>
+      <w:tr>
+        <w:tc>
+          <w:tcPr>
+            <w:tcW w:type="dxa" w:w="1247"/>
+            <w:tcBorders>
+              <w:top w:val="single" w:sz="4" w:space="0" w:color="8FAADC"/>
+              <w:left w:val="single" w:sz="4" w:space="0" w:color="8FAADC"/>
+              <w:bottom w:val="single" w:sz="4" w:space="0" w:color="8FAADC"/>
+              <w:right w:val="single" w:sz="4" w:space="0" w:color="8FAADC"/>
+            </w:tcBorders>
+            <w:tcMar>
+              <w:top w:w="40" w:type="dxa"/>
+              <w:left w:w="60" w:type="dxa"/>
+              <w:bottom w:w="40" w:type="dxa"/>
+              <w:right w:w="60" w:type="dxa"/>
+            </w:tcMar>
+            <w:vAlign w:val="center"/>
+          </w:tcPr>
+          <w:p>
+            <w:pPr>
+              <w:spacing w:before="0" w:after="0" w:line="259" w:lineRule="auto"/>
+              <w:jc w:val="center"/>
+            </w:pPr>
+            <w:r/>
+            <w:r>
+              <w:rPr>
+                <w:rFonts w:ascii="Calibri" w:hAnsi="Calibri" w:eastAsia="宋体"/>
+                <w:b w:val="0"/>
+                <w:color w:val="2D2D2D"/>
+                <w:sz w:val="21"/>
+              </w:rPr>
+              <w:t>P-21</w:t>
+            </w:r>
+          </w:p>
+        </w:tc>
+        <w:tc>
+          <w:tcPr>
+            <w:tcW w:type="dxa" w:w="1474"/>
+            <w:tcBorders>
+              <w:top w:val="single" w:sz="4" w:space="0" w:color="8FAADC"/>
+              <w:left w:val="single" w:sz="4" w:space="0" w:color="8FAADC"/>
+              <w:bottom w:val="single" w:sz="4" w:space="0" w:color="8FAADC"/>
+              <w:right w:val="single" w:sz="4" w:space="0" w:color="8FAADC"/>
+            </w:tcBorders>
+            <w:tcMar>
+              <w:top w:w="40" w:type="dxa"/>
+              <w:left w:w="60" w:type="dxa"/>
+              <w:bottom w:w="40" w:type="dxa"/>
+              <w:right w:w="60" w:type="dxa"/>
+            </w:tcMar>
+            <w:vAlign w:val="center"/>
+          </w:tcPr>
+          <w:p>
+            <w:pPr>
+              <w:spacing w:before="0" w:after="0" w:line="259" w:lineRule="auto"/>
+              <w:jc w:val="left"/>
+            </w:pPr>
+            <w:r/>
+            <w:r>
+              <w:rPr>
+                <w:rFonts w:ascii="Calibri" w:hAnsi="Calibri" w:eastAsia="宋体"/>
+                <w:b w:val="0"/>
+                <w:color w:val="2D2D2D"/>
+                <w:sz w:val="21"/>
+              </w:rPr>
+              <w:t>货栈采办</w:t>
+            </w:r>
+          </w:p>
+        </w:tc>
+        <w:tc>
+          <w:tcPr>
+            <w:tcW w:type="dxa" w:w="850"/>
+            <w:tcBorders>
+              <w:top w:val="single" w:sz="4" w:space="0" w:color="8FAADC"/>
+              <w:left w:val="single" w:sz="4" w:space="0" w:color="8FAADC"/>
+              <w:bottom w:val="single" w:sz="4" w:space="0" w:color="8FAADC"/>
+              <w:right w:val="single" w:sz="4" w:space="0" w:color="8FAADC"/>
+            </w:tcBorders>
+            <w:tcMar>
+              <w:top w:w="40" w:type="dxa"/>
+              <w:left w:w="60" w:type="dxa"/>
+              <w:bottom w:w="40" w:type="dxa"/>
+              <w:right w:w="60" w:type="dxa"/>
+            </w:tcMar>
+            <w:vAlign w:val="center"/>
+          </w:tcPr>
+          <w:p>
+            <w:pPr>
+              <w:spacing w:before="0" w:after="0" w:line="259" w:lineRule="auto"/>
+              <w:jc w:val="center"/>
+            </w:pPr>
+            <w:r/>
+            <w:r>
+              <w:rPr>
+                <w:rFonts w:ascii="Calibri" w:hAnsi="Calibri" w:eastAsia="宋体"/>
+                <w:b w:val="0"/>
+                <w:color w:val="2D2D2D"/>
+                <w:sz w:val="21"/>
+              </w:rPr>
+              <w:t>1</w:t>
+            </w:r>
+          </w:p>
+        </w:tc>
+        <w:tc>
+          <w:tcPr>
+            <w:tcW w:type="dxa" w:w="1020"/>
+            <w:tcBorders>
+              <w:top w:val="single" w:sz="4" w:space="0" w:color="8FAADC"/>
+              <w:left w:val="single" w:sz="4" w:space="0" w:color="8FAADC"/>
+              <w:bottom w:val="single" w:sz="4" w:space="0" w:color="8FAADC"/>
+              <w:right w:val="single" w:sz="4" w:space="0" w:color="8FAADC"/>
+            </w:tcBorders>
+            <w:tcMar>
+              <w:top w:w="40" w:type="dxa"/>
+              <w:left w:w="60" w:type="dxa"/>
+              <w:bottom w:w="40" w:type="dxa"/>
+              <w:right w:w="60" w:type="dxa"/>
+            </w:tcMar>
+            <w:vAlign w:val="center"/>
+          </w:tcPr>
+          <w:p>
+            <w:pPr>
+              <w:spacing w:before="0" w:after="0" w:line="259" w:lineRule="auto"/>
+              <w:jc w:val="center"/>
+            </w:pPr>
+            <w:r/>
+            <w:r>
+              <w:rPr>
+                <w:rFonts w:ascii="Calibri" w:hAnsi="Calibri" w:eastAsia="宋体"/>
+                <w:b w:val="0"/>
+                <w:color w:val="2D2D2D"/>
+                <w:sz w:val="21"/>
+              </w:rPr>
+              <w:t>防御</w:t>
+            </w:r>
+          </w:p>
+        </w:tc>
+        <w:tc>
+          <w:tcPr>
+            <w:tcW w:type="dxa" w:w="4876"/>
+            <w:tcBorders>
+              <w:top w:val="single" w:sz="4" w:space="0" w:color="8FAADC"/>
+              <w:left w:val="single" w:sz="4" w:space="0" w:color="8FAADC"/>
+              <w:bottom w:val="single" w:sz="4" w:space="0" w:color="8FAADC"/>
+              <w:right w:val="single" w:sz="4" w:space="0" w:color="8FAADC"/>
+            </w:tcBorders>
+            <w:tcMar>
+              <w:top w:w="40" w:type="dxa"/>
+              <w:left w:w="60" w:type="dxa"/>
+              <w:bottom w:w="40" w:type="dxa"/>
+              <w:right w:w="60" w:type="dxa"/>
+            </w:tcMar>
+            <w:vAlign w:val="center"/>
+          </w:tcPr>
+          <w:p>
+            <w:pPr>
+              <w:spacing w:before="0" w:after="0" w:line="259" w:lineRule="auto"/>
+              <w:jc w:val="left"/>
+            </w:pPr>
+            <w:r/>
+            <w:r>
+              <w:rPr>
+                <w:rFonts w:ascii="Calibri" w:hAnsi="Calibri" w:eastAsia="宋体"/>
+                <w:b w:val="0"/>
+                <w:color w:val="2D2D2D"/>
+                <w:sz w:val="21"/>
+              </w:rPr>
+              <w:t>为自己增加 1 点防御，下回合抽 1 张牌</w:t>
+            </w:r>
+          </w:p>
+        </w:tc>
+        <w:tc>
+          <w:tcPr>
+            <w:tcW w:type="dxa" w:w="4139"/>
+            <w:tcBorders>
+              <w:top w:val="single" w:sz="4" w:space="0" w:color="8FAADC"/>
+              <w:left w:val="single" w:sz="4" w:space="0" w:color="8FAADC"/>
+              <w:bottom w:val="single" w:sz="4" w:space="0" w:color="8FAADC"/>
+              <w:right w:val="single" w:sz="4" w:space="0" w:color="8FAADC"/>
+            </w:tcBorders>
+            <w:tcMar>
+              <w:top w:w="40" w:type="dxa"/>
+              <w:left w:w="60" w:type="dxa"/>
+              <w:bottom w:w="40" w:type="dxa"/>
+              <w:right w:w="60" w:type="dxa"/>
+            </w:tcMar>
+            <w:vAlign w:val="center"/>
+          </w:tcPr>
+          <w:p>
+            <w:pPr>
+              <w:spacing w:before="0" w:after="0" w:line="259" w:lineRule="auto"/>
+              <w:jc w:val="left"/>
+            </w:pPr>
+            <w:r/>
+            <w:r>
+              <w:rPr>
+                <w:rFonts w:ascii="Calibri" w:hAnsi="Calibri" w:eastAsia="宋体"/>
+                <w:b w:val="0"/>
+                <w:color w:val="2D2D2D"/>
+                <w:sz w:val="21"/>
+              </w:rPr>
+              <w:t>先守后点货：现自盾 1+下回合抽；望楼吏是现抽+下回合自盾 2。货栈笑迎。</w:t>
+            </w:r>
+          </w:p>
+        </w:tc>
+      </w:tr>
+      <w:tr>
+        <w:tc>
+          <w:tcPr>
+            <w:tcW w:type="dxa" w:w="1247"/>
+            <w:tcBorders>
+              <w:top w:val="single" w:sz="4" w:space="0" w:color="8FAADC"/>
+              <w:left w:val="single" w:sz="4" w:space="0" w:color="8FAADC"/>
+              <w:bottom w:val="single" w:sz="4" w:space="0" w:color="8FAADC"/>
+              <w:right w:val="single" w:sz="4" w:space="0" w:color="8FAADC"/>
+            </w:tcBorders>
+            <w:tcMar>
+              <w:top w:w="40" w:type="dxa"/>
+              <w:left w:w="60" w:type="dxa"/>
+              <w:bottom w:w="40" w:type="dxa"/>
+              <w:right w:w="60" w:type="dxa"/>
+            </w:tcMar>
+            <w:vAlign w:val="center"/>
+            <w:shd w:val="clear" w:color="auto" w:fill="F7FAFC"/>
+          </w:tcPr>
+          <w:p>
+            <w:pPr>
+              <w:spacing w:before="0" w:after="0" w:line="259" w:lineRule="auto"/>
+              <w:jc w:val="center"/>
+            </w:pPr>
+            <w:r/>
+            <w:r>
+              <w:rPr>
+                <w:rFonts w:ascii="Calibri" w:hAnsi="Calibri" w:eastAsia="宋体"/>
+                <w:b w:val="0"/>
+                <w:color w:val="2D2D2D"/>
+                <w:sz w:val="21"/>
+              </w:rPr>
+              <w:t>P-22</w:t>
+            </w:r>
+          </w:p>
+        </w:tc>
+        <w:tc>
+          <w:tcPr>
+            <w:tcW w:type="dxa" w:w="1474"/>
+            <w:tcBorders>
+              <w:top w:val="single" w:sz="4" w:space="0" w:color="8FAADC"/>
+              <w:left w:val="single" w:sz="4" w:space="0" w:color="8FAADC"/>
+              <w:bottom w:val="single" w:sz="4" w:space="0" w:color="8FAADC"/>
+              <w:right w:val="single" w:sz="4" w:space="0" w:color="8FAADC"/>
+            </w:tcBorders>
+            <w:tcMar>
+              <w:top w:w="40" w:type="dxa"/>
+              <w:left w:w="60" w:type="dxa"/>
+              <w:bottom w:w="40" w:type="dxa"/>
+              <w:right w:w="60" w:type="dxa"/>
+            </w:tcMar>
+            <w:vAlign w:val="center"/>
+            <w:shd w:val="clear" w:color="auto" w:fill="F7FAFC"/>
+          </w:tcPr>
+          <w:p>
+            <w:pPr>
+              <w:spacing w:before="0" w:after="0" w:line="259" w:lineRule="auto"/>
+              <w:jc w:val="left"/>
+            </w:pPr>
+            <w:r/>
+            <w:r>
+              <w:rPr>
+                <w:rFonts w:ascii="Calibri" w:hAnsi="Calibri" w:eastAsia="宋体"/>
+                <w:b w:val="0"/>
+                <w:color w:val="2D2D2D"/>
+                <w:sz w:val="21"/>
+              </w:rPr>
+              <w:t>罪市采买</w:t>
+            </w:r>
+          </w:p>
+        </w:tc>
+        <w:tc>
+          <w:tcPr>
+            <w:tcW w:type="dxa" w:w="850"/>
+            <w:tcBorders>
+              <w:top w:val="single" w:sz="4" w:space="0" w:color="8FAADC"/>
+              <w:left w:val="single" w:sz="4" w:space="0" w:color="8FAADC"/>
+              <w:bottom w:val="single" w:sz="4" w:space="0" w:color="8FAADC"/>
+              <w:right w:val="single" w:sz="4" w:space="0" w:color="8FAADC"/>
+            </w:tcBorders>
+            <w:tcMar>
+              <w:top w:w="40" w:type="dxa"/>
+              <w:left w:w="60" w:type="dxa"/>
+              <w:bottom w:w="40" w:type="dxa"/>
+              <w:right w:w="60" w:type="dxa"/>
+            </w:tcMar>
+            <w:vAlign w:val="center"/>
+            <w:shd w:val="clear" w:color="auto" w:fill="F7FAFC"/>
+          </w:tcPr>
+          <w:p>
+            <w:pPr>
+              <w:spacing w:before="0" w:after="0" w:line="259" w:lineRule="auto"/>
+              <w:jc w:val="center"/>
+            </w:pPr>
+            <w:r/>
+            <w:r>
+              <w:rPr>
+                <w:rFonts w:ascii="Calibri" w:hAnsi="Calibri" w:eastAsia="宋体"/>
+                <w:b w:val="0"/>
+                <w:color w:val="2D2D2D"/>
+                <w:sz w:val="21"/>
+              </w:rPr>
+              <w:t>2</w:t>
+            </w:r>
+          </w:p>
+        </w:tc>
+        <w:tc>
+          <w:tcPr>
+            <w:tcW w:type="dxa" w:w="1020"/>
+            <w:tcBorders>
+              <w:top w:val="single" w:sz="4" w:space="0" w:color="8FAADC"/>
+              <w:left w:val="single" w:sz="4" w:space="0" w:color="8FAADC"/>
+              <w:bottom w:val="single" w:sz="4" w:space="0" w:color="8FAADC"/>
+              <w:right w:val="single" w:sz="4" w:space="0" w:color="8FAADC"/>
+            </w:tcBorders>
+            <w:tcMar>
+              <w:top w:w="40" w:type="dxa"/>
+              <w:left w:w="60" w:type="dxa"/>
+              <w:bottom w:w="40" w:type="dxa"/>
+              <w:right w:w="60" w:type="dxa"/>
+            </w:tcMar>
+            <w:vAlign w:val="center"/>
+            <w:shd w:val="clear" w:color="auto" w:fill="F7FAFC"/>
+          </w:tcPr>
+          <w:p>
+            <w:pPr>
+              <w:spacing w:before="0" w:after="0" w:line="259" w:lineRule="auto"/>
+              <w:jc w:val="center"/>
+            </w:pPr>
+            <w:r/>
+            <w:r>
+              <w:rPr>
+                <w:rFonts w:ascii="Calibri" w:hAnsi="Calibri" w:eastAsia="宋体"/>
+                <w:b w:val="0"/>
+                <w:color w:val="2D2D2D"/>
+                <w:sz w:val="21"/>
+              </w:rPr>
+              <w:t>支援</w:t>
+            </w:r>
+          </w:p>
+        </w:tc>
+        <w:tc>
+          <w:tcPr>
+            <w:tcW w:type="dxa" w:w="4876"/>
+            <w:tcBorders>
+              <w:top w:val="single" w:sz="4" w:space="0" w:color="8FAADC"/>
+              <w:left w:val="single" w:sz="4" w:space="0" w:color="8FAADC"/>
+              <w:bottom w:val="single" w:sz="4" w:space="0" w:color="8FAADC"/>
+              <w:right w:val="single" w:sz="4" w:space="0" w:color="8FAADC"/>
+            </w:tcBorders>
+            <w:tcMar>
+              <w:top w:w="40" w:type="dxa"/>
+              <w:left w:w="60" w:type="dxa"/>
+              <w:bottom w:w="40" w:type="dxa"/>
+              <w:right w:w="60" w:type="dxa"/>
+            </w:tcMar>
+            <w:vAlign w:val="center"/>
+            <w:shd w:val="clear" w:color="auto" w:fill="F7FAFC"/>
+          </w:tcPr>
+          <w:p>
+            <w:pPr>
+              <w:spacing w:before="0" w:after="0" w:line="259" w:lineRule="auto"/>
+              <w:jc w:val="left"/>
+            </w:pPr>
+            <w:r/>
+            <w:r>
+              <w:rPr>
+                <w:rFonts w:ascii="Calibri" w:hAnsi="Calibri" w:eastAsia="宋体"/>
+                <w:b w:val="0"/>
+                <w:color w:val="2D2D2D"/>
+                <w:sz w:val="21"/>
+              </w:rPr>
+              <w:t>抽 1 张牌，本回合霸凌者攻击 -1，并为自己增加 1 点防御</w:t>
+            </w:r>
+          </w:p>
+        </w:tc>
+        <w:tc>
+          <w:tcPr>
+            <w:tcW w:type="dxa" w:w="4139"/>
+            <w:tcBorders>
+              <w:top w:val="single" w:sz="4" w:space="0" w:color="8FAADC"/>
+              <w:left w:val="single" w:sz="4" w:space="0" w:color="8FAADC"/>
+              <w:bottom w:val="single" w:sz="4" w:space="0" w:color="8FAADC"/>
+              <w:right w:val="single" w:sz="4" w:space="0" w:color="8FAADC"/>
+            </w:tcBorders>
+            <w:tcMar>
+              <w:top w:w="40" w:type="dxa"/>
+              <w:left w:w="60" w:type="dxa"/>
+              <w:bottom w:w="40" w:type="dxa"/>
+              <w:right w:w="60" w:type="dxa"/>
+            </w:tcMar>
+            <w:vAlign w:val="center"/>
+            <w:shd w:val="clear" w:color="auto" w:fill="F7FAFC"/>
+          </w:tcPr>
+          <w:p>
+            <w:pPr>
+              <w:spacing w:before="0" w:after="0" w:line="259" w:lineRule="auto"/>
+              <w:jc w:val="left"/>
+            </w:pPr>
+            <w:r/>
+            <w:r>
+              <w:rPr>
+                <w:rFonts w:ascii="Calibri" w:hAnsi="Calibri" w:eastAsia="宋体"/>
+                <w:b w:val="0"/>
+                <w:color w:val="2D2D2D"/>
+                <w:sz w:val="21"/>
+              </w:rPr>
+              <w:t>枷市压价：抽+减攻+自盾 1；皮货采买是抽+减攻+自盾 2。粉手套呆脸。</w:t>
+            </w:r>
+          </w:p>
+        </w:tc>
+      </w:tr>
+      <w:tr>
+        <w:tc>
+          <w:tcPr>
+            <w:tcW w:type="dxa" w:w="1247"/>
+            <w:tcBorders>
+              <w:top w:val="single" w:sz="4" w:space="0" w:color="8FAADC"/>
+              <w:left w:val="single" w:sz="4" w:space="0" w:color="8FAADC"/>
+              <w:bottom w:val="single" w:sz="4" w:space="0" w:color="8FAADC"/>
+              <w:right w:val="single" w:sz="4" w:space="0" w:color="8FAADC"/>
+            </w:tcBorders>
+            <w:tcMar>
+              <w:top w:w="40" w:type="dxa"/>
+              <w:left w:w="60" w:type="dxa"/>
+              <w:bottom w:w="40" w:type="dxa"/>
+              <w:right w:w="60" w:type="dxa"/>
+            </w:tcMar>
+            <w:vAlign w:val="center"/>
+          </w:tcPr>
+          <w:p>
+            <w:pPr>
+              <w:spacing w:before="0" w:after="0" w:line="259" w:lineRule="auto"/>
+              <w:jc w:val="center"/>
+            </w:pPr>
+            <w:r/>
+            <w:r>
+              <w:rPr>
+                <w:rFonts w:ascii="Calibri" w:hAnsi="Calibri" w:eastAsia="宋体"/>
+                <w:b w:val="0"/>
+                <w:color w:val="2D2D2D"/>
+                <w:sz w:val="21"/>
+              </w:rPr>
+              <w:t>P-23</w:t>
+            </w:r>
+          </w:p>
+        </w:tc>
+        <w:tc>
+          <w:tcPr>
+            <w:tcW w:type="dxa" w:w="1474"/>
+            <w:tcBorders>
+              <w:top w:val="single" w:sz="4" w:space="0" w:color="8FAADC"/>
+              <w:left w:val="single" w:sz="4" w:space="0" w:color="8FAADC"/>
+              <w:bottom w:val="single" w:sz="4" w:space="0" w:color="8FAADC"/>
+              <w:right w:val="single" w:sz="4" w:space="0" w:color="8FAADC"/>
+            </w:tcBorders>
+            <w:tcMar>
+              <w:top w:w="40" w:type="dxa"/>
+              <w:left w:w="60" w:type="dxa"/>
+              <w:bottom w:w="40" w:type="dxa"/>
+              <w:right w:w="60" w:type="dxa"/>
+            </w:tcMar>
+            <w:vAlign w:val="center"/>
+          </w:tcPr>
+          <w:p>
+            <w:pPr>
+              <w:spacing w:before="0" w:after="0" w:line="259" w:lineRule="auto"/>
+              <w:jc w:val="left"/>
+            </w:pPr>
+            <w:r/>
+            <w:r>
+              <w:rPr>
+                <w:rFonts w:ascii="Calibri" w:hAnsi="Calibri" w:eastAsia="宋体"/>
+                <w:b w:val="0"/>
+                <w:color w:val="2D2D2D"/>
+                <w:sz w:val="21"/>
+              </w:rPr>
+              <w:t>急脚办货</w:t>
+            </w:r>
+          </w:p>
+        </w:tc>
+        <w:tc>
+          <w:tcPr>
+            <w:tcW w:type="dxa" w:w="850"/>
+            <w:tcBorders>
+              <w:top w:val="single" w:sz="4" w:space="0" w:color="8FAADC"/>
+              <w:left w:val="single" w:sz="4" w:space="0" w:color="8FAADC"/>
+              <w:bottom w:val="single" w:sz="4" w:space="0" w:color="8FAADC"/>
+              <w:right w:val="single" w:sz="4" w:space="0" w:color="8FAADC"/>
+            </w:tcBorders>
+            <w:tcMar>
+              <w:top w:w="40" w:type="dxa"/>
+              <w:left w:w="60" w:type="dxa"/>
+              <w:bottom w:w="40" w:type="dxa"/>
+              <w:right w:w="60" w:type="dxa"/>
+            </w:tcMar>
+            <w:vAlign w:val="center"/>
+          </w:tcPr>
+          <w:p>
+            <w:pPr>
+              <w:spacing w:before="0" w:after="0" w:line="259" w:lineRule="auto"/>
+              <w:jc w:val="center"/>
+            </w:pPr>
+            <w:r/>
+            <w:r>
+              <w:rPr>
+                <w:rFonts w:ascii="Calibri" w:hAnsi="Calibri" w:eastAsia="宋体"/>
+                <w:b w:val="0"/>
+                <w:color w:val="2D2D2D"/>
+                <w:sz w:val="21"/>
+              </w:rPr>
+              <w:t>2</w:t>
+            </w:r>
+          </w:p>
+        </w:tc>
+        <w:tc>
+          <w:tcPr>
+            <w:tcW w:type="dxa" w:w="1020"/>
+            <w:tcBorders>
+              <w:top w:val="single" w:sz="4" w:space="0" w:color="8FAADC"/>
+              <w:left w:val="single" w:sz="4" w:space="0" w:color="8FAADC"/>
+              <w:bottom w:val="single" w:sz="4" w:space="0" w:color="8FAADC"/>
+              <w:right w:val="single" w:sz="4" w:space="0" w:color="8FAADC"/>
+            </w:tcBorders>
+            <w:tcMar>
+              <w:top w:w="40" w:type="dxa"/>
+              <w:left w:w="60" w:type="dxa"/>
+              <w:bottom w:w="40" w:type="dxa"/>
+              <w:right w:w="60" w:type="dxa"/>
+            </w:tcMar>
+            <w:vAlign w:val="center"/>
+          </w:tcPr>
+          <w:p>
+            <w:pPr>
+              <w:spacing w:before="0" w:after="0" w:line="259" w:lineRule="auto"/>
+              <w:jc w:val="center"/>
+            </w:pPr>
+            <w:r/>
+            <w:r>
+              <w:rPr>
+                <w:rFonts w:ascii="Calibri" w:hAnsi="Calibri" w:eastAsia="宋体"/>
+                <w:b w:val="0"/>
+                <w:color w:val="2D2D2D"/>
+                <w:sz w:val="21"/>
+              </w:rPr>
+              <w:t>攻击</w:t>
+            </w:r>
+          </w:p>
+        </w:tc>
+        <w:tc>
+          <w:tcPr>
+            <w:tcW w:type="dxa" w:w="4876"/>
+            <w:tcBorders>
+              <w:top w:val="single" w:sz="4" w:space="0" w:color="8FAADC"/>
+              <w:left w:val="single" w:sz="4" w:space="0" w:color="8FAADC"/>
+              <w:bottom w:val="single" w:sz="4" w:space="0" w:color="8FAADC"/>
+              <w:right w:val="single" w:sz="4" w:space="0" w:color="8FAADC"/>
+            </w:tcBorders>
+            <w:tcMar>
+              <w:top w:w="40" w:type="dxa"/>
+              <w:left w:w="60" w:type="dxa"/>
+              <w:bottom w:w="40" w:type="dxa"/>
+              <w:right w:w="60" w:type="dxa"/>
+            </w:tcMar>
+            <w:vAlign w:val="center"/>
+          </w:tcPr>
+          <w:p>
+            <w:pPr>
+              <w:spacing w:before="0" w:after="0" w:line="259" w:lineRule="auto"/>
+              <w:jc w:val="left"/>
+            </w:pPr>
+            <w:r/>
+            <w:r>
+              <w:rPr>
+                <w:rFonts w:ascii="Calibri" w:hAnsi="Calibri" w:eastAsia="宋体"/>
+                <w:b w:val="0"/>
+                <w:color w:val="2D2D2D"/>
+                <w:sz w:val="21"/>
+              </w:rPr>
+              <w:t>立即造成 2 点伤害，下回合抽 1 张牌</w:t>
+            </w:r>
+          </w:p>
+        </w:tc>
+        <w:tc>
+          <w:tcPr>
+            <w:tcW w:type="dxa" w:w="4139"/>
+            <w:tcBorders>
+              <w:top w:val="single" w:sz="4" w:space="0" w:color="8FAADC"/>
+              <w:left w:val="single" w:sz="4" w:space="0" w:color="8FAADC"/>
+              <w:bottom w:val="single" w:sz="4" w:space="0" w:color="8FAADC"/>
+              <w:right w:val="single" w:sz="4" w:space="0" w:color="8FAADC"/>
+            </w:tcBorders>
+            <w:tcMar>
+              <w:top w:w="40" w:type="dxa"/>
+              <w:left w:w="60" w:type="dxa"/>
+              <w:bottom w:w="40" w:type="dxa"/>
+              <w:right w:w="60" w:type="dxa"/>
+            </w:tcMar>
+            <w:vAlign w:val="center"/>
+          </w:tcPr>
+          <w:p>
+            <w:pPr>
+              <w:spacing w:before="0" w:after="0" w:line="259" w:lineRule="auto"/>
+              <w:jc w:val="left"/>
+            </w:pPr>
+            <w:r/>
+            <w:r>
+              <w:rPr>
+                <w:rFonts w:ascii="Calibri" w:hAnsi="Calibri" w:eastAsia="宋体"/>
+                <w:b w:val="0"/>
+                <w:color w:val="2D2D2D"/>
+                <w:sz w:val="21"/>
+              </w:rPr>
+              <w:t>急脚换货：伤 2 下回合抽 1；行商是伤 2 现抽，马帮客是伤 3 下回合抽，浑仪生是伤 2 下回合抽 2。眯眼喊市。</w:t>
+            </w:r>
+          </w:p>
+        </w:tc>
+      </w:tr>
+      <w:tr>
+        <w:tc>
+          <w:tcPr>
+            <w:tcW w:type="dxa" w:w="1247"/>
+            <w:tcBorders>
+              <w:top w:val="single" w:sz="4" w:space="0" w:color="8FAADC"/>
+              <w:left w:val="single" w:sz="4" w:space="0" w:color="8FAADC"/>
+              <w:bottom w:val="single" w:sz="4" w:space="0" w:color="8FAADC"/>
+              <w:right w:val="single" w:sz="4" w:space="0" w:color="8FAADC"/>
+            </w:tcBorders>
+            <w:tcMar>
+              <w:top w:w="40" w:type="dxa"/>
+              <w:left w:w="60" w:type="dxa"/>
+              <w:bottom w:w="40" w:type="dxa"/>
+              <w:right w:w="60" w:type="dxa"/>
+            </w:tcMar>
+            <w:vAlign w:val="center"/>
+            <w:shd w:val="clear" w:color="auto" w:fill="F7FAFC"/>
+          </w:tcPr>
+          <w:p>
+            <w:pPr>
+              <w:spacing w:before="0" w:after="0" w:line="259" w:lineRule="auto"/>
+              <w:jc w:val="center"/>
+            </w:pPr>
+            <w:r/>
+            <w:r>
+              <w:rPr>
+                <w:rFonts w:ascii="Calibri" w:hAnsi="Calibri" w:eastAsia="宋体"/>
+                <w:b w:val="0"/>
+                <w:color w:val="2D2D2D"/>
+                <w:sz w:val="21"/>
+              </w:rPr>
+              <w:t>P-24</w:t>
+            </w:r>
+          </w:p>
+        </w:tc>
+        <w:tc>
+          <w:tcPr>
+            <w:tcW w:type="dxa" w:w="1474"/>
+            <w:tcBorders>
+              <w:top w:val="single" w:sz="4" w:space="0" w:color="8FAADC"/>
+              <w:left w:val="single" w:sz="4" w:space="0" w:color="8FAADC"/>
+              <w:bottom w:val="single" w:sz="4" w:space="0" w:color="8FAADC"/>
+              <w:right w:val="single" w:sz="4" w:space="0" w:color="8FAADC"/>
+            </w:tcBorders>
+            <w:tcMar>
+              <w:top w:w="40" w:type="dxa"/>
+              <w:left w:w="60" w:type="dxa"/>
+              <w:bottom w:w="40" w:type="dxa"/>
+              <w:right w:w="60" w:type="dxa"/>
+            </w:tcMar>
+            <w:vAlign w:val="center"/>
+            <w:shd w:val="clear" w:color="auto" w:fill="F7FAFC"/>
+          </w:tcPr>
+          <w:p>
+            <w:pPr>
+              <w:spacing w:before="0" w:after="0" w:line="259" w:lineRule="auto"/>
+              <w:jc w:val="left"/>
+            </w:pPr>
+            <w:r/>
+            <w:r>
+              <w:rPr>
+                <w:rFonts w:ascii="Calibri" w:hAnsi="Calibri" w:eastAsia="宋体"/>
+                <w:b w:val="0"/>
+                <w:color w:val="2D2D2D"/>
+                <w:sz w:val="21"/>
+              </w:rPr>
+              <w:t>水驿采办</w:t>
+            </w:r>
+          </w:p>
+        </w:tc>
+        <w:tc>
+          <w:tcPr>
+            <w:tcW w:type="dxa" w:w="850"/>
+            <w:tcBorders>
+              <w:top w:val="single" w:sz="4" w:space="0" w:color="8FAADC"/>
+              <w:left w:val="single" w:sz="4" w:space="0" w:color="8FAADC"/>
+              <w:bottom w:val="single" w:sz="4" w:space="0" w:color="8FAADC"/>
+              <w:right w:val="single" w:sz="4" w:space="0" w:color="8FAADC"/>
+            </w:tcBorders>
+            <w:tcMar>
+              <w:top w:w="40" w:type="dxa"/>
+              <w:left w:w="60" w:type="dxa"/>
+              <w:bottom w:w="40" w:type="dxa"/>
+              <w:right w:w="60" w:type="dxa"/>
+            </w:tcMar>
+            <w:vAlign w:val="center"/>
+            <w:shd w:val="clear" w:color="auto" w:fill="F7FAFC"/>
+          </w:tcPr>
+          <w:p>
+            <w:pPr>
+              <w:spacing w:before="0" w:after="0" w:line="259" w:lineRule="auto"/>
+              <w:jc w:val="center"/>
+            </w:pPr>
+            <w:r/>
+            <w:r>
+              <w:rPr>
+                <w:rFonts w:ascii="Calibri" w:hAnsi="Calibri" w:eastAsia="宋体"/>
+                <w:b w:val="0"/>
+                <w:color w:val="2D2D2D"/>
+                <w:sz w:val="21"/>
+              </w:rPr>
+              <w:t>1</w:t>
+            </w:r>
+          </w:p>
+        </w:tc>
+        <w:tc>
+          <w:tcPr>
+            <w:tcW w:type="dxa" w:w="1020"/>
+            <w:tcBorders>
+              <w:top w:val="single" w:sz="4" w:space="0" w:color="8FAADC"/>
+              <w:left w:val="single" w:sz="4" w:space="0" w:color="8FAADC"/>
+              <w:bottom w:val="single" w:sz="4" w:space="0" w:color="8FAADC"/>
+              <w:right w:val="single" w:sz="4" w:space="0" w:color="8FAADC"/>
+            </w:tcBorders>
+            <w:tcMar>
+              <w:top w:w="40" w:type="dxa"/>
+              <w:left w:w="60" w:type="dxa"/>
+              <w:bottom w:w="40" w:type="dxa"/>
+              <w:right w:w="60" w:type="dxa"/>
+            </w:tcMar>
+            <w:vAlign w:val="center"/>
+            <w:shd w:val="clear" w:color="auto" w:fill="F7FAFC"/>
+          </w:tcPr>
+          <w:p>
+            <w:pPr>
+              <w:spacing w:before="0" w:after="0" w:line="259" w:lineRule="auto"/>
+              <w:jc w:val="center"/>
+            </w:pPr>
+            <w:r/>
+            <w:r>
+              <w:rPr>
+                <w:rFonts w:ascii="Calibri" w:hAnsi="Calibri" w:eastAsia="宋体"/>
+                <w:b w:val="0"/>
+                <w:color w:val="2D2D2D"/>
+                <w:sz w:val="21"/>
+              </w:rPr>
+              <w:t>支援</w:t>
+            </w:r>
+          </w:p>
+        </w:tc>
+        <w:tc>
+          <w:tcPr>
+            <w:tcW w:type="dxa" w:w="4876"/>
+            <w:tcBorders>
+              <w:top w:val="single" w:sz="4" w:space="0" w:color="8FAADC"/>
+              <w:left w:val="single" w:sz="4" w:space="0" w:color="8FAADC"/>
+              <w:bottom w:val="single" w:sz="4" w:space="0" w:color="8FAADC"/>
+              <w:right w:val="single" w:sz="4" w:space="0" w:color="8FAADC"/>
+            </w:tcBorders>
+            <w:tcMar>
+              <w:top w:w="40" w:type="dxa"/>
+              <w:left w:w="60" w:type="dxa"/>
+              <w:bottom w:w="40" w:type="dxa"/>
+              <w:right w:w="60" w:type="dxa"/>
+            </w:tcMar>
+            <w:vAlign w:val="center"/>
+            <w:shd w:val="clear" w:color="auto" w:fill="F7FAFC"/>
+          </w:tcPr>
+          <w:p>
+            <w:pPr>
+              <w:spacing w:before="0" w:after="0" w:line="259" w:lineRule="auto"/>
+              <w:jc w:val="left"/>
+            </w:pPr>
+            <w:r/>
+            <w:r>
+              <w:rPr>
+                <w:rFonts w:ascii="Calibri" w:hAnsi="Calibri" w:eastAsia="宋体"/>
+                <w:b w:val="0"/>
+                <w:color w:val="2D2D2D"/>
+                <w:sz w:val="21"/>
+              </w:rPr>
+              <w:t>本回合员工调用机会 +1，下回合为自己增加 1 点防御</w:t>
+            </w:r>
+          </w:p>
+        </w:tc>
+        <w:tc>
+          <w:tcPr>
+            <w:tcW w:type="dxa" w:w="4139"/>
+            <w:tcBorders>
+              <w:top w:val="single" w:sz="4" w:space="0" w:color="8FAADC"/>
+              <w:left w:val="single" w:sz="4" w:space="0" w:color="8FAADC"/>
+              <w:bottom w:val="single" w:sz="4" w:space="0" w:color="8FAADC"/>
+              <w:right w:val="single" w:sz="4" w:space="0" w:color="8FAADC"/>
+            </w:tcBorders>
+            <w:tcMar>
+              <w:top w:w="40" w:type="dxa"/>
+              <w:left w:w="60" w:type="dxa"/>
+              <w:bottom w:w="40" w:type="dxa"/>
+              <w:right w:w="60" w:type="dxa"/>
+            </w:tcMar>
+            <w:vAlign w:val="center"/>
+            <w:shd w:val="clear" w:color="auto" w:fill="F7FAFC"/>
+          </w:tcPr>
+          <w:p>
+            <w:pPr>
+              <w:spacing w:before="0" w:after="0" w:line="259" w:lineRule="auto"/>
+              <w:jc w:val="left"/>
+            </w:pPr>
+            <w:r/>
+            <w:r>
+              <w:rPr>
+                <w:rFonts w:ascii="Calibri" w:hAnsi="Calibri" w:eastAsia="宋体"/>
+                <w:b w:val="0"/>
+                <w:color w:val="2D2D2D"/>
+                <w:sz w:val="21"/>
+              </w:rPr>
+              <w:t>水驿先走：调用+下回合自盾 1；盐引官是调用+任意盾 2。河上浅笑。</w:t>
+            </w:r>
+          </w:p>
+        </w:tc>
+      </w:tr>
+      <w:tr>
+        <w:tc>
+          <w:tcPr>
+            <w:tcW w:type="dxa" w:w="1247"/>
+            <w:tcBorders>
+              <w:top w:val="single" w:sz="4" w:space="0" w:color="8FAADC"/>
+              <w:left w:val="single" w:sz="4" w:space="0" w:color="8FAADC"/>
+              <w:bottom w:val="single" w:sz="4" w:space="0" w:color="8FAADC"/>
+              <w:right w:val="single" w:sz="4" w:space="0" w:color="8FAADC"/>
+            </w:tcBorders>
+            <w:tcMar>
+              <w:top w:w="40" w:type="dxa"/>
+              <w:left w:w="60" w:type="dxa"/>
+              <w:bottom w:w="40" w:type="dxa"/>
+              <w:right w:w="60" w:type="dxa"/>
+            </w:tcMar>
+            <w:vAlign w:val="center"/>
+          </w:tcPr>
+          <w:p>
+            <w:pPr>
+              <w:spacing w:before="0" w:after="0" w:line="259" w:lineRule="auto"/>
+              <w:jc w:val="center"/>
+            </w:pPr>
+            <w:r/>
+            <w:r>
+              <w:rPr>
+                <w:rFonts w:ascii="Calibri" w:hAnsi="Calibri" w:eastAsia="宋体"/>
+                <w:b w:val="0"/>
+                <w:color w:val="2D2D2D"/>
+                <w:sz w:val="21"/>
+              </w:rPr>
+              <w:t>P-25</w:t>
+            </w:r>
+          </w:p>
+        </w:tc>
+        <w:tc>
+          <w:tcPr>
+            <w:tcW w:type="dxa" w:w="1474"/>
+            <w:tcBorders>
+              <w:top w:val="single" w:sz="4" w:space="0" w:color="8FAADC"/>
+              <w:left w:val="single" w:sz="4" w:space="0" w:color="8FAADC"/>
+              <w:bottom w:val="single" w:sz="4" w:space="0" w:color="8FAADC"/>
+              <w:right w:val="single" w:sz="4" w:space="0" w:color="8FAADC"/>
+            </w:tcBorders>
+            <w:tcMar>
+              <w:top w:w="40" w:type="dxa"/>
+              <w:left w:w="60" w:type="dxa"/>
+              <w:bottom w:w="40" w:type="dxa"/>
+              <w:right w:w="60" w:type="dxa"/>
+            </w:tcMar>
+            <w:vAlign w:val="center"/>
+          </w:tcPr>
+          <w:p>
+            <w:pPr>
+              <w:spacing w:before="0" w:after="0" w:line="259" w:lineRule="auto"/>
+              <w:jc w:val="left"/>
+            </w:pPr>
+            <w:r/>
+            <w:r>
+              <w:rPr>
+                <w:rFonts w:ascii="Calibri" w:hAnsi="Calibri" w:eastAsia="宋体"/>
+                <w:b w:val="0"/>
+                <w:color w:val="2D2D2D"/>
+                <w:sz w:val="21"/>
+              </w:rPr>
+              <w:t>河津采买</w:t>
+            </w:r>
+          </w:p>
+        </w:tc>
+        <w:tc>
+          <w:tcPr>
+            <w:tcW w:type="dxa" w:w="850"/>
+            <w:tcBorders>
+              <w:top w:val="single" w:sz="4" w:space="0" w:color="8FAADC"/>
+              <w:left w:val="single" w:sz="4" w:space="0" w:color="8FAADC"/>
+              <w:bottom w:val="single" w:sz="4" w:space="0" w:color="8FAADC"/>
+              <w:right w:val="single" w:sz="4" w:space="0" w:color="8FAADC"/>
+            </w:tcBorders>
+            <w:tcMar>
+              <w:top w:w="40" w:type="dxa"/>
+              <w:left w:w="60" w:type="dxa"/>
+              <w:bottom w:w="40" w:type="dxa"/>
+              <w:right w:w="60" w:type="dxa"/>
+            </w:tcMar>
+            <w:vAlign w:val="center"/>
+          </w:tcPr>
+          <w:p>
+            <w:pPr>
+              <w:spacing w:before="0" w:after="0" w:line="259" w:lineRule="auto"/>
+              <w:jc w:val="center"/>
+            </w:pPr>
+            <w:r/>
+            <w:r>
+              <w:rPr>
+                <w:rFonts w:ascii="Calibri" w:hAnsi="Calibri" w:eastAsia="宋体"/>
+                <w:b w:val="0"/>
+                <w:color w:val="2D2D2D"/>
+                <w:sz w:val="21"/>
+              </w:rPr>
+              <w:t>2</w:t>
+            </w:r>
+          </w:p>
+        </w:tc>
+        <w:tc>
+          <w:tcPr>
+            <w:tcW w:type="dxa" w:w="1020"/>
+            <w:tcBorders>
+              <w:top w:val="single" w:sz="4" w:space="0" w:color="8FAADC"/>
+              <w:left w:val="single" w:sz="4" w:space="0" w:color="8FAADC"/>
+              <w:bottom w:val="single" w:sz="4" w:space="0" w:color="8FAADC"/>
+              <w:right w:val="single" w:sz="4" w:space="0" w:color="8FAADC"/>
+            </w:tcBorders>
+            <w:tcMar>
+              <w:top w:w="40" w:type="dxa"/>
+              <w:left w:w="60" w:type="dxa"/>
+              <w:bottom w:w="40" w:type="dxa"/>
+              <w:right w:w="60" w:type="dxa"/>
+            </w:tcMar>
+            <w:vAlign w:val="center"/>
+          </w:tcPr>
+          <w:p>
+            <w:pPr>
+              <w:spacing w:before="0" w:after="0" w:line="259" w:lineRule="auto"/>
+              <w:jc w:val="center"/>
+            </w:pPr>
+            <w:r/>
+            <w:r>
+              <w:rPr>
+                <w:rFonts w:ascii="Calibri" w:hAnsi="Calibri" w:eastAsia="宋体"/>
+                <w:b w:val="0"/>
+                <w:color w:val="2D2D2D"/>
+                <w:sz w:val="21"/>
+              </w:rPr>
+              <w:t>防御</w:t>
+            </w:r>
+          </w:p>
+        </w:tc>
+        <w:tc>
+          <w:tcPr>
+            <w:tcW w:type="dxa" w:w="4876"/>
+            <w:tcBorders>
+              <w:top w:val="single" w:sz="4" w:space="0" w:color="8FAADC"/>
+              <w:left w:val="single" w:sz="4" w:space="0" w:color="8FAADC"/>
+              <w:bottom w:val="single" w:sz="4" w:space="0" w:color="8FAADC"/>
+              <w:right w:val="single" w:sz="4" w:space="0" w:color="8FAADC"/>
+            </w:tcBorders>
+            <w:tcMar>
+              <w:top w:w="40" w:type="dxa"/>
+              <w:left w:w="60" w:type="dxa"/>
+              <w:bottom w:w="40" w:type="dxa"/>
+              <w:right w:w="60" w:type="dxa"/>
+            </w:tcMar>
+            <w:vAlign w:val="center"/>
+          </w:tcPr>
+          <w:p>
+            <w:pPr>
+              <w:spacing w:before="0" w:after="0" w:line="259" w:lineRule="auto"/>
+              <w:jc w:val="left"/>
+            </w:pPr>
+            <w:r/>
+            <w:r>
+              <w:rPr>
+                <w:rFonts w:ascii="Calibri" w:hAnsi="Calibri" w:eastAsia="宋体"/>
+                <w:b w:val="0"/>
+                <w:color w:val="2D2D2D"/>
+                <w:sz w:val="21"/>
+              </w:rPr>
+              <w:t>双方各获得 1 点防御，并恢复自己 2 点血量</w:t>
+            </w:r>
+          </w:p>
+        </w:tc>
+        <w:tc>
+          <w:tcPr>
+            <w:tcW w:type="dxa" w:w="4139"/>
+            <w:tcBorders>
+              <w:top w:val="single" w:sz="4" w:space="0" w:color="8FAADC"/>
+              <w:left w:val="single" w:sz="4" w:space="0" w:color="8FAADC"/>
+              <w:bottom w:val="single" w:sz="4" w:space="0" w:color="8FAADC"/>
+              <w:right w:val="single" w:sz="4" w:space="0" w:color="8FAADC"/>
+            </w:tcBorders>
+            <w:tcMar>
+              <w:top w:w="40" w:type="dxa"/>
+              <w:left w:w="60" w:type="dxa"/>
+              <w:bottom w:w="40" w:type="dxa"/>
+              <w:right w:w="60" w:type="dxa"/>
+            </w:tcMar>
+            <w:vAlign w:val="center"/>
+          </w:tcPr>
+          <w:p>
+            <w:pPr>
+              <w:spacing w:before="0" w:after="0" w:line="259" w:lineRule="auto"/>
+              <w:jc w:val="left"/>
+            </w:pPr>
+            <w:r/>
+            <w:r>
+              <w:rPr>
+                <w:rFonts w:ascii="Calibri" w:hAnsi="Calibri" w:eastAsia="宋体"/>
+                <w:b w:val="0"/>
+                <w:color w:val="2D2D2D"/>
+                <w:sz w:val="21"/>
+              </w:rPr>
+              <w:t>津头回货：双盾 1+自奶 2；织工是双盾 1+下回合双盾 1，贡银采办是双盾 2+抽。船上比耶。</w:t>
             </w:r>
           </w:p>
         </w:tc>
@@ -6746,6 +10770,146 @@
           </w:p>
         </w:tc>
       </w:tr>
+      <w:tr>
+        <w:tc>
+          <w:tcPr>
+            <w:tcW w:type="dxa" w:w="7126"/>
+            <w:tcBorders>
+              <w:top w:val="single" w:sz="4" w:space="0" w:color="8FAADC"/>
+              <w:left w:val="single" w:sz="4" w:space="0" w:color="8FAADC"/>
+              <w:bottom w:val="single" w:sz="4" w:space="0" w:color="8FAADC"/>
+              <w:right w:val="single" w:sz="4" w:space="0" w:color="8FAADC"/>
+            </w:tcBorders>
+            <w:tcMar>
+              <w:top w:w="40" w:type="dxa"/>
+              <w:left w:w="60" w:type="dxa"/>
+              <w:bottom w:w="40" w:type="dxa"/>
+              <w:right w:w="60" w:type="dxa"/>
+            </w:tcMar>
+            <w:vAlign w:val="center"/>
+          </w:tcPr>
+          <w:p>
+            <w:pPr>
+              <w:spacing w:before="0" w:after="0" w:line="259" w:lineRule="auto"/>
+              <w:jc w:val="center"/>
+            </w:pPr>
+            <w:r/>
+            <w:r>
+              <w:rPr>
+                <w:rFonts w:ascii="Calibri" w:hAnsi="Calibri" w:eastAsia="宋体"/>
+                <w:b w:val="0"/>
+                <w:color w:val="2D2D2D"/>
+                <w:sz w:val="21"/>
+              </w:rPr>
+              <w:t>2026-08-25</w:t>
+            </w:r>
+          </w:p>
+        </w:tc>
+        <w:tc>
+          <w:tcPr>
+            <w:tcW w:type="dxa" w:w="7126"/>
+            <w:tcBorders>
+              <w:top w:val="single" w:sz="4" w:space="0" w:color="8FAADC"/>
+              <w:left w:val="single" w:sz="4" w:space="0" w:color="8FAADC"/>
+              <w:bottom w:val="single" w:sz="4" w:space="0" w:color="8FAADC"/>
+              <w:right w:val="single" w:sz="4" w:space="0" w:color="8FAADC"/>
+            </w:tcBorders>
+            <w:tcMar>
+              <w:top w:w="40" w:type="dxa"/>
+              <w:left w:w="60" w:type="dxa"/>
+              <w:bottom w:w="40" w:type="dxa"/>
+              <w:right w:w="60" w:type="dxa"/>
+            </w:tcMar>
+            <w:vAlign w:val="center"/>
+          </w:tcPr>
+          <w:p>
+            <w:pPr>
+              <w:spacing w:before="0" w:after="0" w:line="259" w:lineRule="auto"/>
+              <w:jc w:val="left"/>
+            </w:pPr>
+            <w:r/>
+            <w:r>
+              <w:rPr>
+                <w:rFonts w:ascii="Calibri" w:hAnsi="Calibri" w:eastAsia="宋体"/>
+                <w:b w:val="0"/>
+                <w:color w:val="2D2D2D"/>
+                <w:sz w:val="21"/>
+              </w:rPr>
+              <w:t>新增老板收藏卡 B-11～B-16：津梁主、津埠主、岭关主、柜坊主、金帐主、宴府主，不替换现有卡面。</w:t>
+            </w:r>
+          </w:p>
+        </w:tc>
+      </w:tr>
+      <w:tr>
+        <w:tc>
+          <w:tcPr>
+            <w:tcW w:type="dxa" w:w="7126"/>
+            <w:tcBorders>
+              <w:top w:val="single" w:sz="4" w:space="0" w:color="8FAADC"/>
+              <w:left w:val="single" w:sz="4" w:space="0" w:color="8FAADC"/>
+              <w:bottom w:val="single" w:sz="4" w:space="0" w:color="8FAADC"/>
+              <w:right w:val="single" w:sz="4" w:space="0" w:color="8FAADC"/>
+            </w:tcBorders>
+            <w:tcMar>
+              <w:top w:w="40" w:type="dxa"/>
+              <w:left w:w="60" w:type="dxa"/>
+              <w:bottom w:w="40" w:type="dxa"/>
+              <w:right w:w="60" w:type="dxa"/>
+            </w:tcMar>
+            <w:vAlign w:val="center"/>
+          </w:tcPr>
+          <w:p>
+            <w:pPr>
+              <w:spacing w:before="0" w:after="0" w:line="259" w:lineRule="auto"/>
+              <w:jc w:val="center"/>
+            </w:pPr>
+            <w:r/>
+            <w:r>
+              <w:rPr>
+                <w:rFonts w:ascii="Calibri" w:hAnsi="Calibri" w:eastAsia="宋体"/>
+                <w:b w:val="0"/>
+                <w:color w:val="2D2D2D"/>
+                <w:sz w:val="21"/>
+              </w:rPr>
+              <w:t>2026-08-26</w:t>
+            </w:r>
+          </w:p>
+        </w:tc>
+        <w:tc>
+          <w:tcPr>
+            <w:tcW w:type="dxa" w:w="7126"/>
+            <w:tcBorders>
+              <w:top w:val="single" w:sz="4" w:space="0" w:color="8FAADC"/>
+              <w:left w:val="single" w:sz="4" w:space="0" w:color="8FAADC"/>
+              <w:bottom w:val="single" w:sz="4" w:space="0" w:color="8FAADC"/>
+              <w:right w:val="single" w:sz="4" w:space="0" w:color="8FAADC"/>
+            </w:tcBorders>
+            <w:tcMar>
+              <w:top w:w="40" w:type="dxa"/>
+              <w:left w:w="60" w:type="dxa"/>
+              <w:bottom w:w="40" w:type="dxa"/>
+              <w:right w:w="60" w:type="dxa"/>
+            </w:tcMar>
+            <w:vAlign w:val="center"/>
+          </w:tcPr>
+          <w:p>
+            <w:pPr>
+              <w:spacing w:before="0" w:after="0" w:line="259" w:lineRule="auto"/>
+              <w:jc w:val="left"/>
+            </w:pPr>
+            <w:r/>
+            <w:r>
+              <w:rPr>
+                <w:rFonts w:ascii="Calibri" w:hAnsi="Calibri" w:eastAsia="宋体"/>
+                <w:b w:val="0"/>
+                <w:color w:val="2D2D2D"/>
+                <w:sz w:val="21"/>
+              </w:rPr>
+              <w:t>新增销售 S-28～S-34、采购 P-21～P-25 共十二张中世纪收藏卡；第五张合影拆成盟心商、结契商姐妹卡。不替换现有卡面。</w:t>
+            </w:r>
+          </w:p>
+        </w:tc>
+      </w:tr>
     </w:tbl>
     <w:sectPr>
       <w:pgSz w:w="15840" w:h="12240" w:orient="landscape"/>

</xml_diff>